<commit_message>
Full run: Chemistry (7) revised; tracked docs, journals, clean outputs
Co-Authored-By: Claude Sonnet 5.5 <noreply@anthropic.com>
</commit_message>
<xml_diff>
--- a/data/revised_2026-10_full/journal/Journal_00_Master_Index.docx
+++ b/data/revised_2026-10_full/journal/Journal_00_Master_Index.docx
@@ -592,7 +592,7 @@
                 <w:sz w:val="17"/>
                 <w:szCs w:val="17"/>
               </w:rPr>
-              <w:t xml:space="preserve">4</w:t>
+              <w:t xml:space="preserve">7</w:t>
             </w:r>
           </w:p>
         </w:tc>
@@ -622,7 +622,7 @@
                 <w:sz w:val="17"/>
                 <w:szCs w:val="17"/>
               </w:rPr>
-              <w:t xml:space="preserve">359</w:t>
+              <w:t xml:space="preserve">610</w:t>
             </w:r>
           </w:p>
         </w:tc>
@@ -652,7 +652,7 @@
                 <w:sz w:val="17"/>
                 <w:szCs w:val="17"/>
               </w:rPr>
-              <w:t xml:space="preserve">86</w:t>
+              <w:t xml:space="preserve">182</w:t>
             </w:r>
           </w:p>
         </w:tc>
@@ -682,7 +682,7 @@
                 <w:sz w:val="17"/>
                 <w:szCs w:val="17"/>
               </w:rPr>
-              <w:t xml:space="preserve">27</w:t>
+              <w:t xml:space="preserve">69</w:t>
             </w:r>
           </w:p>
         </w:tc>
@@ -712,7 +712,7 @@
                 <w:sz w:val="17"/>
                 <w:szCs w:val="17"/>
               </w:rPr>
-              <w:t xml:space="preserve">27</w:t>
+              <w:t xml:space="preserve">50</w:t>
             </w:r>
           </w:p>
         </w:tc>
@@ -1290,6 +1290,188 @@
                 <w:sz w:val="17"/>
                 <w:szCs w:val="17"/>
               </w:rPr>
+              <w:t xml:space="preserve">Physics</w:t>
+            </w:r>
+          </w:p>
+        </w:tc>
+        <w:tc>
+          <w:tcPr>
+            <w:tcW w:type="dxa" w:w="1700"/>
+            <w:tcBorders>
+              <w:top w:val="single" w:color="999999" w:sz="4"/>
+              <w:left w:val="single" w:color="999999" w:sz="4"/>
+              <w:bottom w:val="single" w:color="999999" w:sz="4"/>
+              <w:right w:val="single" w:color="999999" w:sz="4"/>
+            </w:tcBorders>
+            <w:tcMar>
+              <w:top w:type="dxa" w:w="50"/>
+              <w:left w:type="dxa" w:w="80"/>
+              <w:bottom w:type="dxa" w:w="50"/>
+              <w:right w:type="dxa" w:w="80"/>
+            </w:tcMar>
+          </w:tcPr>
+          <w:p>
+            <w:pPr>
+              <w:spacing w:after="60" w:before="0"/>
+            </w:pPr>
+            <w:r>
+              <w:rPr>
+                <w:rFonts w:ascii="Arial" w:cs="Arial" w:eastAsia="Arial" w:hAnsi="Arial"/>
+                <w:sz w:val="17"/>
+                <w:szCs w:val="17"/>
+              </w:rPr>
+              <w:t xml:space="preserve">1</w:t>
+            </w:r>
+          </w:p>
+        </w:tc>
+        <w:tc>
+          <w:tcPr>
+            <w:tcW w:type="dxa" w:w="1800"/>
+            <w:tcBorders>
+              <w:top w:val="single" w:color="999999" w:sz="4"/>
+              <w:left w:val="single" w:color="999999" w:sz="4"/>
+              <w:bottom w:val="single" w:color="999999" w:sz="4"/>
+              <w:right w:val="single" w:color="999999" w:sz="4"/>
+            </w:tcBorders>
+            <w:tcMar>
+              <w:top w:type="dxa" w:w="50"/>
+              <w:left w:type="dxa" w:w="80"/>
+              <w:bottom w:type="dxa" w:w="50"/>
+              <w:right w:type="dxa" w:w="80"/>
+            </w:tcMar>
+          </w:tcPr>
+          <w:p>
+            <w:pPr>
+              <w:spacing w:after="60" w:before="0"/>
+            </w:pPr>
+            <w:r>
+              <w:rPr>
+                <w:rFonts w:ascii="Arial" w:cs="Arial" w:eastAsia="Arial" w:hAnsi="Arial"/>
+                <w:sz w:val="17"/>
+                <w:szCs w:val="17"/>
+              </w:rPr>
+              <w:t xml:space="preserve">56</w:t>
+            </w:r>
+          </w:p>
+        </w:tc>
+        <w:tc>
+          <w:tcPr>
+            <w:tcW w:type="dxa" w:w="1800"/>
+            <w:tcBorders>
+              <w:top w:val="single" w:color="999999" w:sz="4"/>
+              <w:left w:val="single" w:color="999999" w:sz="4"/>
+              <w:bottom w:val="single" w:color="999999" w:sz="4"/>
+              <w:right w:val="single" w:color="999999" w:sz="4"/>
+            </w:tcBorders>
+            <w:tcMar>
+              <w:top w:type="dxa" w:w="50"/>
+              <w:left w:type="dxa" w:w="80"/>
+              <w:bottom w:type="dxa" w:w="50"/>
+              <w:right w:type="dxa" w:w="80"/>
+            </w:tcMar>
+          </w:tcPr>
+          <w:p>
+            <w:pPr>
+              <w:spacing w:after="60" w:before="0"/>
+            </w:pPr>
+            <w:r>
+              <w:rPr>
+                <w:rFonts w:ascii="Arial" w:cs="Arial" w:eastAsia="Arial" w:hAnsi="Arial"/>
+                <w:sz w:val="17"/>
+                <w:szCs w:val="17"/>
+              </w:rPr>
+              <w:t xml:space="preserve">18</w:t>
+            </w:r>
+          </w:p>
+        </w:tc>
+        <w:tc>
+          <w:tcPr>
+            <w:tcW w:type="dxa" w:w="1800"/>
+            <w:tcBorders>
+              <w:top w:val="single" w:color="999999" w:sz="4"/>
+              <w:left w:val="single" w:color="999999" w:sz="4"/>
+              <w:bottom w:val="single" w:color="999999" w:sz="4"/>
+              <w:right w:val="single" w:color="999999" w:sz="4"/>
+            </w:tcBorders>
+            <w:tcMar>
+              <w:top w:type="dxa" w:w="50"/>
+              <w:left w:type="dxa" w:w="80"/>
+              <w:bottom w:type="dxa" w:w="50"/>
+              <w:right w:type="dxa" w:w="80"/>
+            </w:tcMar>
+          </w:tcPr>
+          <w:p>
+            <w:pPr>
+              <w:spacing w:after="60" w:before="0"/>
+            </w:pPr>
+            <w:r>
+              <w:rPr>
+                <w:rFonts w:ascii="Arial" w:cs="Arial" w:eastAsia="Arial" w:hAnsi="Arial"/>
+                <w:sz w:val="17"/>
+                <w:szCs w:val="17"/>
+              </w:rPr>
+              <w:t xml:space="preserve">7</w:t>
+            </w:r>
+          </w:p>
+        </w:tc>
+        <w:tc>
+          <w:tcPr>
+            <w:tcW w:type="dxa" w:w="2380"/>
+            <w:tcBorders>
+              <w:top w:val="single" w:color="999999" w:sz="4"/>
+              <w:left w:val="single" w:color="999999" w:sz="4"/>
+              <w:bottom w:val="single" w:color="999999" w:sz="4"/>
+              <w:right w:val="single" w:color="999999" w:sz="4"/>
+            </w:tcBorders>
+            <w:tcMar>
+              <w:top w:type="dxa" w:w="50"/>
+              <w:left w:type="dxa" w:w="80"/>
+              <w:bottom w:type="dxa" w:w="50"/>
+              <w:right w:type="dxa" w:w="80"/>
+            </w:tcMar>
+          </w:tcPr>
+          <w:p>
+            <w:pPr>
+              <w:spacing w:after="60" w:before="0"/>
+            </w:pPr>
+            <w:r>
+              <w:rPr>
+                <w:rFonts w:ascii="Arial" w:cs="Arial" w:eastAsia="Arial" w:hAnsi="Arial"/>
+                <w:sz w:val="17"/>
+                <w:szCs w:val="17"/>
+              </w:rPr>
+              <w:t xml:space="preserve">7</w:t>
+            </w:r>
+          </w:p>
+        </w:tc>
+      </w:tr>
+      <w:tr>
+        <w:tc>
+          <w:tcPr>
+            <w:tcW w:type="dxa" w:w="4200"/>
+            <w:tcBorders>
+              <w:top w:val="single" w:color="999999" w:sz="4"/>
+              <w:left w:val="single" w:color="999999" w:sz="4"/>
+              <w:bottom w:val="single" w:color="999999" w:sz="4"/>
+              <w:right w:val="single" w:color="999999" w:sz="4"/>
+            </w:tcBorders>
+            <w:tcMar>
+              <w:top w:type="dxa" w:w="50"/>
+              <w:left w:type="dxa" w:w="80"/>
+              <w:bottom w:type="dxa" w:w="50"/>
+              <w:right w:type="dxa" w:w="80"/>
+            </w:tcMar>
+          </w:tcPr>
+          <w:p>
+            <w:pPr>
+              <w:spacing w:after="60" w:before="0"/>
+            </w:pPr>
+            <w:r>
+              <w:rPr>
+                <w:rFonts w:ascii="Arial" w:cs="Arial" w:eastAsia="Arial" w:hAnsi="Arial"/>
+                <w:sz w:val="17"/>
+                <w:szCs w:val="17"/>
+              </w:rPr>
               <w:t xml:space="preserve">Total</w:t>
             </w:r>
           </w:p>
@@ -1320,7 +1502,7 @@
                 <w:sz w:val="17"/>
                 <w:szCs w:val="17"/>
               </w:rPr>
-              <w:t xml:space="preserve">16</w:t>
+              <w:t xml:space="preserve">20</w:t>
             </w:r>
           </w:p>
         </w:tc>
@@ -1350,7 +1532,7 @@
                 <w:sz w:val="17"/>
                 <w:szCs w:val="17"/>
               </w:rPr>
-              <w:t xml:space="preserve">1804</w:t>
+              <w:t xml:space="preserve">2111</w:t>
             </w:r>
           </w:p>
         </w:tc>
@@ -1380,7 +1562,7 @@
                 <w:sz w:val="17"/>
                 <w:szCs w:val="17"/>
               </w:rPr>
-              <w:t xml:space="preserve">442</w:t>
+              <w:t xml:space="preserve">556</w:t>
             </w:r>
           </w:p>
         </w:tc>
@@ -1410,7 +1592,7 @@
                 <w:sz w:val="17"/>
                 <w:szCs w:val="17"/>
               </w:rPr>
-              <w:t xml:space="preserve">174</w:t>
+              <w:t xml:space="preserve">223</w:t>
             </w:r>
           </w:p>
         </w:tc>
@@ -1440,7 +1622,7 @@
                 <w:sz w:val="17"/>
                 <w:szCs w:val="17"/>
               </w:rPr>
-              <w:t xml:space="preserve">122</w:t>
+              <w:t xml:space="preserve">152</w:t>
             </w:r>
           </w:p>
         </w:tc>
@@ -1673,7 +1855,7 @@
                 <w:sz w:val="17"/>
                 <w:szCs w:val="17"/>
               </w:rPr>
-              <w:t xml:space="preserve">311</w:t>
+              <w:t xml:space="preserve">374</w:t>
             </w:r>
           </w:p>
         </w:tc>
@@ -1765,7 +1947,7 @@
                 <w:sz w:val="17"/>
                 <w:szCs w:val="17"/>
               </w:rPr>
-              <w:t xml:space="preserve">385</w:t>
+              <w:t xml:space="preserve">462</w:t>
             </w:r>
           </w:p>
         </w:tc>
@@ -1857,7 +2039,7 @@
                 <w:sz w:val="17"/>
                 <w:szCs w:val="17"/>
               </w:rPr>
-              <w:t xml:space="preserve">406</w:t>
+              <w:t xml:space="preserve">452</w:t>
             </w:r>
           </w:p>
         </w:tc>
@@ -1949,7 +2131,7 @@
                 <w:sz w:val="17"/>
                 <w:szCs w:val="17"/>
               </w:rPr>
-              <w:t xml:space="preserve">297</w:t>
+              <w:t xml:space="preserve">335</w:t>
             </w:r>
           </w:p>
         </w:tc>
@@ -2041,7 +2223,7 @@
                 <w:sz w:val="17"/>
                 <w:szCs w:val="17"/>
               </w:rPr>
-              <w:t xml:space="preserve">217</w:t>
+              <w:t xml:space="preserve">261</w:t>
             </w:r>
           </w:p>
         </w:tc>
@@ -2133,7 +2315,7 @@
                 <w:sz w:val="17"/>
                 <w:szCs w:val="17"/>
               </w:rPr>
-              <w:t xml:space="preserve">68</w:t>
+              <w:t xml:space="preserve">88</w:t>
             </w:r>
           </w:p>
         </w:tc>
@@ -2225,7 +2407,7 @@
                 <w:sz w:val="17"/>
                 <w:szCs w:val="17"/>
               </w:rPr>
-              <w:t xml:space="preserve">122</w:t>
+              <w:t xml:space="preserve">149</w:t>
             </w:r>
           </w:p>
         </w:tc>
@@ -2317,7 +2499,7 @@
                 <w:sz w:val="17"/>
                 <w:szCs w:val="17"/>
               </w:rPr>
-              <w:t xml:space="preserve">214</w:t>
+              <w:t xml:space="preserve">275</w:t>
             </w:r>
           </w:p>
         </w:tc>
@@ -2409,7 +2591,7 @@
                 <w:sz w:val="17"/>
                 <w:szCs w:val="17"/>
               </w:rPr>
-              <w:t xml:space="preserve">91</w:t>
+              <w:t xml:space="preserve">103</w:t>
             </w:r>
           </w:p>
         </w:tc>
@@ -2501,7 +2683,7 @@
                 <w:sz w:val="17"/>
                 <w:szCs w:val="17"/>
               </w:rPr>
-              <w:t xml:space="preserve">121</w:t>
+              <w:t xml:space="preserve">140</w:t>
             </w:r>
           </w:p>
         </w:tc>
@@ -2685,7 +2867,7 @@
                 <w:sz w:val="17"/>
                 <w:szCs w:val="17"/>
               </w:rPr>
-              <w:t xml:space="preserve">51</w:t>
+              <w:t xml:space="preserve">63</w:t>
             </w:r>
           </w:p>
         </w:tc>
@@ -2777,7 +2959,7 @@
                 <w:sz w:val="17"/>
                 <w:szCs w:val="17"/>
               </w:rPr>
-              <w:t xml:space="preserve">87</w:t>
+              <w:t xml:space="preserve">103</w:t>
             </w:r>
           </w:p>
         </w:tc>
@@ -2869,7 +3051,7 @@
                 <w:sz w:val="17"/>
                 <w:szCs w:val="17"/>
               </w:rPr>
-              <w:t xml:space="preserve">76</w:t>
+              <w:t xml:space="preserve">88</w:t>
             </w:r>
           </w:p>
         </w:tc>
@@ -15520,7 +15702,7 @@
                 <w:sz w:val="17"/>
                 <w:szCs w:val="17"/>
               </w:rPr>
-              <w:t xml:space="preserve">2.4 Trigonometry 1</w:t>
+              <w:t xml:space="preserve">1.5 Periodicity</w:t>
             </w:r>
           </w:p>
         </w:tc>
@@ -15550,7 +15732,7 @@
                 <w:sz w:val="17"/>
                 <w:szCs w:val="17"/>
               </w:rPr>
-              <w:t xml:space="preserve">Lesson 5, Model Building Phase, teacherMoves (+1 related)</w:t>
+              <w:t xml:space="preserve">Lesson 1, Predict Phase, teacherMoves</w:t>
             </w:r>
           </w:p>
         </w:tc>
@@ -15580,7 +15762,7 @@
                 <w:sz w:val="17"/>
                 <w:szCs w:val="17"/>
               </w:rPr>
-              <w:t xml:space="preserve">Suggested change: KICD clinometer project, digital-resource use and parent support were missing; added as a take-home project after Lesson 5 (and removed an orphan 'estimate the angle for Lesson 7' task). KICD asks learners to use a simple clinometer and to make one from local materials as the sub-strand project (also the source of the Creativity and Imagination competency and the Parental Engagement PCI). Nothing in the lessons did this. The Lesson 5 preview also sent learners to estimate an angle 'for Lesson 7', but Lesson 7 is paper-based and never used it, and it said Lesson 7 'takes this tool outside', which it does not. Now the preview points to Lesson 6 and 7 correctly and starts the clinometer project. Teacher must decide: which materials (protractor, card, straw, string, nut) families can really supply, and whether the template card is needed.</w:t>
+              <w:t xml:space="preserve">Suggested change: Added English-learner supports (a short Kiswahili word list and the option to answer in Kiswahili or by sketch); terms need checking by Kiswahili-speaking teachers. The sub-strand had no language supports for English learners and no alternative ways to show understanding. A short Kiswahili word list and the option to answer in Kiswahili or by sketch are added here at the start of the unit. The teacher must decide: the Kiswahili terms should be checked by a Kiswahili-speaking teacher, and the same words should be reused in later lessons.</w:t>
             </w:r>
           </w:p>
         </w:tc>
@@ -15610,7 +15792,7 @@
                 <w:sz w:val="17"/>
                 <w:szCs w:val="17"/>
               </w:rPr>
-              <w:t xml:space="preserve">Journal_Core_Mathematics</w:t>
+              <w:t xml:space="preserve">Journal_Chemistry</w:t>
             </w:r>
           </w:p>
         </w:tc>
@@ -15642,7 +15824,7 @@
                 <w:sz w:val="17"/>
                 <w:szCs w:val="17"/>
               </w:rPr>
-              <w:t xml:space="preserve">2.4 Trigonometry 1</w:t>
+              <w:t xml:space="preserve">1.5 Periodicity</w:t>
             </w:r>
           </w:p>
         </w:tc>
@@ -15672,7 +15854,7 @@
                 <w:sz w:val="17"/>
                 <w:szCs w:val="17"/>
               </w:rPr>
-              <w:t xml:space="preserve">Lesson 2, Explain Phase, learnerExperience (+1 related)</w:t>
+              <w:t xml:space="preserve">Lesson 1, Observe Phase, learnerExperience (+1 related)</w:t>
             </w:r>
           </w:p>
         </w:tc>
@@ -15702,7 +15884,7 @@
                 <w:sz w:val="17"/>
                 <w:szCs w:val="17"/>
               </w:rPr>
-              <w:t xml:space="preserve">Suggested change: Language support added: class word wall with Kiswahili beside English terms (started Lesson 2, extended in Lesson 7). There was no language support for English learners. A class word wall with Kiswahili beside the English terms is a low-cost support for the unit. Teacher must decide the exact Kiswahili terms the class and school use (they differ by region and textbook), so only two obvious words are suggested.</w:t>
+              <w:t xml:space="preserve">Suggested change: Argon ampoule near a flame was unsafe and unavailable in most schools; replaced by a photograph/video with the result stated by the teacher. Two problems: a sealed argon ampoule is not something most Kenyan partner schools can get, and holding a sealed glass ampoule near a flame is a shattering hazard. The teacher now shows a photograph or video and states the result. The teacher must decide whether their school can safely source argon, and which clip or photograph to use.</w:t>
             </w:r>
           </w:p>
         </w:tc>
@@ -15732,7 +15914,7 @@
                 <w:sz w:val="17"/>
                 <w:szCs w:val="17"/>
               </w:rPr>
-              <w:t xml:space="preserve">Journal_Core_Mathematics</w:t>
+              <w:t xml:space="preserve">Journal_Chemistry</w:t>
             </w:r>
           </w:p>
         </w:tc>
@@ -15764,7 +15946,7 @@
                 <w:sz w:val="17"/>
                 <w:szCs w:val="17"/>
               </w:rPr>
-              <w:t xml:space="preserve">2.4 Trigonometry 1</w:t>
+              <w:t xml:space="preserve">1.5 Periodicity</w:t>
             </w:r>
           </w:p>
         </w:tc>
@@ -15794,7 +15976,7 @@
                 <w:sz w:val="17"/>
                 <w:szCs w:val="17"/>
               </w:rPr>
-              <w:t xml:space="preserve">Lesson 8, Explain Phase, learnerExperience (+3 related)</w:t>
+              <w:t xml:space="preserve">Lesson 2, Observe Phase, learnerExperience (+2 related)</w:t>
             </w:r>
           </w:p>
         </w:tc>
@@ -15824,7 +16006,7 @@
                 <w:sz w:val="17"/>
                 <w:szCs w:val="17"/>
               </w:rPr>
-              <w:t xml:space="preserve">Suggested change: Lighthouse assessment was geometrically impossible (38° elevation and 22° depression along one line of sight must be equal); redesigned so the depression angle is measured from the cliff top and the numbers give a consistent answer. The summative task could not work. It said the boat sees the lighthouse top at 38° elevation and the lighthouse top sees the same boat at 22° depression. Those are the same line of sight, so the two angles must be equal (alternate angles), and the mark scheme in the teacher moves broke down in front of the class (it even asked students to find a negative height). The same story also appeared with different numbers (32° and 25°) in the overview. Fix: the 22° depression is now measured by an observer at the TOP OF THE CLIFF, so it equals the elevation of the cliff top from the boat, and 38° is measured to the lighthouse top. Checked twice: cliff = 120 x tan 22° = 120 x 0.40403 = 48.48 m; lighthouse top = 120 x tan 38° = 120 x 0.78129 = 93.75 m; lighthouse = 93.75 - 48.48 = 45.27 m (45.3 m from the rounded values 93.8 - 48.5). Teacher must decide whether to keep a lighthouse setting (the Kisumu shore has few cliffs; a rocky hill with a communications mast would also work with the same numbers).</w:t>
+              <w:t xml:space="preserve">Suggested change: Lesson 2 had every group handling lithium and sodium in its own trough, which contradicts its safety notes and cannot work with a large class; now one teacher demonstration of all three metals. The text had every group receive its own rice-grain piece of lithium and sodium, placed by the teacher in each group trough. That contradicts the safety note (teacher only, behind a screen), the overview (teacher demonstrates) and is unworkable with large classes (10 or more troughs, the teacher cutting and placing metal at each). All three metals are now teacher demonstrations; students still collect the data. The teacher must confirm this fits their class size and screens.</w:t>
             </w:r>
           </w:p>
         </w:tc>
@@ -15854,7 +16036,7 @@
                 <w:sz w:val="17"/>
                 <w:szCs w:val="17"/>
               </w:rPr>
-              <w:t xml:space="preserve">Journal_Core_Mathematics</w:t>
+              <w:t xml:space="preserve">Journal_Chemistry</w:t>
             </w:r>
           </w:p>
         </w:tc>
@@ -15886,7 +16068,7 @@
                 <w:sz w:val="17"/>
                 <w:szCs w:val="17"/>
               </w:rPr>
-              <w:t xml:space="preserve">2.4 Trigonometry 1</w:t>
+              <w:t xml:space="preserve">1.5 Periodicity</w:t>
             </w:r>
           </w:p>
         </w:tc>
@@ -15916,7 +16098,7 @@
                 <w:sz w:val="17"/>
                 <w:szCs w:val="17"/>
               </w:rPr>
-              <w:t xml:space="preserve">Lesson 7, Driving Question Board (DQB) Creation, teacherMoves</w:t>
+              <w:t xml:space="preserve">Lesson 4, Observe Phase, learnerExperience (+1 related)</w:t>
             </w:r>
           </w:p>
         </w:tc>
@@ -15946,7 +16128,7 @@
                 <w:sz w:val="17"/>
                 <w:szCs w:val="17"/>
               </w:rPr>
-              <w:t xml:space="preserve">Fort Jesus is described as a cliff 20 m, 27 m and (in the unit text) 30 m high. The fort stands on a low coral ridge and its sea-facing walls are lower than that, and the three heights do not agree. This needs local knowledge, so it is flagged rather than guessed: either use a real, measured height, or describe the place as 'a coastal cliff near Mombasa' and keep the numbers.</w:t>
+              <w:t xml:space="preserve">Suggested change: Iron-wool demonstration did not say the wool must be heated or that chlorine gas needs a fume cupboard; a video is offered if neither is available. Iron wool does not react with chlorine gas on its own at room temperature (it must be heated) and chlorine gas must only be made in a fume cupboard; the old text also called it 'chlorine water' in the heading but a gas jar in the body. The teacher must decide whether the school has a fume cupboard and a safe chlorine source, or should use a video.</w:t>
             </w:r>
           </w:p>
         </w:tc>
@@ -15976,7 +16158,7 @@
                 <w:sz w:val="17"/>
                 <w:szCs w:val="17"/>
               </w:rPr>
-              <w:t xml:space="preserve">Journal_Core_Mathematics</w:t>
+              <w:t xml:space="preserve">Journal_Chemistry</w:t>
             </w:r>
           </w:p>
         </w:tc>
@@ -16008,7 +16190,7 @@
                 <w:sz w:val="17"/>
                 <w:szCs w:val="17"/>
               </w:rPr>
-              <w:t xml:space="preserve">2.4 Trigonometry 1</w:t>
+              <w:t xml:space="preserve">1.5 Periodicity</w:t>
             </w:r>
           </w:p>
         </w:tc>
@@ -16068,7 +16250,7 @@
                 <w:sz w:val="17"/>
                 <w:szCs w:val="17"/>
               </w:rPr>
-              <w:t xml:space="preserve">CBE has four levels: Exceeds, Meets, Approaches and Below Expectations. The data contract allows only three level fields per criterion (excellent, proficient, developing) and the printed headings are fixed by the template, so the Below Expectations level cannot be represented. Teachers could add it by hand (for example 'work not yet showing the Approaches descriptor') until the contract allows four levels.</w:t>
+              <w:t xml:space="preserve">The partner contract allows only three rubric level fields, so the fourth CBE level, Below Expectations, cannot be represented in the current Final Explanation. Suggestion: if the contract can add a fourth level, use 'Below Expectations: little or no relevant explanation, with major errors'. Until then teachers can add it by hand.</w:t>
             </w:r>
           </w:p>
         </w:tc>
@@ -16098,7 +16280,7 @@
                 <w:sz w:val="17"/>
                 <w:szCs w:val="17"/>
               </w:rPr>
-              <w:t xml:space="preserve">Journal_Core_Mathematics</w:t>
+              <w:t xml:space="preserve">Journal_Chemistry</w:t>
             </w:r>
           </w:p>
         </w:tc>
@@ -16130,7 +16312,7 @@
                 <w:sz w:val="17"/>
                 <w:szCs w:val="17"/>
               </w:rPr>
-              <w:t xml:space="preserve">3.1 Turning Effect of Force</w:t>
+              <w:t xml:space="preserve">1.5 Periodicity</w:t>
             </w:r>
           </w:p>
         </w:tc>
@@ -16160,7 +16342,7 @@
                 <w:sz w:val="17"/>
                 <w:szCs w:val="17"/>
               </w:rPr>
-              <w:t xml:space="preserve">Lesson 2, Observe Phase, teacherMoves</w:t>
+              <w:t xml:space="preserve">Unit overview, content</w:t>
             </w:r>
           </w:p>
         </w:tc>
@@ -16190,7 +16372,7 @@
                 <w:sz w:val="17"/>
                 <w:szCs w:val="17"/>
               </w:rPr>
-              <w:t xml:space="preserve">Suggested change: Slotted masses are not in every partner school. The lesson only listed slotted masses; a low-cost substitute is now given. The teacher must decide which substitute their school actually has (bottles of water, packets of sugar or flour, stones weighed on a balance).</w:t>
+              <w:t xml:space="preserve">KICD content that is not taught or assessed in the 7 lessons: (1) size of IONS (ionic radius) and of atoms across groups beyond Group I/II/VII; (2) electron affinity across Period 3; (3) boiling points across Period 3 and down Groups I, II and VII (only melting points are graphed); (4) Group I and II metals reacting with oxygen and chlorine (only Mg with oxygen is written as an equation, nothing is demonstrated); (5) Group II with dilute acids other than Mg; (6) period 3 elements reacting with chlorine, with alkalis and with hydrogen; (7) preparing chlorine gas. Concrete suggestions: in Lesson 5 Activity B have Group C plot boiling point on the same sheet as melting point and Group D plot electron affinity (a data card is needed); give Lesson 6 a one-page data card on the reactions of Na, Mg, Al, Si, S with oxygen and chlorine (no demonstration, because of time and chlorine hazards); add ionic radius to the Lesson 5 data table. Teachers must decide what the 12 periods can hold; KICD itself suggests 34 lessons for this sub-strand.</w:t>
             </w:r>
           </w:p>
         </w:tc>
@@ -16220,7 +16402,7 @@
                 <w:sz w:val="17"/>
                 <w:szCs w:val="17"/>
               </w:rPr>
-              <w:t xml:space="preserve">Journal_General_Science</w:t>
+              <w:t xml:space="preserve">Journal_Chemistry</w:t>
             </w:r>
           </w:p>
         </w:tc>
@@ -16252,7 +16434,7 @@
                 <w:sz w:val="17"/>
                 <w:szCs w:val="17"/>
               </w:rPr>
-              <w:t xml:space="preserve">3.1 Turning Effect of Force</w:t>
+              <w:t xml:space="preserve">1.5 Periodicity</w:t>
             </w:r>
           </w:p>
         </w:tc>
@@ -16282,7 +16464,7 @@
                 <w:sz w:val="17"/>
                 <w:szCs w:val="17"/>
               </w:rPr>
-              <w:t xml:space="preserve">Lesson 3, Explain Phase, teacherMoves</w:t>
+              <w:t xml:space="preserve">Unit overview, strand</w:t>
             </w:r>
           </w:p>
         </w:tc>
@@ -16312,7 +16494,7 @@
                 <w:sz w:val="17"/>
                 <w:szCs w:val="17"/>
               </w:rPr>
-              <w:t xml:space="preserve">Suggested change: No Kiswahili or English-learner support appeared anywhere in the sequence. A short, optional support was added where the key words are first written down. The teacher must decide the Kiswahili terms: they are everyday words, but KICD or the school's Kiswahili teacher may prefer other physics terms.</w:t>
+              <w:t xml:space="preserve">Numbering and names checked against the KICD March 2025 Chemistry design: sub-strand 1.5 Periodicity is correct. The unit names Strand 1.0 as 'Chemical Families' but KICD names Strand 1.0 'Inorganic Chemistry' ('chemical families' appears only in the key inquiry question and the value text). The strand name was not changed. KICD suggests 34 lessons for the sub-strand; this sequence has 7 lessons (12 periods). The KICD learning outcomes (a to e), key inquiry questions and content bullets in the data already match the KICD text.</w:t>
             </w:r>
           </w:p>
         </w:tc>
@@ -16342,7 +16524,7 @@
                 <w:sz w:val="17"/>
                 <w:szCs w:val="17"/>
               </w:rPr>
-              <w:t xml:space="preserve">Journal_General_Science</w:t>
+              <w:t xml:space="preserve">Journal_Chemistry</w:t>
             </w:r>
           </w:p>
         </w:tc>
@@ -16374,7 +16556,7 @@
                 <w:sz w:val="17"/>
                 <w:szCs w:val="17"/>
               </w:rPr>
-              <w:t xml:space="preserve">3.1 Turning Effect of Force</w:t>
+              <w:t xml:space="preserve">1.5 Periodicity</w:t>
             </w:r>
           </w:p>
         </w:tc>
@@ -16404,7 +16586,7 @@
                 <w:sz w:val="17"/>
                 <w:szCs w:val="17"/>
               </w:rPr>
-              <w:t xml:space="preserve">Lesson 4, slo.purpose (+18 related)</w:t>
+              <w:t xml:space="preserve">Unit overview, phenomenon</w:t>
             </w:r>
           </w:p>
         </w:tc>
@@ -16434,7 +16616,7 @@
                 <w:sz w:val="17"/>
                 <w:szCs w:val="17"/>
               </w:rPr>
-              <w:t xml:space="preserve">Suggested change: Lesson 4 said the two-handed jembe grip is a couple that explains handle length, mixing up 'distance between the forces' with 'distance from the pivot'; the jembe stays a single-force moment about the blade and the couple is taught on a steering wheel, tap and wrench. Audit item confirmed. The lesson said the two-handed jembe grip is a couple and that widening the grip explains the handle-length puzzle. That mixes up two different distances: for the jembe, d is the distance from the blade pivot to the single effort force (M = F x d, Lessons 2-3); for a couple, d is the distance BETWEEN the two forces. The distance between the farmer's hands does not change the jembe's moment about the blade (a grip 0.9 m from the blade gives M = F x 0.9 however far apart the hands are). The jembe therefore stays a single-force moment, and the couple is now taught on objects that really turn about their own centre. Lesson 5 and the Final Explanation now say the same. Teacher to confirm this reading of the storyline.</w:t>
+              <w:t xml:space="preserve">The anchoring phenomenon, Summary and Final Explanation name 'the Kisumu Water and Sanitation Company'. The Kisumu utility is usually named the Kisumu Water and Sewerage Company (KIWASCO), and the careers text names the 'Nairobi Water and Sewerage Company' (the current name is Nairobi City Water and Sewerage Company). Because the phenomenon is a demonstration that real staff would not normally run, suggest naming 'a water treatment plant in Kisumu' instead of a real company. Not changed here because the name appears in every lesson; Kenyan teachers should confirm the correct name and decide.</w:t>
             </w:r>
           </w:p>
         </w:tc>
@@ -16464,7 +16646,7 @@
                 <w:sz w:val="17"/>
                 <w:szCs w:val="17"/>
               </w:rPr>
-              <w:t xml:space="preserve">Journal_General_Science</w:t>
+              <w:t xml:space="preserve">Journal_Chemistry</w:t>
             </w:r>
           </w:p>
         </w:tc>
@@ -16496,7 +16678,7 @@
                 <w:sz w:val="17"/>
                 <w:szCs w:val="17"/>
               </w:rPr>
-              <w:t xml:space="preserve">3.1 Turning Effect of Force</w:t>
+              <w:t xml:space="preserve">2.1 Introduction to Salts</w:t>
             </w:r>
           </w:p>
         </w:tc>
@@ -16526,7 +16708,7 @@
                 <w:sz w:val="17"/>
                 <w:szCs w:val="17"/>
               </w:rPr>
-              <w:t xml:space="preserve">Lesson 4, Observe Phase, teacherMoves</w:t>
+              <w:t xml:space="preserve">Lesson 5, Explain Phase, learnerExperience (+2 related)</w:t>
             </w:r>
           </w:p>
         </w:tc>
@@ -16556,7 +16738,7 @@
                 <w:sz w:val="17"/>
                 <w:szCs w:val="17"/>
               </w:rPr>
-              <w:t xml:space="preserve">Suggested change: Clamp stands and two spring balances per group are not available in every partner school. The teacher must decide whether this qualitative substitute suits the school's equipment.</w:t>
+              <w:t xml:space="preserve">Suggested change: KICD lists 'direct synthesis' as a preparation method, and the Unit and Lesson 8 mention it, but no lesson taught it. Added a short teacher demonstration or reading card in Lesson 5. The teacher must choose the example and whether equipment allows a demonstration.. KICD content not taught: direct synthesis. Lesson 8 even asks for 'one balanced equation per pathway' including direct synthesis. Suggested example: iron + sulphur -&gt; iron(II) sulphide (Fe 1=1, S 1=1; masses Fe 56 : S 32 = 7 : 4). The teacher decides: demonstration (needs ventilation and a heat source) or reading card only, or another example such as sodium + chlorine shown by video.</w:t>
             </w:r>
           </w:p>
         </w:tc>
@@ -16586,7 +16768,7 @@
                 <w:sz w:val="17"/>
                 <w:szCs w:val="17"/>
               </w:rPr>
-              <w:t xml:space="preserve">Journal_General_Science</w:t>
+              <w:t xml:space="preserve">Journal_Chemistry</w:t>
             </w:r>
           </w:p>
         </w:tc>
@@ -16618,7 +16800,7 @@
                 <w:sz w:val="17"/>
                 <w:szCs w:val="17"/>
               </w:rPr>
-              <w:t xml:space="preserve">3.1 Turning Effect of Force</w:t>
+              <w:t xml:space="preserve">2.1 Introduction to Salts</w:t>
             </w:r>
           </w:p>
         </w:tc>
@@ -16648,7 +16830,7 @@
                 <w:sz w:val="17"/>
                 <w:szCs w:val="17"/>
               </w:rPr>
-              <w:t xml:space="preserve">Lesson 8, Explain Phase, learnerExperience (+1 related)</w:t>
+              <w:t xml:space="preserve">Lesson 2, Explain Phase, learnerExperience (+3 related)</w:t>
             </w:r>
           </w:p>
         </w:tc>
@@ -16678,7 +16860,7 @@
                 <w:sz w:val="17"/>
                 <w:szCs w:val="17"/>
               </w:rPr>
-              <w:t xml:space="preserve">Suggested change: Assessing every learner one by one on the metre rule in 15 minutes was impossible for 40 learners (under 40 seconds each); now groups of four or five at stations, each member answering one question. As written, the teacher called learners one at a time to ONE bench for 15 minutes; with 40 learners that is under 40 seconds each for three questions with 10-second waits, and the teacher notes themselves contradicted it (8 stations prepared, 'two simultaneous stations' for 40 learners). Groups of 4-5 at 8 stations with 2 minutes per group fits 15 minutes (8 x 2 = 16, about 15 with rounding) and still gives every learner an individual question. The teacher must decide whether to assess in groups like this or to assess the practical over several lessons.</w:t>
+              <w:t xml:space="preserve">Suggested change: Language and access supports added: the Lesson 2 reading card promised Kiswahili key terms but gave none; added a few terms in Lessons 2 and 6 and in the Final Explanation, access roles for a practical, and ways to show understanding other than writing. The teacher must check the Kiswahili.. The card said 'Kiswahili key terms in brackets' but no terms existed. I added common school Kiswahili words (chumvi = salt, huyeyuka = dissolves, mumunyifu = soluble). I am confident they are standard but cannot verify them with a Kiswahili specialist, so the teacher must confirm or replace them. This one decision covers all the Kiswahili words in the unit.</w:t>
             </w:r>
           </w:p>
         </w:tc>
@@ -16708,7 +16890,7 @@
                 <w:sz w:val="17"/>
                 <w:szCs w:val="17"/>
               </w:rPr>
-              <w:t xml:space="preserve">Journal_General_Science</w:t>
+              <w:t xml:space="preserve">Journal_Chemistry</w:t>
             </w:r>
           </w:p>
         </w:tc>
@@ -16740,7 +16922,7 @@
                 <w:sz w:val="17"/>
                 <w:szCs w:val="17"/>
               </w:rPr>
-              <w:t xml:space="preserve">3.1 Turning Effect of Force</w:t>
+              <w:t xml:space="preserve">2.1 Introduction to Salts</w:t>
             </w:r>
           </w:p>
         </w:tc>
@@ -16770,7 +16952,7 @@
                 <w:sz w:val="17"/>
                 <w:szCs w:val="17"/>
               </w:rPr>
-              <w:t xml:space="preserve">Unit overview, learningOutcomes</w:t>
+              <w:t xml:space="preserve">Lesson 6, Observe Phase, learnerExperience (+1 related)</w:t>
             </w:r>
           </w:p>
         </w:tc>
@@ -16800,7 +16982,7 @@
                 <w:sz w:val="17"/>
                 <w:szCs w:val="17"/>
               </w:rPr>
-              <w:t xml:space="preserve">KICD wording check: the Grade 10 KICD PDFs available in data/raw/curriculum_pdfs/ cover Biology, Chemistry, Mathematics and Physics only. General Science Strand 3.0, Sub-Strand 3.1 'Turning Effect of Force' is not in them (the closest text, Physics 1.5 'Moments and equilibrium', is a different sub-strand with different outcomes), so the learning outcomes (a-d), key inquiry question, core competencies, values and PCIs could not be compared word for word and were left unchanged. Please check them against the KICD General Science Grade 10 curriculum design. Coverage check done: outcome a (moments of a force at a point) is taught in Lessons 2-3 and assessed in Final Explanation Parts 1-3; outcome b (moments of anti-parallel forces) is taught in Lessons 4-5 and assessed in Part 3 and Part 4 (a calculation was added); outcome c (real-life applications) is taught in Lessons 6-7 and assessed in Part 5; outcome d (appreciate) is observed in the Lesson 8 reflection journal.</w:t>
+              <w:t xml:space="preserve">Suggested change: The Lesson 6 watch-glass test may not show the washing soda changing in 20-25 minutes (efflorescence is slow, and none at all on a humid day). Added a 24-hour 'day-before' set, expected ranges and a fallback. The teacher should trial it with the school's own balance and humidity.. Efflorescence of Na2CO3·10H2O is slow and depends on the day's humidity, so a visible loss in 20-25 minutes is not guaranteed and a humid classroom may show none. The 24-hour set makes the result reliable. The ranges in the teacher note are indicative, not measured by me: the teacher must decide how to run it (own trial first, which balance, whether to pre-effloresce crystals) because it needs local knowledge of the balance and the humidity.</w:t>
             </w:r>
           </w:p>
         </w:tc>
@@ -16830,7 +17012,7 @@
                 <w:sz w:val="17"/>
                 <w:szCs w:val="17"/>
               </w:rPr>
-              <w:t xml:space="preserve">Journal_General_Science</w:t>
+              <w:t xml:space="preserve">Journal_Chemistry</w:t>
             </w:r>
           </w:p>
         </w:tc>
@@ -16862,7 +17044,7 @@
                 <w:sz w:val="17"/>
                 <w:szCs w:val="17"/>
               </w:rPr>
-              <w:t xml:space="preserve">3.1 Turning Effect of Force</w:t>
+              <w:t xml:space="preserve">2.1 Introduction to Salts</w:t>
             </w:r>
           </w:p>
         </w:tc>
@@ -16892,7 +17074,7 @@
                 <w:sz w:val="17"/>
                 <w:szCs w:val="17"/>
               </w:rPr>
-              <w:t xml:space="preserve">Final Explanation, rubric</w:t>
+              <w:t xml:space="preserve">Lesson 6, Explain Phase, learnerExperience</w:t>
             </w:r>
           </w:p>
         </w:tc>
@@ -16922,7 +17104,7 @@
                 <w:sz w:val="17"/>
                 <w:szCs w:val="17"/>
               </w:rPr>
-              <w:t xml:space="preserve">The contract allows only three level fields (excellent, proficient, developing) and the printed headings are fixed by the template, so the fourth CBE level, Below Expectations, cannot be represented. Suggestion for teachers: add a 'Below Expectations' column by hand when marking, for a learner who cannot calculate any moment or link force, distance and turning effect. The template or contract needs a decision from the project owner.</w:t>
+              <w:t xml:space="preserve">Suggested change: I could not confirm that calcium chloride is used as a desiccant in Kenyan tea factories (tea is dried with hot air), so I replaced it with uses that are common and checkable. The teacher should confirm that moisture-absorber tubs are sold locally or substitute a use they know, such as a desiccator in the school laboratory.</w:t>
             </w:r>
           </w:p>
         </w:tc>
@@ -16952,7 +17134,7 @@
                 <w:sz w:val="17"/>
                 <w:szCs w:val="17"/>
               </w:rPr>
-              <w:t xml:space="preserve">Journal_General_Science</w:t>
+              <w:t xml:space="preserve">Journal_Chemistry</w:t>
             </w:r>
           </w:p>
         </w:tc>
@@ -16984,7 +17166,7 @@
                 <w:sz w:val="17"/>
                 <w:szCs w:val="17"/>
               </w:rPr>
-              <w:t xml:space="preserve">2.4 Surface Area and Volume of Solids</w:t>
+              <w:t xml:space="preserve">2.1 Introduction to Salts</w:t>
             </w:r>
           </w:p>
         </w:tc>
@@ -17014,7 +17196,7 @@
                 <w:sz w:val="17"/>
                 <w:szCs w:val="17"/>
               </w:rPr>
-              <w:t xml:space="preserve">Unit overview, phenomenon (+48 related)</w:t>
+              <w:t xml:space="preserve">Lesson 8, Driving Question Board (DQB) Creation, learnerExperience (+1 related)</w:t>
             </w:r>
           </w:p>
         </w:tc>
@@ -17044,7 +17226,7 @@
                 <w:sz w:val="17"/>
                 <w:szCs w:val="17"/>
               </w:rPr>
-              <w:t xml:space="preserve">Suggested change: The two tanks did not add up: the frustum tank held only 1,300-3,300 L in the lessons and the composite tank had different sizes in Lessons 5, 6 and 10. One pair of tanks (both about 5,000 L, frustum about 4% less metal) is now used in every lesson.. Old data: the frustum tank in Lesson 3 (R 0.8, r 0.4, l 1.2 m) holds only about 1.3 m3 and in Lesson 7 (R 0.9, r 0.5, h 2.1 m) 3.3 m3, never 5,000 L; the composite tank was r 0.8, h 2.0 m in Lesson 5 but r 0.7, h 2.8 m in Lesson 6; Lesson 10 used a third set. I also searched by computer all closed frustums of volume 5 m3: the smallest total surface is about 16.19 m2, so a saving of 9 m2 (old text) is impossible against any sensibly shaped composite tank. New common data. Composite: cylinder r 0.7 m, h 2.8 m plus hemisphere r 0.7 m: V = pi(0.49x2.8 + 2/3x0.343) = 5.029 m3 (5,030 L); SA = 3.92pi + 0.49pi + 0.98pi = 5.39pi = 16.93 m2. Frustum: R 1.0 m, r 0.8 m, h 1.96 m, slant l = sqrt(1.96^2 + 0.2^2) = 1.97 m: V = pi x 1.96/3 x (1 + 0.8 + 0.64) = 5.008 m3 (5,010 L); SA = pi(1 + 0.64) + pi x 1.8 x 1.97 = 16.29 m2. Checked by hand and by script. The frustum saves 0.64 m2 (about 4%, about Ksh 540 per tank at Ksh 850/m2): the real size of the effect, because the composite tank is tall and narrow while the frustum is shorter and wider. TEACHER DECISION: accept this smaller difference (all later lessons now say 'about 4%'), or replace the tanks with a different pair.</w:t>
+              <w:t xml:space="preserve">Suggested change: The Lesson 8 task asked learners to 'predict' that ammonium sulphate absorbs water in humid air, but ammonium sulphate only takes up water above about 80% humidity and learners have no way to know that. The task now gives that fact and asks for the reasoning; the marking guide matches. The teacher should confirm the changed task.. Ammonium sulphate is much less hygroscopic than ammonium nitrate; it only becomes damp above about 80% relative humidity, so 'high humidity near Lake Nakuru' does not reliably make it clump and the original mark scheme would mark a sensible answer wrong. Learners also had no experiment on which to base that prediction. Teacher decision: this changes the summative task, so please confirm the new wording and the 2-mark scheme.</w:t>
             </w:r>
           </w:p>
         </w:tc>
@@ -17074,7 +17256,7 @@
                 <w:sz w:val="17"/>
                 <w:szCs w:val="17"/>
               </w:rPr>
-              <w:t xml:space="preserve">Journal_Mathematics</w:t>
+              <w:t xml:space="preserve">Journal_Chemistry</w:t>
             </w:r>
           </w:p>
         </w:tc>
@@ -17106,7 +17288,7 @@
                 <w:sz w:val="17"/>
                 <w:szCs w:val="17"/>
               </w:rPr>
-              <w:t xml:space="preserve">2.4 Surface Area and Volume of Solids</w:t>
+              <w:t xml:space="preserve">2.1 Introduction to Salts</w:t>
             </w:r>
           </w:p>
         </w:tc>
@@ -17136,7 +17318,7 @@
                 <w:sz w:val="17"/>
                 <w:szCs w:val="17"/>
               </w:rPr>
-              <w:t xml:space="preserve">Lesson 1, Explain Phase, teacherMoves</w:t>
+              <w:t xml:space="preserve">Unit overview, substrand</w:t>
             </w:r>
           </w:p>
         </w:tc>
@@ -17166,7 +17348,7 @@
                 <w:sz w:val="17"/>
                 <w:szCs w:val="17"/>
               </w:rPr>
-              <w:t xml:space="preserve">Suggested change: The sub-strand had no language support at all. Kiswahili terms are given only for words I am sure of; the teacher decides which terms and which local language their learners actually use.</w:t>
+              <w:t xml:space="preserve">Number and size mismatch against KICD: the KICD March 2025 Grade 10 Chemistry design numbers this sub-strand 2.2 'Introduction to Salts' (30 lessons) and puts 2.1 on 'Acids and Bases'. This project calls it Sub-Strand 2.1 (8 lessons) everywhere except UNIT.substrand, which already says 2.2. Not renamed here. Suggestion: decide once whether documents should show the KICD number 2.2 (and say the unit covers part of the 30 KICD lessons) or the project number 2.1, then make every heading match.</w:t>
             </w:r>
           </w:p>
         </w:tc>
@@ -17196,7 +17378,7 @@
                 <w:sz w:val="17"/>
                 <w:szCs w:val="17"/>
               </w:rPr>
-              <w:t xml:space="preserve">Journal_Mathematics</w:t>
+              <w:t xml:space="preserve">Journal_Chemistry</w:t>
             </w:r>
           </w:p>
         </w:tc>
@@ -17228,7 +17410,7 @@
                 <w:sz w:val="17"/>
                 <w:szCs w:val="17"/>
               </w:rPr>
-              <w:t xml:space="preserve">2.4 Surface Area and Volume of Solids</w:t>
+              <w:t xml:space="preserve">2.1 Introduction to Salts</w:t>
             </w:r>
           </w:p>
         </w:tc>
@@ -17258,7 +17440,7 @@
                 <w:sz w:val="17"/>
                 <w:szCs w:val="17"/>
               </w:rPr>
-              <w:t xml:space="preserve">Lesson 8, slo.purposeInStoryline (+5 related)</w:t>
+              <w:t xml:space="preserve">Lesson 3, Driving Question Board (DQB) Creation, learnerExperience</w:t>
             </w:r>
           </w:p>
         </w:tc>
@@ -17288,7 +17470,7 @@
                 <w:sz w:val="17"/>
                 <w:szCs w:val="17"/>
               </w:rPr>
-              <w:t xml:space="preserve">Suggested change: 'Mapunja' is not a term I could confirm as a Kenyan word for a grain store; replaced with the standard Kiswahili 'ghala' (grain store).. I could not confirm 'mapunja(s)' as a Kiswahili or other Kenyan word for a grain store; 'ghala' is the standard Kiswahili word. Teacher decision: if a local word is used in your area for this kind of store, use that instead.</w:t>
+              <w:t xml:space="preserve">Driving Question Board sticky-note colours change meaning between lessons: green means 'now understand' in Lesson 1, 'answered' in Lessons 2, 5 and 6, but 'new questions' in Lesson 3 (blue = evidence); Lesson 7 uses green, yellow and pink. Suggestion: use one code all unit (for example green = answered, orange = new question, blue = new evidence) and change Lesson 3's green question cards to orange. Left unedited because it touches every DQB step in Lesson 3 and teachers may have their own colour sets.</w:t>
             </w:r>
           </w:p>
         </w:tc>
@@ -17318,7 +17500,7 @@
                 <w:sz w:val="17"/>
                 <w:szCs w:val="17"/>
               </w:rPr>
-              <w:t xml:space="preserve">Journal_Mathematics</w:t>
+              <w:t xml:space="preserve">Journal_Chemistry</w:t>
             </w:r>
           </w:p>
         </w:tc>
@@ -17350,7 +17532,7 @@
                 <w:sz w:val="17"/>
                 <w:szCs w:val="17"/>
               </w:rPr>
-              <w:t xml:space="preserve">2.4 Surface Area and Volume of Solids</w:t>
+              <w:t xml:space="preserve">2.1 Introduction to Salts</w:t>
             </w:r>
           </w:p>
         </w:tc>
@@ -17380,7 +17562,7 @@
                 <w:sz w:val="17"/>
                 <w:szCs w:val="17"/>
               </w:rPr>
-              <w:t xml:space="preserve">Lesson 9, Observe Phase, learnerExperience (+1 related)</w:t>
+              <w:t xml:space="preserve">Final Explanation, rubric</w:t>
             </w:r>
           </w:p>
         </w:tc>
@@ -17410,7 +17592,7 @@
                 <w:sz w:val="17"/>
                 <w:szCs w:val="17"/>
               </w:rPr>
-              <w:t xml:space="preserve">Suggested change: Lesson 9 repeated the tank volumes already found in Lessons 6 and 7 and gave no dimensions; learners now re-check them quickly and solve a new composite problem (Kitale silo).. Old Lesson 9 asked learners to compute both tank volumes, which they had already done in Lessons 6 and 7, and the data card had no dimensions. KICD outcome (d), the volume of composite solids in real-life situations, therefore had little new practice. I give the card its dimensions, shorten the re-check, and add one new composite problem. Checked: cylinder pi x 2.25 x 3 = 21.206; cone (1/3) x pi x 2.25 x 1 = 2.356; total 23.562 m3. TEACHER DECISION: this changes the lesson design (a different problem in the group-work slot); keep or swap the silo for a problem from your own textbook.</w:t>
+              <w:t xml:space="preserve">The CBE rubric has four levels (Exceeds, Meets, Approaches, Below Expectations) but the data contract allows only three level fields and the printed headings are fixed by the template, so the Below Expectations level cannot be represented. Suggestion: tell teachers that work that does not reach 'Approaches Expectations' on a criterion is 'Below Expectations', or ask the partner whether a fourth level field can be added.</w:t>
             </w:r>
           </w:p>
         </w:tc>
@@ -17440,7 +17622,7 @@
                 <w:sz w:val="17"/>
                 <w:szCs w:val="17"/>
               </w:rPr>
-              <w:t xml:space="preserve">Journal_Mathematics</w:t>
+              <w:t xml:space="preserve">Journal_Chemistry</w:t>
             </w:r>
           </w:p>
         </w:tc>
@@ -17472,7 +17654,7 @@
                 <w:sz w:val="17"/>
                 <w:szCs w:val="17"/>
               </w:rPr>
-              <w:t xml:space="preserve">2.4 Surface Area and Volume of Solids</w:t>
+              <w:t xml:space="preserve">3.1 Acids and Bases</w:t>
             </w:r>
           </w:p>
         </w:tc>
@@ -17502,7 +17684,7 @@
                 <w:sz w:val="17"/>
                 <w:szCs w:val="17"/>
               </w:rPr>
-              <w:t xml:space="preserve">Unit overview, coreCompetencies (+2 related)</w:t>
+              <w:t xml:space="preserve">Unit overview, supportingPhenomena (+4 related)</w:t>
             </w:r>
           </w:p>
         </w:tc>
@@ -17532,7 +17714,7 @@
                 <w:sz w:val="17"/>
                 <w:szCs w:val="17"/>
               </w:rPr>
-              <w:t xml:space="preserve">Suggested change: Core competencies, values and PCI now include the KICD-listed ones word for word (Lesson 6 sand activity); the earlier extras were kept where they match lesson activities.. KICD lists two core competencies (Critical Thinking and Problem Solving; Creativity and Imagination), two values (Unity, Respect) and the PCI 'Environment and technology', all tied to the cone-and-cylinder sand activity (Lesson 6). The data had other competencies, values and PCIs not in KICD (Digital Literacy, Self-efficacy, Integrity, Financial Literacy...). TEACHER DECISION: I restored the KICD wording and kept the extras that match real lesson activities; delete extras if your school wants the KICD list only.</w:t>
+              <w:t xml:space="preserve">Suggested change: Tea farmers do not lime their soil (tea likes acidic soil); the liming example now uses a maize farm in Kericho. Tea grows best at soil pH about 4.5 to 5.5, so tea farmers do not raise soil pH with lime; raising it to about 6.0 as in the lessons would harm tea. Maize needs about pH 5.5 to 6.5, so the 4.5 to 6.0 liming data fits a maize field. The lime data are unchanged. A teacher must decide: keep Kericho (acidic soils, many smallholder maize plots) or name a local maize-growing area your learners know better, such as Nandi or Trans Nzoia.</w:t>
             </w:r>
           </w:p>
         </w:tc>
@@ -17562,7 +17744,7 @@
                 <w:sz w:val="17"/>
                 <w:szCs w:val="17"/>
               </w:rPr>
-              <w:t xml:space="preserve">Journal_Mathematics</w:t>
+              <w:t xml:space="preserve">Journal_Chemistry</w:t>
             </w:r>
           </w:p>
         </w:tc>
@@ -17594,7 +17776,7 @@
                 <w:sz w:val="17"/>
                 <w:szCs w:val="17"/>
               </w:rPr>
-              <w:t xml:space="preserve">2.4 Surface Area and Volume of Solids</w:t>
+              <w:t xml:space="preserve">3.1 Acids and Bases</w:t>
             </w:r>
           </w:p>
         </w:tc>
@@ -17624,7 +17806,7 @@
                 <w:sz w:val="17"/>
                 <w:szCs w:val="17"/>
               </w:rPr>
-              <w:t xml:space="preserve">Unit overview, substrand</w:t>
+              <w:t xml:space="preserve">Lesson 3, overview (+8 related)</w:t>
             </w:r>
           </w:p>
         </w:tc>
@@ -17654,7 +17836,7 @@
                 <w:sz w:val="17"/>
                 <w:szCs w:val="17"/>
               </w:rPr>
-              <w:t xml:space="preserve">Suggested change: The unit header said Sub-Strand 2.7 while all ten lessons, the module name, file names and document titles say 2.4. KICD prints this sub-strand as 2.7 in the curriculum design, but 2.4 is the number the teacher templates and this project use everywhere else. I made the unit match 2.4. TEACHER DECISION: if you prefer the KICD number, all references must change to 2.7 together.</w:t>
+              <w:t xml:space="preserve">Suggested change: Lesson 3 asked learners to draw H+ and OH- ions before the ions are taught in Lessons 4 and 5; the draft model now uses unnamed 'acid-making' and 'base-making' dots that Lessons 4 and 5 name. Lesson 2 says the H+ and OH- drawings come in later lessons and Lesson 3's own teacher moves say not to explain ions, yet its Model Building phase had learners draw H+ and OH- ions. Learners should experience the pattern before getting the vocabulary. Judgement call: teachers may prefer to keep the ion names in Lesson 3 as a 'first guess'.</w:t>
             </w:r>
           </w:p>
         </w:tc>
@@ -17684,7 +17866,7 @@
                 <w:sz w:val="17"/>
                 <w:szCs w:val="17"/>
               </w:rPr>
-              <w:t xml:space="preserve">Journal_Mathematics</w:t>
+              <w:t xml:space="preserve">Journal_Chemistry</w:t>
             </w:r>
           </w:p>
         </w:tc>
@@ -17716,6 +17898,2080 @@
                 <w:sz w:val="17"/>
                 <w:szCs w:val="17"/>
               </w:rPr>
+              <w:t xml:space="preserve">3.1 Acids and Bases</w:t>
+            </w:r>
+          </w:p>
+        </w:tc>
+        <w:tc>
+          <w:tcPr>
+            <w:tcW w:type="dxa" w:w="3200"/>
+            <w:tcBorders>
+              <w:top w:val="single" w:color="999999" w:sz="4"/>
+              <w:left w:val="single" w:color="999999" w:sz="4"/>
+              <w:bottom w:val="single" w:color="999999" w:sz="4"/>
+              <w:right w:val="single" w:color="999999" w:sz="4"/>
+            </w:tcBorders>
+            <w:tcMar>
+              <w:top w:type="dxa" w:w="50"/>
+              <w:left w:type="dxa" w:w="80"/>
+              <w:bottom w:type="dxa" w:w="50"/>
+              <w:right w:type="dxa" w:w="80"/>
+            </w:tcMar>
+          </w:tcPr>
+          <w:p>
+            <w:pPr>
+              <w:spacing w:after="60" w:before="0"/>
+            </w:pPr>
+            <w:r>
+              <w:rPr>
+                <w:rFonts w:ascii="Arial" w:cs="Arial" w:eastAsia="Arial" w:hAnsi="Arial"/>
+                <w:sz w:val="17"/>
+                <w:szCs w:val="17"/>
+              </w:rPr>
+              <w:t xml:space="preserve">Lesson 8, Observe Phase, learnerExperience (+1 related)</w:t>
+            </w:r>
+          </w:p>
+        </w:tc>
+        <w:tc>
+          <w:tcPr>
+            <w:tcW w:type="dxa" w:w="6580"/>
+            <w:tcBorders>
+              <w:top w:val="single" w:color="999999" w:sz="4"/>
+              <w:left w:val="single" w:color="999999" w:sz="4"/>
+              <w:bottom w:val="single" w:color="999999" w:sz="4"/>
+              <w:right w:val="single" w:color="999999" w:sz="4"/>
+            </w:tcBorders>
+            <w:tcMar>
+              <w:top w:type="dxa" w:w="50"/>
+              <w:left w:type="dxa" w:w="80"/>
+              <w:bottom w:type="dxa" w:w="50"/>
+              <w:right w:type="dxa" w:w="80"/>
+            </w:tcMar>
+          </w:tcPr>
+          <w:p>
+            <w:pPr>
+              <w:spacing w:after="60" w:before="0"/>
+            </w:pPr>
+            <w:r>
+              <w:rPr>
+                <w:rFonts w:ascii="Arial" w:cs="Arial" w:eastAsia="Arial" w:hAnsi="Arial"/>
+                <w:sz w:val="17"/>
+                <w:szCs w:val="17"/>
+              </w:rPr>
+              <w:t xml:space="preserve">Suggested change: KICD asks learners to compare electrical conductivity of strong and weak acids and bases; this was never taught, so a short teacher demonstration is added to Lesson 8. The KICD content list and learning experiences include comparing electrical conductivity of strong and weak acids and bases (HCl, ethanoic acid, NaOH, ammonia of the same concentration). Conductivity was absent from all ten lessons. Bright versus dim bulb is a standard, low-cost result (more ions, more current). Judgement call: needs a bulb, battery and electrodes; if the school has none, skip it and keep the pH evidence.</w:t>
+            </w:r>
+          </w:p>
+        </w:tc>
+        <w:tc>
+          <w:tcPr>
+            <w:tcW w:type="dxa" w:w="1700"/>
+            <w:tcBorders>
+              <w:top w:val="single" w:color="999999" w:sz="4"/>
+              <w:left w:val="single" w:color="999999" w:sz="4"/>
+              <w:bottom w:val="single" w:color="999999" w:sz="4"/>
+              <w:right w:val="single" w:color="999999" w:sz="4"/>
+            </w:tcBorders>
+            <w:tcMar>
+              <w:top w:type="dxa" w:w="50"/>
+              <w:left w:type="dxa" w:w="80"/>
+              <w:bottom w:type="dxa" w:w="50"/>
+              <w:right w:type="dxa" w:w="80"/>
+            </w:tcMar>
+          </w:tcPr>
+          <w:p>
+            <w:pPr>
+              <w:spacing w:after="60" w:before="0"/>
+            </w:pPr>
+            <w:r>
+              <w:rPr>
+                <w:rFonts w:ascii="Arial" w:cs="Arial" w:eastAsia="Arial" w:hAnsi="Arial"/>
+                <w:sz w:val="17"/>
+                <w:szCs w:val="17"/>
+              </w:rPr>
+              <w:t xml:space="preserve">Journal_Chemistry</w:t>
+            </w:r>
+          </w:p>
+        </w:tc>
+      </w:tr>
+      <w:tr>
+        <w:tc>
+          <w:tcPr>
+            <w:tcW w:type="dxa" w:w="2200"/>
+            <w:tcBorders>
+              <w:top w:val="single" w:color="999999" w:sz="4"/>
+              <w:left w:val="single" w:color="999999" w:sz="4"/>
+              <w:bottom w:val="single" w:color="999999" w:sz="4"/>
+              <w:right w:val="single" w:color="999999" w:sz="4"/>
+            </w:tcBorders>
+            <w:tcMar>
+              <w:top w:type="dxa" w:w="50"/>
+              <w:left w:type="dxa" w:w="80"/>
+              <w:bottom w:type="dxa" w:w="50"/>
+              <w:right w:type="dxa" w:w="80"/>
+            </w:tcMar>
+          </w:tcPr>
+          <w:p>
+            <w:pPr>
+              <w:spacing w:after="60" w:before="0"/>
+            </w:pPr>
+            <w:r>
+              <w:rPr>
+                <w:rFonts w:ascii="Arial" w:cs="Arial" w:eastAsia="Arial" w:hAnsi="Arial"/>
+                <w:sz w:val="17"/>
+                <w:szCs w:val="17"/>
+              </w:rPr>
+              <w:t xml:space="preserve">3.1 Acids and Bases</w:t>
+            </w:r>
+          </w:p>
+        </w:tc>
+        <w:tc>
+          <w:tcPr>
+            <w:tcW w:type="dxa" w:w="3200"/>
+            <w:tcBorders>
+              <w:top w:val="single" w:color="999999" w:sz="4"/>
+              <w:left w:val="single" w:color="999999" w:sz="4"/>
+              <w:bottom w:val="single" w:color="999999" w:sz="4"/>
+              <w:right w:val="single" w:color="999999" w:sz="4"/>
+            </w:tcBorders>
+            <w:tcMar>
+              <w:top w:type="dxa" w:w="50"/>
+              <w:left w:type="dxa" w:w="80"/>
+              <w:bottom w:type="dxa" w:w="50"/>
+              <w:right w:type="dxa" w:w="80"/>
+            </w:tcMar>
+          </w:tcPr>
+          <w:p>
+            <w:pPr>
+              <w:spacing w:after="60" w:before="0"/>
+            </w:pPr>
+            <w:r>
+              <w:rPr>
+                <w:rFonts w:ascii="Arial" w:cs="Arial" w:eastAsia="Arial" w:hAnsi="Arial"/>
+                <w:sz w:val="17"/>
+                <w:szCs w:val="17"/>
+              </w:rPr>
+              <w:t xml:space="preserve">Lesson 1, Explain Phase, teacherMoves (+1 related)</w:t>
+            </w:r>
+          </w:p>
+        </w:tc>
+        <w:tc>
+          <w:tcPr>
+            <w:tcW w:type="dxa" w:w="6580"/>
+            <w:tcBorders>
+              <w:top w:val="single" w:color="999999" w:sz="4"/>
+              <w:left w:val="single" w:color="999999" w:sz="4"/>
+              <w:bottom w:val="single" w:color="999999" w:sz="4"/>
+              <w:right w:val="single" w:color="999999" w:sz="4"/>
+            </w:tcBorders>
+            <w:tcMar>
+              <w:top w:type="dxa" w:w="50"/>
+              <w:left w:type="dxa" w:w="80"/>
+              <w:bottom w:type="dxa" w:w="50"/>
+              <w:right w:type="dxa" w:w="80"/>
+            </w:tcMar>
+          </w:tcPr>
+          <w:p>
+            <w:pPr>
+              <w:spacing w:after="60" w:before="0"/>
+            </w:pPr>
+            <w:r>
+              <w:rPr>
+                <w:rFonts w:ascii="Arial" w:cs="Arial" w:eastAsia="Arial" w:hAnsi="Arial"/>
+                <w:sz w:val="17"/>
+                <w:szCs w:val="17"/>
+              </w:rPr>
+              <w:t xml:space="preserve">Suggested change: Added a few Kiswahili terms and a first-language answer option (no language supports existed in the lessons). No lesson had language support for English learners (guideline 12). I added asidi, besi and kiashiria. The teacher must confirm these terms match the Kiswahili your learners and textbooks use; I have not been able to verify them against a KICD Kiswahili glossary.</w:t>
+            </w:r>
+          </w:p>
+        </w:tc>
+        <w:tc>
+          <w:tcPr>
+            <w:tcW w:type="dxa" w:w="1700"/>
+            <w:tcBorders>
+              <w:top w:val="single" w:color="999999" w:sz="4"/>
+              <w:left w:val="single" w:color="999999" w:sz="4"/>
+              <w:bottom w:val="single" w:color="999999" w:sz="4"/>
+              <w:right w:val="single" w:color="999999" w:sz="4"/>
+            </w:tcBorders>
+            <w:tcMar>
+              <w:top w:type="dxa" w:w="50"/>
+              <w:left w:type="dxa" w:w="80"/>
+              <w:bottom w:type="dxa" w:w="50"/>
+              <w:right w:type="dxa" w:w="80"/>
+            </w:tcMar>
+          </w:tcPr>
+          <w:p>
+            <w:pPr>
+              <w:spacing w:after="60" w:before="0"/>
+            </w:pPr>
+            <w:r>
+              <w:rPr>
+                <w:rFonts w:ascii="Arial" w:cs="Arial" w:eastAsia="Arial" w:hAnsi="Arial"/>
+                <w:sz w:val="17"/>
+                <w:szCs w:val="17"/>
+              </w:rPr>
+              <w:t xml:space="preserve">Journal_Chemistry</w:t>
+            </w:r>
+          </w:p>
+        </w:tc>
+      </w:tr>
+      <w:tr>
+        <w:tc>
+          <w:tcPr>
+            <w:tcW w:type="dxa" w:w="2200"/>
+            <w:tcBorders>
+              <w:top w:val="single" w:color="999999" w:sz="4"/>
+              <w:left w:val="single" w:color="999999" w:sz="4"/>
+              <w:bottom w:val="single" w:color="999999" w:sz="4"/>
+              <w:right w:val="single" w:color="999999" w:sz="4"/>
+            </w:tcBorders>
+            <w:tcMar>
+              <w:top w:type="dxa" w:w="50"/>
+              <w:left w:type="dxa" w:w="80"/>
+              <w:bottom w:type="dxa" w:w="50"/>
+              <w:right w:type="dxa" w:w="80"/>
+            </w:tcMar>
+          </w:tcPr>
+          <w:p>
+            <w:pPr>
+              <w:spacing w:after="60" w:before="0"/>
+            </w:pPr>
+            <w:r>
+              <w:rPr>
+                <w:rFonts w:ascii="Arial" w:cs="Arial" w:eastAsia="Arial" w:hAnsi="Arial"/>
+                <w:sz w:val="17"/>
+                <w:szCs w:val="17"/>
+              </w:rPr>
+              <w:t xml:space="preserve">3.1 Acids and Bases</w:t>
+            </w:r>
+          </w:p>
+        </w:tc>
+        <w:tc>
+          <w:tcPr>
+            <w:tcW w:type="dxa" w:w="3200"/>
+            <w:tcBorders>
+              <w:top w:val="single" w:color="999999" w:sz="4"/>
+              <w:left w:val="single" w:color="999999" w:sz="4"/>
+              <w:bottom w:val="single" w:color="999999" w:sz="4"/>
+              <w:right w:val="single" w:color="999999" w:sz="4"/>
+            </w:tcBorders>
+            <w:tcMar>
+              <w:top w:type="dxa" w:w="50"/>
+              <w:left w:type="dxa" w:w="80"/>
+              <w:bottom w:type="dxa" w:w="50"/>
+              <w:right w:type="dxa" w:w="80"/>
+            </w:tcMar>
+          </w:tcPr>
+          <w:p>
+            <w:pPr>
+              <w:spacing w:after="60" w:before="0"/>
+            </w:pPr>
+            <w:r>
+              <w:rPr>
+                <w:rFonts w:ascii="Arial" w:cs="Arial" w:eastAsia="Arial" w:hAnsi="Arial"/>
+                <w:sz w:val="17"/>
+                <w:szCs w:val="17"/>
+              </w:rPr>
+              <w:t xml:space="preserve">Final Explanation, rubric</w:t>
+            </w:r>
+          </w:p>
+        </w:tc>
+        <w:tc>
+          <w:tcPr>
+            <w:tcW w:type="dxa" w:w="6580"/>
+            <w:tcBorders>
+              <w:top w:val="single" w:color="999999" w:sz="4"/>
+              <w:left w:val="single" w:color="999999" w:sz="4"/>
+              <w:bottom w:val="single" w:color="999999" w:sz="4"/>
+              <w:right w:val="single" w:color="999999" w:sz="4"/>
+            </w:tcBorders>
+            <w:tcMar>
+              <w:top w:type="dxa" w:w="50"/>
+              <w:left w:type="dxa" w:w="80"/>
+              <w:bottom w:type="dxa" w:w="50"/>
+              <w:right w:type="dxa" w:w="80"/>
+            </w:tcMar>
+          </w:tcPr>
+          <w:p>
+            <w:pPr>
+              <w:spacing w:after="60" w:before="0"/>
+            </w:pPr>
+            <w:r>
+              <w:rPr>
+                <w:rFonts w:ascii="Arial" w:cs="Arial" w:eastAsia="Arial" w:hAnsi="Arial"/>
+                <w:sz w:val="17"/>
+                <w:szCs w:val="17"/>
+              </w:rPr>
+              <w:t xml:space="preserve">The data contract allows only three level fields (excellent, proficient, developing), so the fourth CBE level, Below Expectations, cannot be represented and the printed headings are fixed by the template. Suggestion: teachers treat any answer below 'Approaches Expectations' as Below Expectations, or the template owner adds a fourth field later.</w:t>
+            </w:r>
+          </w:p>
+        </w:tc>
+        <w:tc>
+          <w:tcPr>
+            <w:tcW w:type="dxa" w:w="1700"/>
+            <w:tcBorders>
+              <w:top w:val="single" w:color="999999" w:sz="4"/>
+              <w:left w:val="single" w:color="999999" w:sz="4"/>
+              <w:bottom w:val="single" w:color="999999" w:sz="4"/>
+              <w:right w:val="single" w:color="999999" w:sz="4"/>
+            </w:tcBorders>
+            <w:tcMar>
+              <w:top w:type="dxa" w:w="50"/>
+              <w:left w:type="dxa" w:w="80"/>
+              <w:bottom w:type="dxa" w:w="50"/>
+              <w:right w:type="dxa" w:w="80"/>
+            </w:tcMar>
+          </w:tcPr>
+          <w:p>
+            <w:pPr>
+              <w:spacing w:after="60" w:before="0"/>
+            </w:pPr>
+            <w:r>
+              <w:rPr>
+                <w:rFonts w:ascii="Arial" w:cs="Arial" w:eastAsia="Arial" w:hAnsi="Arial"/>
+                <w:sz w:val="17"/>
+                <w:szCs w:val="17"/>
+              </w:rPr>
+              <w:t xml:space="preserve">Journal_Chemistry</w:t>
+            </w:r>
+          </w:p>
+        </w:tc>
+      </w:tr>
+      <w:tr>
+        <w:tc>
+          <w:tcPr>
+            <w:tcW w:type="dxa" w:w="2200"/>
+            <w:tcBorders>
+              <w:top w:val="single" w:color="999999" w:sz="4"/>
+              <w:left w:val="single" w:color="999999" w:sz="4"/>
+              <w:bottom w:val="single" w:color="999999" w:sz="4"/>
+              <w:right w:val="single" w:color="999999" w:sz="4"/>
+            </w:tcBorders>
+            <w:tcMar>
+              <w:top w:type="dxa" w:w="50"/>
+              <w:left w:type="dxa" w:w="80"/>
+              <w:bottom w:type="dxa" w:w="50"/>
+              <w:right w:type="dxa" w:w="80"/>
+            </w:tcMar>
+          </w:tcPr>
+          <w:p>
+            <w:pPr>
+              <w:spacing w:after="60" w:before="0"/>
+            </w:pPr>
+            <w:r>
+              <w:rPr>
+                <w:rFonts w:ascii="Arial" w:cs="Arial" w:eastAsia="Arial" w:hAnsi="Arial"/>
+                <w:sz w:val="17"/>
+                <w:szCs w:val="17"/>
+              </w:rPr>
+              <w:t xml:space="preserve">3.1 Acids and Bases</w:t>
+            </w:r>
+          </w:p>
+        </w:tc>
+        <w:tc>
+          <w:tcPr>
+            <w:tcW w:type="dxa" w:w="3200"/>
+            <w:tcBorders>
+              <w:top w:val="single" w:color="999999" w:sz="4"/>
+              <w:left w:val="single" w:color="999999" w:sz="4"/>
+              <w:bottom w:val="single" w:color="999999" w:sz="4"/>
+              <w:right w:val="single" w:color="999999" w:sz="4"/>
+            </w:tcBorders>
+            <w:tcMar>
+              <w:top w:type="dxa" w:w="50"/>
+              <w:left w:type="dxa" w:w="80"/>
+              <w:bottom w:type="dxa" w:w="50"/>
+              <w:right w:type="dxa" w:w="80"/>
+            </w:tcMar>
+          </w:tcPr>
+          <w:p>
+            <w:pPr>
+              <w:spacing w:after="60" w:before="0"/>
+            </w:pPr>
+            <w:r>
+              <w:rPr>
+                <w:rFonts w:ascii="Arial" w:cs="Arial" w:eastAsia="Arial" w:hAnsi="Arial"/>
+                <w:sz w:val="17"/>
+                <w:szCs w:val="17"/>
+              </w:rPr>
+              <w:t xml:space="preserve">Unit overview, strand</w:t>
+            </w:r>
+          </w:p>
+        </w:tc>
+        <w:tc>
+          <w:tcPr>
+            <w:tcW w:type="dxa" w:w="6580"/>
+            <w:tcBorders>
+              <w:top w:val="single" w:color="999999" w:sz="4"/>
+              <w:left w:val="single" w:color="999999" w:sz="4"/>
+              <w:bottom w:val="single" w:color="999999" w:sz="4"/>
+              <w:right w:val="single" w:color="999999" w:sz="4"/>
+            </w:tcBorders>
+            <w:tcMar>
+              <w:top w:type="dxa" w:w="50"/>
+              <w:left w:type="dxa" w:w="80"/>
+              <w:bottom w:type="dxa" w:w="50"/>
+              <w:right w:type="dxa" w:w="80"/>
+            </w:tcMar>
+          </w:tcPr>
+          <w:p>
+            <w:pPr>
+              <w:spacing w:after="60" w:before="0"/>
+            </w:pPr>
+            <w:r>
+              <w:rPr>
+                <w:rFonts w:ascii="Arial" w:cs="Arial" w:eastAsia="Arial" w:hAnsi="Arial"/>
+                <w:sz w:val="17"/>
+                <w:szCs w:val="17"/>
+              </w:rPr>
+              <w:t xml:space="preserve">KICD places Acids and Bases in Strand 2.0 Physical Chemistry as Sub-Strand 2.1 (30 lessons). The data and every lesson say 'Strand 3.0: Chemical Reactions and Mixtures' and 'Sub-Strand 3.1'. In KICD, Strand 3.0 is Organic Chemistry. I have not renamed it because numbering is used in file names and teacher references; teachers/project owner should decide whether to renumber everywhere (strand 2.0 Physical Chemistry, sub-strand 2.1).</w:t>
+            </w:r>
+          </w:p>
+        </w:tc>
+        <w:tc>
+          <w:tcPr>
+            <w:tcW w:type="dxa" w:w="1700"/>
+            <w:tcBorders>
+              <w:top w:val="single" w:color="999999" w:sz="4"/>
+              <w:left w:val="single" w:color="999999" w:sz="4"/>
+              <w:bottom w:val="single" w:color="999999" w:sz="4"/>
+              <w:right w:val="single" w:color="999999" w:sz="4"/>
+            </w:tcBorders>
+            <w:tcMar>
+              <w:top w:type="dxa" w:w="50"/>
+              <w:left w:type="dxa" w:w="80"/>
+              <w:bottom w:type="dxa" w:w="50"/>
+              <w:right w:type="dxa" w:w="80"/>
+            </w:tcMar>
+          </w:tcPr>
+          <w:p>
+            <w:pPr>
+              <w:spacing w:after="60" w:before="0"/>
+            </w:pPr>
+            <w:r>
+              <w:rPr>
+                <w:rFonts w:ascii="Arial" w:cs="Arial" w:eastAsia="Arial" w:hAnsi="Arial"/>
+                <w:sz w:val="17"/>
+                <w:szCs w:val="17"/>
+              </w:rPr>
+              <w:t xml:space="preserve">Journal_Chemistry</w:t>
+            </w:r>
+          </w:p>
+        </w:tc>
+      </w:tr>
+      <w:tr>
+        <w:tc>
+          <w:tcPr>
+            <w:tcW w:type="dxa" w:w="2200"/>
+            <w:tcBorders>
+              <w:top w:val="single" w:color="999999" w:sz="4"/>
+              <w:left w:val="single" w:color="999999" w:sz="4"/>
+              <w:bottom w:val="single" w:color="999999" w:sz="4"/>
+              <w:right w:val="single" w:color="999999" w:sz="4"/>
+            </w:tcBorders>
+            <w:tcMar>
+              <w:top w:type="dxa" w:w="50"/>
+              <w:left w:type="dxa" w:w="80"/>
+              <w:bottom w:type="dxa" w:w="50"/>
+              <w:right w:type="dxa" w:w="80"/>
+            </w:tcMar>
+          </w:tcPr>
+          <w:p>
+            <w:pPr>
+              <w:spacing w:after="60" w:before="0"/>
+            </w:pPr>
+            <w:r>
+              <w:rPr>
+                <w:rFonts w:ascii="Arial" w:cs="Arial" w:eastAsia="Arial" w:hAnsi="Arial"/>
+                <w:sz w:val="17"/>
+                <w:szCs w:val="17"/>
+              </w:rPr>
+              <w:t xml:space="preserve">3.1 Acids and Bases</w:t>
+            </w:r>
+          </w:p>
+        </w:tc>
+        <w:tc>
+          <w:tcPr>
+            <w:tcW w:type="dxa" w:w="3200"/>
+            <w:tcBorders>
+              <w:top w:val="single" w:color="999999" w:sz="4"/>
+              <w:left w:val="single" w:color="999999" w:sz="4"/>
+              <w:bottom w:val="single" w:color="999999" w:sz="4"/>
+              <w:right w:val="single" w:color="999999" w:sz="4"/>
+            </w:tcBorders>
+            <w:tcMar>
+              <w:top w:type="dxa" w:w="50"/>
+              <w:left w:type="dxa" w:w="80"/>
+              <w:bottom w:type="dxa" w:w="50"/>
+              <w:right w:type="dxa" w:w="80"/>
+            </w:tcMar>
+          </w:tcPr>
+          <w:p>
+            <w:pPr>
+              <w:spacing w:after="60" w:before="0"/>
+            </w:pPr>
+            <w:r>
+              <w:rPr>
+                <w:rFonts w:ascii="Arial" w:cs="Arial" w:eastAsia="Arial" w:hAnsi="Arial"/>
+                <w:sz w:val="17"/>
+                <w:szCs w:val="17"/>
+              </w:rPr>
+              <w:t xml:space="preserve">Lesson 7, Observe Phase, learnerExperience</w:t>
+            </w:r>
+          </w:p>
+        </w:tc>
+        <w:tc>
+          <w:tcPr>
+            <w:tcW w:type="dxa" w:w="6580"/>
+            <w:tcBorders>
+              <w:top w:val="single" w:color="999999" w:sz="4"/>
+              <w:left w:val="single" w:color="999999" w:sz="4"/>
+              <w:bottom w:val="single" w:color="999999" w:sz="4"/>
+              <w:right w:val="single" w:color="999999" w:sz="4"/>
+            </w:tcBorders>
+            <w:tcMar>
+              <w:top w:type="dxa" w:w="50"/>
+              <w:left w:type="dxa" w:w="80"/>
+              <w:bottom w:type="dxa" w:w="50"/>
+              <w:right w:type="dxa" w:w="80"/>
+            </w:tcMar>
+          </w:tcPr>
+          <w:p>
+            <w:pPr>
+              <w:spacing w:after="60" w:before="0"/>
+            </w:pPr>
+            <w:r>
+              <w:rPr>
+                <w:rFonts w:ascii="Arial" w:cs="Arial" w:eastAsia="Arial" w:hAnsi="Arial"/>
+                <w:sz w:val="17"/>
+                <w:szCs w:val="17"/>
+              </w:rPr>
+              <w:t xml:space="preserve">KICD content lists reactions of acids with metal oxides (as well as hydroxides, carbonates, hydrogen carbonates, metals) and suggests using sulphuric (VI) acid and sodium carbonate in the strength comparison. Metals, carbonates, hydrogen carbonates and hydroxides are practised (Lessons 6 and 7); metal oxides appear only as a card in Lesson 5, and sulphuric acid and sodium carbonate are not used. Suggestion: if equipment allows, add a 5-minute teacher demonstration of copper(II) oxide with warm dilute sulphuric acid (black solid dissolves, blue solution) to Lesson 7.</w:t>
+            </w:r>
+          </w:p>
+        </w:tc>
+        <w:tc>
+          <w:tcPr>
+            <w:tcW w:type="dxa" w:w="1700"/>
+            <w:tcBorders>
+              <w:top w:val="single" w:color="999999" w:sz="4"/>
+              <w:left w:val="single" w:color="999999" w:sz="4"/>
+              <w:bottom w:val="single" w:color="999999" w:sz="4"/>
+              <w:right w:val="single" w:color="999999" w:sz="4"/>
+            </w:tcBorders>
+            <w:tcMar>
+              <w:top w:type="dxa" w:w="50"/>
+              <w:left w:type="dxa" w:w="80"/>
+              <w:bottom w:type="dxa" w:w="50"/>
+              <w:right w:type="dxa" w:w="80"/>
+            </w:tcMar>
+          </w:tcPr>
+          <w:p>
+            <w:pPr>
+              <w:spacing w:after="60" w:before="0"/>
+            </w:pPr>
+            <w:r>
+              <w:rPr>
+                <w:rFonts w:ascii="Arial" w:cs="Arial" w:eastAsia="Arial" w:hAnsi="Arial"/>
+                <w:sz w:val="17"/>
+                <w:szCs w:val="17"/>
+              </w:rPr>
+              <w:t xml:space="preserve">Journal_Chemistry</w:t>
+            </w:r>
+          </w:p>
+        </w:tc>
+      </w:tr>
+      <w:tr>
+        <w:tc>
+          <w:tcPr>
+            <w:tcW w:type="dxa" w:w="2200"/>
+            <w:tcBorders>
+              <w:top w:val="single" w:color="999999" w:sz="4"/>
+              <w:left w:val="single" w:color="999999" w:sz="4"/>
+              <w:bottom w:val="single" w:color="999999" w:sz="4"/>
+              <w:right w:val="single" w:color="999999" w:sz="4"/>
+            </w:tcBorders>
+            <w:tcMar>
+              <w:top w:type="dxa" w:w="50"/>
+              <w:left w:type="dxa" w:w="80"/>
+              <w:bottom w:type="dxa" w:w="50"/>
+              <w:right w:type="dxa" w:w="80"/>
+            </w:tcMar>
+          </w:tcPr>
+          <w:p>
+            <w:pPr>
+              <w:spacing w:after="60" w:before="0"/>
+            </w:pPr>
+            <w:r>
+              <w:rPr>
+                <w:rFonts w:ascii="Arial" w:cs="Arial" w:eastAsia="Arial" w:hAnsi="Arial"/>
+                <w:sz w:val="17"/>
+                <w:szCs w:val="17"/>
+              </w:rPr>
+              <w:t xml:space="preserve">2.4 Trigonometry 1</w:t>
+            </w:r>
+          </w:p>
+        </w:tc>
+        <w:tc>
+          <w:tcPr>
+            <w:tcW w:type="dxa" w:w="3200"/>
+            <w:tcBorders>
+              <w:top w:val="single" w:color="999999" w:sz="4"/>
+              <w:left w:val="single" w:color="999999" w:sz="4"/>
+              <w:bottom w:val="single" w:color="999999" w:sz="4"/>
+              <w:right w:val="single" w:color="999999" w:sz="4"/>
+            </w:tcBorders>
+            <w:tcMar>
+              <w:top w:type="dxa" w:w="50"/>
+              <w:left w:type="dxa" w:w="80"/>
+              <w:bottom w:type="dxa" w:w="50"/>
+              <w:right w:type="dxa" w:w="80"/>
+            </w:tcMar>
+          </w:tcPr>
+          <w:p>
+            <w:pPr>
+              <w:spacing w:after="60" w:before="0"/>
+            </w:pPr>
+            <w:r>
+              <w:rPr>
+                <w:rFonts w:ascii="Arial" w:cs="Arial" w:eastAsia="Arial" w:hAnsi="Arial"/>
+                <w:sz w:val="17"/>
+                <w:szCs w:val="17"/>
+              </w:rPr>
+              <w:t xml:space="preserve">Lesson 5, Model Building Phase, teacherMoves (+1 related)</w:t>
+            </w:r>
+          </w:p>
+        </w:tc>
+        <w:tc>
+          <w:tcPr>
+            <w:tcW w:type="dxa" w:w="6580"/>
+            <w:tcBorders>
+              <w:top w:val="single" w:color="999999" w:sz="4"/>
+              <w:left w:val="single" w:color="999999" w:sz="4"/>
+              <w:bottom w:val="single" w:color="999999" w:sz="4"/>
+              <w:right w:val="single" w:color="999999" w:sz="4"/>
+            </w:tcBorders>
+            <w:tcMar>
+              <w:top w:type="dxa" w:w="50"/>
+              <w:left w:type="dxa" w:w="80"/>
+              <w:bottom w:type="dxa" w:w="50"/>
+              <w:right w:type="dxa" w:w="80"/>
+            </w:tcMar>
+          </w:tcPr>
+          <w:p>
+            <w:pPr>
+              <w:spacing w:after="60" w:before="0"/>
+            </w:pPr>
+            <w:r>
+              <w:rPr>
+                <w:rFonts w:ascii="Arial" w:cs="Arial" w:eastAsia="Arial" w:hAnsi="Arial"/>
+                <w:sz w:val="17"/>
+                <w:szCs w:val="17"/>
+              </w:rPr>
+              <w:t xml:space="preserve">Suggested change: KICD clinometer project, digital-resource use and parent support were missing; added as a take-home project after Lesson 5 (and removed an orphan 'estimate the angle for Lesson 7' task). KICD asks learners to use a simple clinometer and to make one from local materials as the sub-strand project (also the source of the Creativity and Imagination competency and the Parental Engagement PCI). Nothing in the lessons did this. The Lesson 5 preview also sent learners to estimate an angle 'for Lesson 7', but Lesson 7 is paper-based and never used it, and it said Lesson 7 'takes this tool outside', which it does not. Now the preview points to Lesson 6 and 7 correctly and starts the clinometer project. Teacher must decide: which materials (protractor, card, straw, string, nut) families can really supply, and whether the template card is needed.</w:t>
+            </w:r>
+          </w:p>
+        </w:tc>
+        <w:tc>
+          <w:tcPr>
+            <w:tcW w:type="dxa" w:w="1700"/>
+            <w:tcBorders>
+              <w:top w:val="single" w:color="999999" w:sz="4"/>
+              <w:left w:val="single" w:color="999999" w:sz="4"/>
+              <w:bottom w:val="single" w:color="999999" w:sz="4"/>
+              <w:right w:val="single" w:color="999999" w:sz="4"/>
+            </w:tcBorders>
+            <w:tcMar>
+              <w:top w:type="dxa" w:w="50"/>
+              <w:left w:type="dxa" w:w="80"/>
+              <w:bottom w:type="dxa" w:w="50"/>
+              <w:right w:type="dxa" w:w="80"/>
+            </w:tcMar>
+          </w:tcPr>
+          <w:p>
+            <w:pPr>
+              <w:spacing w:after="60" w:before="0"/>
+            </w:pPr>
+            <w:r>
+              <w:rPr>
+                <w:rFonts w:ascii="Arial" w:cs="Arial" w:eastAsia="Arial" w:hAnsi="Arial"/>
+                <w:sz w:val="17"/>
+                <w:szCs w:val="17"/>
+              </w:rPr>
+              <w:t xml:space="preserve">Journal_Core_Mathematics</w:t>
+            </w:r>
+          </w:p>
+        </w:tc>
+      </w:tr>
+      <w:tr>
+        <w:tc>
+          <w:tcPr>
+            <w:tcW w:type="dxa" w:w="2200"/>
+            <w:tcBorders>
+              <w:top w:val="single" w:color="999999" w:sz="4"/>
+              <w:left w:val="single" w:color="999999" w:sz="4"/>
+              <w:bottom w:val="single" w:color="999999" w:sz="4"/>
+              <w:right w:val="single" w:color="999999" w:sz="4"/>
+            </w:tcBorders>
+            <w:tcMar>
+              <w:top w:type="dxa" w:w="50"/>
+              <w:left w:type="dxa" w:w="80"/>
+              <w:bottom w:type="dxa" w:w="50"/>
+              <w:right w:type="dxa" w:w="80"/>
+            </w:tcMar>
+          </w:tcPr>
+          <w:p>
+            <w:pPr>
+              <w:spacing w:after="60" w:before="0"/>
+            </w:pPr>
+            <w:r>
+              <w:rPr>
+                <w:rFonts w:ascii="Arial" w:cs="Arial" w:eastAsia="Arial" w:hAnsi="Arial"/>
+                <w:sz w:val="17"/>
+                <w:szCs w:val="17"/>
+              </w:rPr>
+              <w:t xml:space="preserve">2.4 Trigonometry 1</w:t>
+            </w:r>
+          </w:p>
+        </w:tc>
+        <w:tc>
+          <w:tcPr>
+            <w:tcW w:type="dxa" w:w="3200"/>
+            <w:tcBorders>
+              <w:top w:val="single" w:color="999999" w:sz="4"/>
+              <w:left w:val="single" w:color="999999" w:sz="4"/>
+              <w:bottom w:val="single" w:color="999999" w:sz="4"/>
+              <w:right w:val="single" w:color="999999" w:sz="4"/>
+            </w:tcBorders>
+            <w:tcMar>
+              <w:top w:type="dxa" w:w="50"/>
+              <w:left w:type="dxa" w:w="80"/>
+              <w:bottom w:type="dxa" w:w="50"/>
+              <w:right w:type="dxa" w:w="80"/>
+            </w:tcMar>
+          </w:tcPr>
+          <w:p>
+            <w:pPr>
+              <w:spacing w:after="60" w:before="0"/>
+            </w:pPr>
+            <w:r>
+              <w:rPr>
+                <w:rFonts w:ascii="Arial" w:cs="Arial" w:eastAsia="Arial" w:hAnsi="Arial"/>
+                <w:sz w:val="17"/>
+                <w:szCs w:val="17"/>
+              </w:rPr>
+              <w:t xml:space="preserve">Lesson 2, Explain Phase, learnerExperience (+1 related)</w:t>
+            </w:r>
+          </w:p>
+        </w:tc>
+        <w:tc>
+          <w:tcPr>
+            <w:tcW w:type="dxa" w:w="6580"/>
+            <w:tcBorders>
+              <w:top w:val="single" w:color="999999" w:sz="4"/>
+              <w:left w:val="single" w:color="999999" w:sz="4"/>
+              <w:bottom w:val="single" w:color="999999" w:sz="4"/>
+              <w:right w:val="single" w:color="999999" w:sz="4"/>
+            </w:tcBorders>
+            <w:tcMar>
+              <w:top w:type="dxa" w:w="50"/>
+              <w:left w:type="dxa" w:w="80"/>
+              <w:bottom w:type="dxa" w:w="50"/>
+              <w:right w:type="dxa" w:w="80"/>
+            </w:tcMar>
+          </w:tcPr>
+          <w:p>
+            <w:pPr>
+              <w:spacing w:after="60" w:before="0"/>
+            </w:pPr>
+            <w:r>
+              <w:rPr>
+                <w:rFonts w:ascii="Arial" w:cs="Arial" w:eastAsia="Arial" w:hAnsi="Arial"/>
+                <w:sz w:val="17"/>
+                <w:szCs w:val="17"/>
+              </w:rPr>
+              <w:t xml:space="preserve">Suggested change: Language support added: class word wall with Kiswahili beside English terms (started Lesson 2, extended in Lesson 7). There was no language support for English learners. A class word wall with Kiswahili beside the English terms is a low-cost support for the unit. Teacher must decide the exact Kiswahili terms the class and school use (they differ by region and textbook), so only two obvious words are suggested.</w:t>
+            </w:r>
+          </w:p>
+        </w:tc>
+        <w:tc>
+          <w:tcPr>
+            <w:tcW w:type="dxa" w:w="1700"/>
+            <w:tcBorders>
+              <w:top w:val="single" w:color="999999" w:sz="4"/>
+              <w:left w:val="single" w:color="999999" w:sz="4"/>
+              <w:bottom w:val="single" w:color="999999" w:sz="4"/>
+              <w:right w:val="single" w:color="999999" w:sz="4"/>
+            </w:tcBorders>
+            <w:tcMar>
+              <w:top w:type="dxa" w:w="50"/>
+              <w:left w:type="dxa" w:w="80"/>
+              <w:bottom w:type="dxa" w:w="50"/>
+              <w:right w:type="dxa" w:w="80"/>
+            </w:tcMar>
+          </w:tcPr>
+          <w:p>
+            <w:pPr>
+              <w:spacing w:after="60" w:before="0"/>
+            </w:pPr>
+            <w:r>
+              <w:rPr>
+                <w:rFonts w:ascii="Arial" w:cs="Arial" w:eastAsia="Arial" w:hAnsi="Arial"/>
+                <w:sz w:val="17"/>
+                <w:szCs w:val="17"/>
+              </w:rPr>
+              <w:t xml:space="preserve">Journal_Core_Mathematics</w:t>
+            </w:r>
+          </w:p>
+        </w:tc>
+      </w:tr>
+      <w:tr>
+        <w:tc>
+          <w:tcPr>
+            <w:tcW w:type="dxa" w:w="2200"/>
+            <w:tcBorders>
+              <w:top w:val="single" w:color="999999" w:sz="4"/>
+              <w:left w:val="single" w:color="999999" w:sz="4"/>
+              <w:bottom w:val="single" w:color="999999" w:sz="4"/>
+              <w:right w:val="single" w:color="999999" w:sz="4"/>
+            </w:tcBorders>
+            <w:tcMar>
+              <w:top w:type="dxa" w:w="50"/>
+              <w:left w:type="dxa" w:w="80"/>
+              <w:bottom w:type="dxa" w:w="50"/>
+              <w:right w:type="dxa" w:w="80"/>
+            </w:tcMar>
+          </w:tcPr>
+          <w:p>
+            <w:pPr>
+              <w:spacing w:after="60" w:before="0"/>
+            </w:pPr>
+            <w:r>
+              <w:rPr>
+                <w:rFonts w:ascii="Arial" w:cs="Arial" w:eastAsia="Arial" w:hAnsi="Arial"/>
+                <w:sz w:val="17"/>
+                <w:szCs w:val="17"/>
+              </w:rPr>
+              <w:t xml:space="preserve">2.4 Trigonometry 1</w:t>
+            </w:r>
+          </w:p>
+        </w:tc>
+        <w:tc>
+          <w:tcPr>
+            <w:tcW w:type="dxa" w:w="3200"/>
+            <w:tcBorders>
+              <w:top w:val="single" w:color="999999" w:sz="4"/>
+              <w:left w:val="single" w:color="999999" w:sz="4"/>
+              <w:bottom w:val="single" w:color="999999" w:sz="4"/>
+              <w:right w:val="single" w:color="999999" w:sz="4"/>
+            </w:tcBorders>
+            <w:tcMar>
+              <w:top w:type="dxa" w:w="50"/>
+              <w:left w:type="dxa" w:w="80"/>
+              <w:bottom w:type="dxa" w:w="50"/>
+              <w:right w:type="dxa" w:w="80"/>
+            </w:tcMar>
+          </w:tcPr>
+          <w:p>
+            <w:pPr>
+              <w:spacing w:after="60" w:before="0"/>
+            </w:pPr>
+            <w:r>
+              <w:rPr>
+                <w:rFonts w:ascii="Arial" w:cs="Arial" w:eastAsia="Arial" w:hAnsi="Arial"/>
+                <w:sz w:val="17"/>
+                <w:szCs w:val="17"/>
+              </w:rPr>
+              <w:t xml:space="preserve">Lesson 8, Explain Phase, learnerExperience (+3 related)</w:t>
+            </w:r>
+          </w:p>
+        </w:tc>
+        <w:tc>
+          <w:tcPr>
+            <w:tcW w:type="dxa" w:w="6580"/>
+            <w:tcBorders>
+              <w:top w:val="single" w:color="999999" w:sz="4"/>
+              <w:left w:val="single" w:color="999999" w:sz="4"/>
+              <w:bottom w:val="single" w:color="999999" w:sz="4"/>
+              <w:right w:val="single" w:color="999999" w:sz="4"/>
+            </w:tcBorders>
+            <w:tcMar>
+              <w:top w:type="dxa" w:w="50"/>
+              <w:left w:type="dxa" w:w="80"/>
+              <w:bottom w:type="dxa" w:w="50"/>
+              <w:right w:type="dxa" w:w="80"/>
+            </w:tcMar>
+          </w:tcPr>
+          <w:p>
+            <w:pPr>
+              <w:spacing w:after="60" w:before="0"/>
+            </w:pPr>
+            <w:r>
+              <w:rPr>
+                <w:rFonts w:ascii="Arial" w:cs="Arial" w:eastAsia="Arial" w:hAnsi="Arial"/>
+                <w:sz w:val="17"/>
+                <w:szCs w:val="17"/>
+              </w:rPr>
+              <w:t xml:space="preserve">Suggested change: Lighthouse assessment was geometrically impossible (38° elevation and 22° depression along one line of sight must be equal); redesigned so the depression angle is measured from the cliff top and the numbers give a consistent answer. The summative task could not work. It said the boat sees the lighthouse top at 38° elevation and the lighthouse top sees the same boat at 22° depression. Those are the same line of sight, so the two angles must be equal (alternate angles), and the mark scheme in the teacher moves broke down in front of the class (it even asked students to find a negative height). The same story also appeared with different numbers (32° and 25°) in the overview. Fix: the 22° depression is now measured by an observer at the TOP OF THE CLIFF, so it equals the elevation of the cliff top from the boat, and 38° is measured to the lighthouse top. Checked twice: cliff = 120 x tan 22° = 120 x 0.40403 = 48.48 m; lighthouse top = 120 x tan 38° = 120 x 0.78129 = 93.75 m; lighthouse = 93.75 - 48.48 = 45.27 m (45.3 m from the rounded values 93.8 - 48.5). Teacher must decide whether to keep a lighthouse setting (the Kisumu shore has few cliffs; a rocky hill with a communications mast would also work with the same numbers).</w:t>
+            </w:r>
+          </w:p>
+        </w:tc>
+        <w:tc>
+          <w:tcPr>
+            <w:tcW w:type="dxa" w:w="1700"/>
+            <w:tcBorders>
+              <w:top w:val="single" w:color="999999" w:sz="4"/>
+              <w:left w:val="single" w:color="999999" w:sz="4"/>
+              <w:bottom w:val="single" w:color="999999" w:sz="4"/>
+              <w:right w:val="single" w:color="999999" w:sz="4"/>
+            </w:tcBorders>
+            <w:tcMar>
+              <w:top w:type="dxa" w:w="50"/>
+              <w:left w:type="dxa" w:w="80"/>
+              <w:bottom w:type="dxa" w:w="50"/>
+              <w:right w:type="dxa" w:w="80"/>
+            </w:tcMar>
+          </w:tcPr>
+          <w:p>
+            <w:pPr>
+              <w:spacing w:after="60" w:before="0"/>
+            </w:pPr>
+            <w:r>
+              <w:rPr>
+                <w:rFonts w:ascii="Arial" w:cs="Arial" w:eastAsia="Arial" w:hAnsi="Arial"/>
+                <w:sz w:val="17"/>
+                <w:szCs w:val="17"/>
+              </w:rPr>
+              <w:t xml:space="preserve">Journal_Core_Mathematics</w:t>
+            </w:r>
+          </w:p>
+        </w:tc>
+      </w:tr>
+      <w:tr>
+        <w:tc>
+          <w:tcPr>
+            <w:tcW w:type="dxa" w:w="2200"/>
+            <w:tcBorders>
+              <w:top w:val="single" w:color="999999" w:sz="4"/>
+              <w:left w:val="single" w:color="999999" w:sz="4"/>
+              <w:bottom w:val="single" w:color="999999" w:sz="4"/>
+              <w:right w:val="single" w:color="999999" w:sz="4"/>
+            </w:tcBorders>
+            <w:tcMar>
+              <w:top w:type="dxa" w:w="50"/>
+              <w:left w:type="dxa" w:w="80"/>
+              <w:bottom w:type="dxa" w:w="50"/>
+              <w:right w:type="dxa" w:w="80"/>
+            </w:tcMar>
+          </w:tcPr>
+          <w:p>
+            <w:pPr>
+              <w:spacing w:after="60" w:before="0"/>
+            </w:pPr>
+            <w:r>
+              <w:rPr>
+                <w:rFonts w:ascii="Arial" w:cs="Arial" w:eastAsia="Arial" w:hAnsi="Arial"/>
+                <w:sz w:val="17"/>
+                <w:szCs w:val="17"/>
+              </w:rPr>
+              <w:t xml:space="preserve">2.4 Trigonometry 1</w:t>
+            </w:r>
+          </w:p>
+        </w:tc>
+        <w:tc>
+          <w:tcPr>
+            <w:tcW w:type="dxa" w:w="3200"/>
+            <w:tcBorders>
+              <w:top w:val="single" w:color="999999" w:sz="4"/>
+              <w:left w:val="single" w:color="999999" w:sz="4"/>
+              <w:bottom w:val="single" w:color="999999" w:sz="4"/>
+              <w:right w:val="single" w:color="999999" w:sz="4"/>
+            </w:tcBorders>
+            <w:tcMar>
+              <w:top w:type="dxa" w:w="50"/>
+              <w:left w:type="dxa" w:w="80"/>
+              <w:bottom w:type="dxa" w:w="50"/>
+              <w:right w:type="dxa" w:w="80"/>
+            </w:tcMar>
+          </w:tcPr>
+          <w:p>
+            <w:pPr>
+              <w:spacing w:after="60" w:before="0"/>
+            </w:pPr>
+            <w:r>
+              <w:rPr>
+                <w:rFonts w:ascii="Arial" w:cs="Arial" w:eastAsia="Arial" w:hAnsi="Arial"/>
+                <w:sz w:val="17"/>
+                <w:szCs w:val="17"/>
+              </w:rPr>
+              <w:t xml:space="preserve">Lesson 7, Driving Question Board (DQB) Creation, teacherMoves</w:t>
+            </w:r>
+          </w:p>
+        </w:tc>
+        <w:tc>
+          <w:tcPr>
+            <w:tcW w:type="dxa" w:w="6580"/>
+            <w:tcBorders>
+              <w:top w:val="single" w:color="999999" w:sz="4"/>
+              <w:left w:val="single" w:color="999999" w:sz="4"/>
+              <w:bottom w:val="single" w:color="999999" w:sz="4"/>
+              <w:right w:val="single" w:color="999999" w:sz="4"/>
+            </w:tcBorders>
+            <w:tcMar>
+              <w:top w:type="dxa" w:w="50"/>
+              <w:left w:type="dxa" w:w="80"/>
+              <w:bottom w:type="dxa" w:w="50"/>
+              <w:right w:type="dxa" w:w="80"/>
+            </w:tcMar>
+          </w:tcPr>
+          <w:p>
+            <w:pPr>
+              <w:spacing w:after="60" w:before="0"/>
+            </w:pPr>
+            <w:r>
+              <w:rPr>
+                <w:rFonts w:ascii="Arial" w:cs="Arial" w:eastAsia="Arial" w:hAnsi="Arial"/>
+                <w:sz w:val="17"/>
+                <w:szCs w:val="17"/>
+              </w:rPr>
+              <w:t xml:space="preserve">Fort Jesus is described as a cliff 20 m, 27 m and (in the unit text) 30 m high. The fort stands on a low coral ridge and its sea-facing walls are lower than that, and the three heights do not agree. This needs local knowledge, so it is flagged rather than guessed: either use a real, measured height, or describe the place as 'a coastal cliff near Mombasa' and keep the numbers.</w:t>
+            </w:r>
+          </w:p>
+        </w:tc>
+        <w:tc>
+          <w:tcPr>
+            <w:tcW w:type="dxa" w:w="1700"/>
+            <w:tcBorders>
+              <w:top w:val="single" w:color="999999" w:sz="4"/>
+              <w:left w:val="single" w:color="999999" w:sz="4"/>
+              <w:bottom w:val="single" w:color="999999" w:sz="4"/>
+              <w:right w:val="single" w:color="999999" w:sz="4"/>
+            </w:tcBorders>
+            <w:tcMar>
+              <w:top w:type="dxa" w:w="50"/>
+              <w:left w:type="dxa" w:w="80"/>
+              <w:bottom w:type="dxa" w:w="50"/>
+              <w:right w:type="dxa" w:w="80"/>
+            </w:tcMar>
+          </w:tcPr>
+          <w:p>
+            <w:pPr>
+              <w:spacing w:after="60" w:before="0"/>
+            </w:pPr>
+            <w:r>
+              <w:rPr>
+                <w:rFonts w:ascii="Arial" w:cs="Arial" w:eastAsia="Arial" w:hAnsi="Arial"/>
+                <w:sz w:val="17"/>
+                <w:szCs w:val="17"/>
+              </w:rPr>
+              <w:t xml:space="preserve">Journal_Core_Mathematics</w:t>
+            </w:r>
+          </w:p>
+        </w:tc>
+      </w:tr>
+      <w:tr>
+        <w:tc>
+          <w:tcPr>
+            <w:tcW w:type="dxa" w:w="2200"/>
+            <w:tcBorders>
+              <w:top w:val="single" w:color="999999" w:sz="4"/>
+              <w:left w:val="single" w:color="999999" w:sz="4"/>
+              <w:bottom w:val="single" w:color="999999" w:sz="4"/>
+              <w:right w:val="single" w:color="999999" w:sz="4"/>
+            </w:tcBorders>
+            <w:tcMar>
+              <w:top w:type="dxa" w:w="50"/>
+              <w:left w:type="dxa" w:w="80"/>
+              <w:bottom w:type="dxa" w:w="50"/>
+              <w:right w:type="dxa" w:w="80"/>
+            </w:tcMar>
+          </w:tcPr>
+          <w:p>
+            <w:pPr>
+              <w:spacing w:after="60" w:before="0"/>
+            </w:pPr>
+            <w:r>
+              <w:rPr>
+                <w:rFonts w:ascii="Arial" w:cs="Arial" w:eastAsia="Arial" w:hAnsi="Arial"/>
+                <w:sz w:val="17"/>
+                <w:szCs w:val="17"/>
+              </w:rPr>
+              <w:t xml:space="preserve">2.4 Trigonometry 1</w:t>
+            </w:r>
+          </w:p>
+        </w:tc>
+        <w:tc>
+          <w:tcPr>
+            <w:tcW w:type="dxa" w:w="3200"/>
+            <w:tcBorders>
+              <w:top w:val="single" w:color="999999" w:sz="4"/>
+              <w:left w:val="single" w:color="999999" w:sz="4"/>
+              <w:bottom w:val="single" w:color="999999" w:sz="4"/>
+              <w:right w:val="single" w:color="999999" w:sz="4"/>
+            </w:tcBorders>
+            <w:tcMar>
+              <w:top w:type="dxa" w:w="50"/>
+              <w:left w:type="dxa" w:w="80"/>
+              <w:bottom w:type="dxa" w:w="50"/>
+              <w:right w:type="dxa" w:w="80"/>
+            </w:tcMar>
+          </w:tcPr>
+          <w:p>
+            <w:pPr>
+              <w:spacing w:after="60" w:before="0"/>
+            </w:pPr>
+            <w:r>
+              <w:rPr>
+                <w:rFonts w:ascii="Arial" w:cs="Arial" w:eastAsia="Arial" w:hAnsi="Arial"/>
+                <w:sz w:val="17"/>
+                <w:szCs w:val="17"/>
+              </w:rPr>
+              <w:t xml:space="preserve">Final Explanation, rubric</w:t>
+            </w:r>
+          </w:p>
+        </w:tc>
+        <w:tc>
+          <w:tcPr>
+            <w:tcW w:type="dxa" w:w="6580"/>
+            <w:tcBorders>
+              <w:top w:val="single" w:color="999999" w:sz="4"/>
+              <w:left w:val="single" w:color="999999" w:sz="4"/>
+              <w:bottom w:val="single" w:color="999999" w:sz="4"/>
+              <w:right w:val="single" w:color="999999" w:sz="4"/>
+            </w:tcBorders>
+            <w:tcMar>
+              <w:top w:type="dxa" w:w="50"/>
+              <w:left w:type="dxa" w:w="80"/>
+              <w:bottom w:type="dxa" w:w="50"/>
+              <w:right w:type="dxa" w:w="80"/>
+            </w:tcMar>
+          </w:tcPr>
+          <w:p>
+            <w:pPr>
+              <w:spacing w:after="60" w:before="0"/>
+            </w:pPr>
+            <w:r>
+              <w:rPr>
+                <w:rFonts w:ascii="Arial" w:cs="Arial" w:eastAsia="Arial" w:hAnsi="Arial"/>
+                <w:sz w:val="17"/>
+                <w:szCs w:val="17"/>
+              </w:rPr>
+              <w:t xml:space="preserve">CBE has four levels: Exceeds, Meets, Approaches and Below Expectations. The data contract allows only three level fields per criterion (excellent, proficient, developing) and the printed headings are fixed by the template, so the Below Expectations level cannot be represented. Teachers could add it by hand (for example 'work not yet showing the Approaches descriptor') until the contract allows four levels.</w:t>
+            </w:r>
+          </w:p>
+        </w:tc>
+        <w:tc>
+          <w:tcPr>
+            <w:tcW w:type="dxa" w:w="1700"/>
+            <w:tcBorders>
+              <w:top w:val="single" w:color="999999" w:sz="4"/>
+              <w:left w:val="single" w:color="999999" w:sz="4"/>
+              <w:bottom w:val="single" w:color="999999" w:sz="4"/>
+              <w:right w:val="single" w:color="999999" w:sz="4"/>
+            </w:tcBorders>
+            <w:tcMar>
+              <w:top w:type="dxa" w:w="50"/>
+              <w:left w:type="dxa" w:w="80"/>
+              <w:bottom w:type="dxa" w:w="50"/>
+              <w:right w:type="dxa" w:w="80"/>
+            </w:tcMar>
+          </w:tcPr>
+          <w:p>
+            <w:pPr>
+              <w:spacing w:after="60" w:before="0"/>
+            </w:pPr>
+            <w:r>
+              <w:rPr>
+                <w:rFonts w:ascii="Arial" w:cs="Arial" w:eastAsia="Arial" w:hAnsi="Arial"/>
+                <w:sz w:val="17"/>
+                <w:szCs w:val="17"/>
+              </w:rPr>
+              <w:t xml:space="preserve">Journal_Core_Mathematics</w:t>
+            </w:r>
+          </w:p>
+        </w:tc>
+      </w:tr>
+      <w:tr>
+        <w:tc>
+          <w:tcPr>
+            <w:tcW w:type="dxa" w:w="2200"/>
+            <w:tcBorders>
+              <w:top w:val="single" w:color="999999" w:sz="4"/>
+              <w:left w:val="single" w:color="999999" w:sz="4"/>
+              <w:bottom w:val="single" w:color="999999" w:sz="4"/>
+              <w:right w:val="single" w:color="999999" w:sz="4"/>
+            </w:tcBorders>
+            <w:tcMar>
+              <w:top w:type="dxa" w:w="50"/>
+              <w:left w:type="dxa" w:w="80"/>
+              <w:bottom w:type="dxa" w:w="50"/>
+              <w:right w:type="dxa" w:w="80"/>
+            </w:tcMar>
+          </w:tcPr>
+          <w:p>
+            <w:pPr>
+              <w:spacing w:after="60" w:before="0"/>
+            </w:pPr>
+            <w:r>
+              <w:rPr>
+                <w:rFonts w:ascii="Arial" w:cs="Arial" w:eastAsia="Arial" w:hAnsi="Arial"/>
+                <w:sz w:val="17"/>
+                <w:szCs w:val="17"/>
+              </w:rPr>
+              <w:t xml:space="preserve">3.1 Turning Effect of Force</w:t>
+            </w:r>
+          </w:p>
+        </w:tc>
+        <w:tc>
+          <w:tcPr>
+            <w:tcW w:type="dxa" w:w="3200"/>
+            <w:tcBorders>
+              <w:top w:val="single" w:color="999999" w:sz="4"/>
+              <w:left w:val="single" w:color="999999" w:sz="4"/>
+              <w:bottom w:val="single" w:color="999999" w:sz="4"/>
+              <w:right w:val="single" w:color="999999" w:sz="4"/>
+            </w:tcBorders>
+            <w:tcMar>
+              <w:top w:type="dxa" w:w="50"/>
+              <w:left w:type="dxa" w:w="80"/>
+              <w:bottom w:type="dxa" w:w="50"/>
+              <w:right w:type="dxa" w:w="80"/>
+            </w:tcMar>
+          </w:tcPr>
+          <w:p>
+            <w:pPr>
+              <w:spacing w:after="60" w:before="0"/>
+            </w:pPr>
+            <w:r>
+              <w:rPr>
+                <w:rFonts w:ascii="Arial" w:cs="Arial" w:eastAsia="Arial" w:hAnsi="Arial"/>
+                <w:sz w:val="17"/>
+                <w:szCs w:val="17"/>
+              </w:rPr>
+              <w:t xml:space="preserve">Lesson 2, Observe Phase, teacherMoves</w:t>
+            </w:r>
+          </w:p>
+        </w:tc>
+        <w:tc>
+          <w:tcPr>
+            <w:tcW w:type="dxa" w:w="6580"/>
+            <w:tcBorders>
+              <w:top w:val="single" w:color="999999" w:sz="4"/>
+              <w:left w:val="single" w:color="999999" w:sz="4"/>
+              <w:bottom w:val="single" w:color="999999" w:sz="4"/>
+              <w:right w:val="single" w:color="999999" w:sz="4"/>
+            </w:tcBorders>
+            <w:tcMar>
+              <w:top w:type="dxa" w:w="50"/>
+              <w:left w:type="dxa" w:w="80"/>
+              <w:bottom w:type="dxa" w:w="50"/>
+              <w:right w:type="dxa" w:w="80"/>
+            </w:tcMar>
+          </w:tcPr>
+          <w:p>
+            <w:pPr>
+              <w:spacing w:after="60" w:before="0"/>
+            </w:pPr>
+            <w:r>
+              <w:rPr>
+                <w:rFonts w:ascii="Arial" w:cs="Arial" w:eastAsia="Arial" w:hAnsi="Arial"/>
+                <w:sz w:val="17"/>
+                <w:szCs w:val="17"/>
+              </w:rPr>
+              <w:t xml:space="preserve">Suggested change: Slotted masses are not in every partner school. The lesson only listed slotted masses; a low-cost substitute is now given. The teacher must decide which substitute their school actually has (bottles of water, packets of sugar or flour, stones weighed on a balance).</w:t>
+            </w:r>
+          </w:p>
+        </w:tc>
+        <w:tc>
+          <w:tcPr>
+            <w:tcW w:type="dxa" w:w="1700"/>
+            <w:tcBorders>
+              <w:top w:val="single" w:color="999999" w:sz="4"/>
+              <w:left w:val="single" w:color="999999" w:sz="4"/>
+              <w:bottom w:val="single" w:color="999999" w:sz="4"/>
+              <w:right w:val="single" w:color="999999" w:sz="4"/>
+            </w:tcBorders>
+            <w:tcMar>
+              <w:top w:type="dxa" w:w="50"/>
+              <w:left w:type="dxa" w:w="80"/>
+              <w:bottom w:type="dxa" w:w="50"/>
+              <w:right w:type="dxa" w:w="80"/>
+            </w:tcMar>
+          </w:tcPr>
+          <w:p>
+            <w:pPr>
+              <w:spacing w:after="60" w:before="0"/>
+            </w:pPr>
+            <w:r>
+              <w:rPr>
+                <w:rFonts w:ascii="Arial" w:cs="Arial" w:eastAsia="Arial" w:hAnsi="Arial"/>
+                <w:sz w:val="17"/>
+                <w:szCs w:val="17"/>
+              </w:rPr>
+              <w:t xml:space="preserve">Journal_General_Science</w:t>
+            </w:r>
+          </w:p>
+        </w:tc>
+      </w:tr>
+      <w:tr>
+        <w:tc>
+          <w:tcPr>
+            <w:tcW w:type="dxa" w:w="2200"/>
+            <w:tcBorders>
+              <w:top w:val="single" w:color="999999" w:sz="4"/>
+              <w:left w:val="single" w:color="999999" w:sz="4"/>
+              <w:bottom w:val="single" w:color="999999" w:sz="4"/>
+              <w:right w:val="single" w:color="999999" w:sz="4"/>
+            </w:tcBorders>
+            <w:tcMar>
+              <w:top w:type="dxa" w:w="50"/>
+              <w:left w:type="dxa" w:w="80"/>
+              <w:bottom w:type="dxa" w:w="50"/>
+              <w:right w:type="dxa" w:w="80"/>
+            </w:tcMar>
+          </w:tcPr>
+          <w:p>
+            <w:pPr>
+              <w:spacing w:after="60" w:before="0"/>
+            </w:pPr>
+            <w:r>
+              <w:rPr>
+                <w:rFonts w:ascii="Arial" w:cs="Arial" w:eastAsia="Arial" w:hAnsi="Arial"/>
+                <w:sz w:val="17"/>
+                <w:szCs w:val="17"/>
+              </w:rPr>
+              <w:t xml:space="preserve">3.1 Turning Effect of Force</w:t>
+            </w:r>
+          </w:p>
+        </w:tc>
+        <w:tc>
+          <w:tcPr>
+            <w:tcW w:type="dxa" w:w="3200"/>
+            <w:tcBorders>
+              <w:top w:val="single" w:color="999999" w:sz="4"/>
+              <w:left w:val="single" w:color="999999" w:sz="4"/>
+              <w:bottom w:val="single" w:color="999999" w:sz="4"/>
+              <w:right w:val="single" w:color="999999" w:sz="4"/>
+            </w:tcBorders>
+            <w:tcMar>
+              <w:top w:type="dxa" w:w="50"/>
+              <w:left w:type="dxa" w:w="80"/>
+              <w:bottom w:type="dxa" w:w="50"/>
+              <w:right w:type="dxa" w:w="80"/>
+            </w:tcMar>
+          </w:tcPr>
+          <w:p>
+            <w:pPr>
+              <w:spacing w:after="60" w:before="0"/>
+            </w:pPr>
+            <w:r>
+              <w:rPr>
+                <w:rFonts w:ascii="Arial" w:cs="Arial" w:eastAsia="Arial" w:hAnsi="Arial"/>
+                <w:sz w:val="17"/>
+                <w:szCs w:val="17"/>
+              </w:rPr>
+              <w:t xml:space="preserve">Lesson 3, Explain Phase, teacherMoves</w:t>
+            </w:r>
+          </w:p>
+        </w:tc>
+        <w:tc>
+          <w:tcPr>
+            <w:tcW w:type="dxa" w:w="6580"/>
+            <w:tcBorders>
+              <w:top w:val="single" w:color="999999" w:sz="4"/>
+              <w:left w:val="single" w:color="999999" w:sz="4"/>
+              <w:bottom w:val="single" w:color="999999" w:sz="4"/>
+              <w:right w:val="single" w:color="999999" w:sz="4"/>
+            </w:tcBorders>
+            <w:tcMar>
+              <w:top w:type="dxa" w:w="50"/>
+              <w:left w:type="dxa" w:w="80"/>
+              <w:bottom w:type="dxa" w:w="50"/>
+              <w:right w:type="dxa" w:w="80"/>
+            </w:tcMar>
+          </w:tcPr>
+          <w:p>
+            <w:pPr>
+              <w:spacing w:after="60" w:before="0"/>
+            </w:pPr>
+            <w:r>
+              <w:rPr>
+                <w:rFonts w:ascii="Arial" w:cs="Arial" w:eastAsia="Arial" w:hAnsi="Arial"/>
+                <w:sz w:val="17"/>
+                <w:szCs w:val="17"/>
+              </w:rPr>
+              <w:t xml:space="preserve">Suggested change: No Kiswahili or English-learner support appeared anywhere in the sequence. A short, optional support was added where the key words are first written down. The teacher must decide the Kiswahili terms: they are everyday words, but KICD or the school's Kiswahili teacher may prefer other physics terms.</w:t>
+            </w:r>
+          </w:p>
+        </w:tc>
+        <w:tc>
+          <w:tcPr>
+            <w:tcW w:type="dxa" w:w="1700"/>
+            <w:tcBorders>
+              <w:top w:val="single" w:color="999999" w:sz="4"/>
+              <w:left w:val="single" w:color="999999" w:sz="4"/>
+              <w:bottom w:val="single" w:color="999999" w:sz="4"/>
+              <w:right w:val="single" w:color="999999" w:sz="4"/>
+            </w:tcBorders>
+            <w:tcMar>
+              <w:top w:type="dxa" w:w="50"/>
+              <w:left w:type="dxa" w:w="80"/>
+              <w:bottom w:type="dxa" w:w="50"/>
+              <w:right w:type="dxa" w:w="80"/>
+            </w:tcMar>
+          </w:tcPr>
+          <w:p>
+            <w:pPr>
+              <w:spacing w:after="60" w:before="0"/>
+            </w:pPr>
+            <w:r>
+              <w:rPr>
+                <w:rFonts w:ascii="Arial" w:cs="Arial" w:eastAsia="Arial" w:hAnsi="Arial"/>
+                <w:sz w:val="17"/>
+                <w:szCs w:val="17"/>
+              </w:rPr>
+              <w:t xml:space="preserve">Journal_General_Science</w:t>
+            </w:r>
+          </w:p>
+        </w:tc>
+      </w:tr>
+      <w:tr>
+        <w:tc>
+          <w:tcPr>
+            <w:tcW w:type="dxa" w:w="2200"/>
+            <w:tcBorders>
+              <w:top w:val="single" w:color="999999" w:sz="4"/>
+              <w:left w:val="single" w:color="999999" w:sz="4"/>
+              <w:bottom w:val="single" w:color="999999" w:sz="4"/>
+              <w:right w:val="single" w:color="999999" w:sz="4"/>
+            </w:tcBorders>
+            <w:tcMar>
+              <w:top w:type="dxa" w:w="50"/>
+              <w:left w:type="dxa" w:w="80"/>
+              <w:bottom w:type="dxa" w:w="50"/>
+              <w:right w:type="dxa" w:w="80"/>
+            </w:tcMar>
+          </w:tcPr>
+          <w:p>
+            <w:pPr>
+              <w:spacing w:after="60" w:before="0"/>
+            </w:pPr>
+            <w:r>
+              <w:rPr>
+                <w:rFonts w:ascii="Arial" w:cs="Arial" w:eastAsia="Arial" w:hAnsi="Arial"/>
+                <w:sz w:val="17"/>
+                <w:szCs w:val="17"/>
+              </w:rPr>
+              <w:t xml:space="preserve">3.1 Turning Effect of Force</w:t>
+            </w:r>
+          </w:p>
+        </w:tc>
+        <w:tc>
+          <w:tcPr>
+            <w:tcW w:type="dxa" w:w="3200"/>
+            <w:tcBorders>
+              <w:top w:val="single" w:color="999999" w:sz="4"/>
+              <w:left w:val="single" w:color="999999" w:sz="4"/>
+              <w:bottom w:val="single" w:color="999999" w:sz="4"/>
+              <w:right w:val="single" w:color="999999" w:sz="4"/>
+            </w:tcBorders>
+            <w:tcMar>
+              <w:top w:type="dxa" w:w="50"/>
+              <w:left w:type="dxa" w:w="80"/>
+              <w:bottom w:type="dxa" w:w="50"/>
+              <w:right w:type="dxa" w:w="80"/>
+            </w:tcMar>
+          </w:tcPr>
+          <w:p>
+            <w:pPr>
+              <w:spacing w:after="60" w:before="0"/>
+            </w:pPr>
+            <w:r>
+              <w:rPr>
+                <w:rFonts w:ascii="Arial" w:cs="Arial" w:eastAsia="Arial" w:hAnsi="Arial"/>
+                <w:sz w:val="17"/>
+                <w:szCs w:val="17"/>
+              </w:rPr>
+              <w:t xml:space="preserve">Lesson 4, slo.purpose (+18 related)</w:t>
+            </w:r>
+          </w:p>
+        </w:tc>
+        <w:tc>
+          <w:tcPr>
+            <w:tcW w:type="dxa" w:w="6580"/>
+            <w:tcBorders>
+              <w:top w:val="single" w:color="999999" w:sz="4"/>
+              <w:left w:val="single" w:color="999999" w:sz="4"/>
+              <w:bottom w:val="single" w:color="999999" w:sz="4"/>
+              <w:right w:val="single" w:color="999999" w:sz="4"/>
+            </w:tcBorders>
+            <w:tcMar>
+              <w:top w:type="dxa" w:w="50"/>
+              <w:left w:type="dxa" w:w="80"/>
+              <w:bottom w:type="dxa" w:w="50"/>
+              <w:right w:type="dxa" w:w="80"/>
+            </w:tcMar>
+          </w:tcPr>
+          <w:p>
+            <w:pPr>
+              <w:spacing w:after="60" w:before="0"/>
+            </w:pPr>
+            <w:r>
+              <w:rPr>
+                <w:rFonts w:ascii="Arial" w:cs="Arial" w:eastAsia="Arial" w:hAnsi="Arial"/>
+                <w:sz w:val="17"/>
+                <w:szCs w:val="17"/>
+              </w:rPr>
+              <w:t xml:space="preserve">Suggested change: Lesson 4 said the two-handed jembe grip is a couple that explains handle length, mixing up 'distance between the forces' with 'distance from the pivot'; the jembe stays a single-force moment about the blade and the couple is taught on a steering wheel, tap and wrench. Audit item confirmed. The lesson said the two-handed jembe grip is a couple and that widening the grip explains the handle-length puzzle. That mixes up two different distances: for the jembe, d is the distance from the blade pivot to the single effort force (M = F x d, Lessons 2-3); for a couple, d is the distance BETWEEN the two forces. The distance between the farmer's hands does not change the jembe's moment about the blade (a grip 0.9 m from the blade gives M = F x 0.9 however far apart the hands are). The jembe therefore stays a single-force moment, and the couple is now taught on objects that really turn about their own centre. Lesson 5 and the Final Explanation now say the same. Teacher to confirm this reading of the storyline.</w:t>
+            </w:r>
+          </w:p>
+        </w:tc>
+        <w:tc>
+          <w:tcPr>
+            <w:tcW w:type="dxa" w:w="1700"/>
+            <w:tcBorders>
+              <w:top w:val="single" w:color="999999" w:sz="4"/>
+              <w:left w:val="single" w:color="999999" w:sz="4"/>
+              <w:bottom w:val="single" w:color="999999" w:sz="4"/>
+              <w:right w:val="single" w:color="999999" w:sz="4"/>
+            </w:tcBorders>
+            <w:tcMar>
+              <w:top w:type="dxa" w:w="50"/>
+              <w:left w:type="dxa" w:w="80"/>
+              <w:bottom w:type="dxa" w:w="50"/>
+              <w:right w:type="dxa" w:w="80"/>
+            </w:tcMar>
+          </w:tcPr>
+          <w:p>
+            <w:pPr>
+              <w:spacing w:after="60" w:before="0"/>
+            </w:pPr>
+            <w:r>
+              <w:rPr>
+                <w:rFonts w:ascii="Arial" w:cs="Arial" w:eastAsia="Arial" w:hAnsi="Arial"/>
+                <w:sz w:val="17"/>
+                <w:szCs w:val="17"/>
+              </w:rPr>
+              <w:t xml:space="preserve">Journal_General_Science</w:t>
+            </w:r>
+          </w:p>
+        </w:tc>
+      </w:tr>
+      <w:tr>
+        <w:tc>
+          <w:tcPr>
+            <w:tcW w:type="dxa" w:w="2200"/>
+            <w:tcBorders>
+              <w:top w:val="single" w:color="999999" w:sz="4"/>
+              <w:left w:val="single" w:color="999999" w:sz="4"/>
+              <w:bottom w:val="single" w:color="999999" w:sz="4"/>
+              <w:right w:val="single" w:color="999999" w:sz="4"/>
+            </w:tcBorders>
+            <w:tcMar>
+              <w:top w:type="dxa" w:w="50"/>
+              <w:left w:type="dxa" w:w="80"/>
+              <w:bottom w:type="dxa" w:w="50"/>
+              <w:right w:type="dxa" w:w="80"/>
+            </w:tcMar>
+          </w:tcPr>
+          <w:p>
+            <w:pPr>
+              <w:spacing w:after="60" w:before="0"/>
+            </w:pPr>
+            <w:r>
+              <w:rPr>
+                <w:rFonts w:ascii="Arial" w:cs="Arial" w:eastAsia="Arial" w:hAnsi="Arial"/>
+                <w:sz w:val="17"/>
+                <w:szCs w:val="17"/>
+              </w:rPr>
+              <w:t xml:space="preserve">3.1 Turning Effect of Force</w:t>
+            </w:r>
+          </w:p>
+        </w:tc>
+        <w:tc>
+          <w:tcPr>
+            <w:tcW w:type="dxa" w:w="3200"/>
+            <w:tcBorders>
+              <w:top w:val="single" w:color="999999" w:sz="4"/>
+              <w:left w:val="single" w:color="999999" w:sz="4"/>
+              <w:bottom w:val="single" w:color="999999" w:sz="4"/>
+              <w:right w:val="single" w:color="999999" w:sz="4"/>
+            </w:tcBorders>
+            <w:tcMar>
+              <w:top w:type="dxa" w:w="50"/>
+              <w:left w:type="dxa" w:w="80"/>
+              <w:bottom w:type="dxa" w:w="50"/>
+              <w:right w:type="dxa" w:w="80"/>
+            </w:tcMar>
+          </w:tcPr>
+          <w:p>
+            <w:pPr>
+              <w:spacing w:after="60" w:before="0"/>
+            </w:pPr>
+            <w:r>
+              <w:rPr>
+                <w:rFonts w:ascii="Arial" w:cs="Arial" w:eastAsia="Arial" w:hAnsi="Arial"/>
+                <w:sz w:val="17"/>
+                <w:szCs w:val="17"/>
+              </w:rPr>
+              <w:t xml:space="preserve">Lesson 4, Observe Phase, teacherMoves</w:t>
+            </w:r>
+          </w:p>
+        </w:tc>
+        <w:tc>
+          <w:tcPr>
+            <w:tcW w:type="dxa" w:w="6580"/>
+            <w:tcBorders>
+              <w:top w:val="single" w:color="999999" w:sz="4"/>
+              <w:left w:val="single" w:color="999999" w:sz="4"/>
+              <w:bottom w:val="single" w:color="999999" w:sz="4"/>
+              <w:right w:val="single" w:color="999999" w:sz="4"/>
+            </w:tcBorders>
+            <w:tcMar>
+              <w:top w:type="dxa" w:w="50"/>
+              <w:left w:type="dxa" w:w="80"/>
+              <w:bottom w:type="dxa" w:w="50"/>
+              <w:right w:type="dxa" w:w="80"/>
+            </w:tcMar>
+          </w:tcPr>
+          <w:p>
+            <w:pPr>
+              <w:spacing w:after="60" w:before="0"/>
+            </w:pPr>
+            <w:r>
+              <w:rPr>
+                <w:rFonts w:ascii="Arial" w:cs="Arial" w:eastAsia="Arial" w:hAnsi="Arial"/>
+                <w:sz w:val="17"/>
+                <w:szCs w:val="17"/>
+              </w:rPr>
+              <w:t xml:space="preserve">Suggested change: Clamp stands and two spring balances per group are not available in every partner school. The teacher must decide whether this qualitative substitute suits the school's equipment.</w:t>
+            </w:r>
+          </w:p>
+        </w:tc>
+        <w:tc>
+          <w:tcPr>
+            <w:tcW w:type="dxa" w:w="1700"/>
+            <w:tcBorders>
+              <w:top w:val="single" w:color="999999" w:sz="4"/>
+              <w:left w:val="single" w:color="999999" w:sz="4"/>
+              <w:bottom w:val="single" w:color="999999" w:sz="4"/>
+              <w:right w:val="single" w:color="999999" w:sz="4"/>
+            </w:tcBorders>
+            <w:tcMar>
+              <w:top w:type="dxa" w:w="50"/>
+              <w:left w:type="dxa" w:w="80"/>
+              <w:bottom w:type="dxa" w:w="50"/>
+              <w:right w:type="dxa" w:w="80"/>
+            </w:tcMar>
+          </w:tcPr>
+          <w:p>
+            <w:pPr>
+              <w:spacing w:after="60" w:before="0"/>
+            </w:pPr>
+            <w:r>
+              <w:rPr>
+                <w:rFonts w:ascii="Arial" w:cs="Arial" w:eastAsia="Arial" w:hAnsi="Arial"/>
+                <w:sz w:val="17"/>
+                <w:szCs w:val="17"/>
+              </w:rPr>
+              <w:t xml:space="preserve">Journal_General_Science</w:t>
+            </w:r>
+          </w:p>
+        </w:tc>
+      </w:tr>
+      <w:tr>
+        <w:tc>
+          <w:tcPr>
+            <w:tcW w:type="dxa" w:w="2200"/>
+            <w:tcBorders>
+              <w:top w:val="single" w:color="999999" w:sz="4"/>
+              <w:left w:val="single" w:color="999999" w:sz="4"/>
+              <w:bottom w:val="single" w:color="999999" w:sz="4"/>
+              <w:right w:val="single" w:color="999999" w:sz="4"/>
+            </w:tcBorders>
+            <w:tcMar>
+              <w:top w:type="dxa" w:w="50"/>
+              <w:left w:type="dxa" w:w="80"/>
+              <w:bottom w:type="dxa" w:w="50"/>
+              <w:right w:type="dxa" w:w="80"/>
+            </w:tcMar>
+          </w:tcPr>
+          <w:p>
+            <w:pPr>
+              <w:spacing w:after="60" w:before="0"/>
+            </w:pPr>
+            <w:r>
+              <w:rPr>
+                <w:rFonts w:ascii="Arial" w:cs="Arial" w:eastAsia="Arial" w:hAnsi="Arial"/>
+                <w:sz w:val="17"/>
+                <w:szCs w:val="17"/>
+              </w:rPr>
+              <w:t xml:space="preserve">3.1 Turning Effect of Force</w:t>
+            </w:r>
+          </w:p>
+        </w:tc>
+        <w:tc>
+          <w:tcPr>
+            <w:tcW w:type="dxa" w:w="3200"/>
+            <w:tcBorders>
+              <w:top w:val="single" w:color="999999" w:sz="4"/>
+              <w:left w:val="single" w:color="999999" w:sz="4"/>
+              <w:bottom w:val="single" w:color="999999" w:sz="4"/>
+              <w:right w:val="single" w:color="999999" w:sz="4"/>
+            </w:tcBorders>
+            <w:tcMar>
+              <w:top w:type="dxa" w:w="50"/>
+              <w:left w:type="dxa" w:w="80"/>
+              <w:bottom w:type="dxa" w:w="50"/>
+              <w:right w:type="dxa" w:w="80"/>
+            </w:tcMar>
+          </w:tcPr>
+          <w:p>
+            <w:pPr>
+              <w:spacing w:after="60" w:before="0"/>
+            </w:pPr>
+            <w:r>
+              <w:rPr>
+                <w:rFonts w:ascii="Arial" w:cs="Arial" w:eastAsia="Arial" w:hAnsi="Arial"/>
+                <w:sz w:val="17"/>
+                <w:szCs w:val="17"/>
+              </w:rPr>
+              <w:t xml:space="preserve">Lesson 8, Explain Phase, learnerExperience (+1 related)</w:t>
+            </w:r>
+          </w:p>
+        </w:tc>
+        <w:tc>
+          <w:tcPr>
+            <w:tcW w:type="dxa" w:w="6580"/>
+            <w:tcBorders>
+              <w:top w:val="single" w:color="999999" w:sz="4"/>
+              <w:left w:val="single" w:color="999999" w:sz="4"/>
+              <w:bottom w:val="single" w:color="999999" w:sz="4"/>
+              <w:right w:val="single" w:color="999999" w:sz="4"/>
+            </w:tcBorders>
+            <w:tcMar>
+              <w:top w:type="dxa" w:w="50"/>
+              <w:left w:type="dxa" w:w="80"/>
+              <w:bottom w:type="dxa" w:w="50"/>
+              <w:right w:type="dxa" w:w="80"/>
+            </w:tcMar>
+          </w:tcPr>
+          <w:p>
+            <w:pPr>
+              <w:spacing w:after="60" w:before="0"/>
+            </w:pPr>
+            <w:r>
+              <w:rPr>
+                <w:rFonts w:ascii="Arial" w:cs="Arial" w:eastAsia="Arial" w:hAnsi="Arial"/>
+                <w:sz w:val="17"/>
+                <w:szCs w:val="17"/>
+              </w:rPr>
+              <w:t xml:space="preserve">Suggested change: Assessing every learner one by one on the metre rule in 15 minutes was impossible for 40 learners (under 40 seconds each); now groups of four or five at stations, each member answering one question. As written, the teacher called learners one at a time to ONE bench for 15 minutes; with 40 learners that is under 40 seconds each for three questions with 10-second waits, and the teacher notes themselves contradicted it (8 stations prepared, 'two simultaneous stations' for 40 learners). Groups of 4-5 at 8 stations with 2 minutes per group fits 15 minutes (8 x 2 = 16, about 15 with rounding) and still gives every learner an individual question. The teacher must decide whether to assess in groups like this or to assess the practical over several lessons.</w:t>
+            </w:r>
+          </w:p>
+        </w:tc>
+        <w:tc>
+          <w:tcPr>
+            <w:tcW w:type="dxa" w:w="1700"/>
+            <w:tcBorders>
+              <w:top w:val="single" w:color="999999" w:sz="4"/>
+              <w:left w:val="single" w:color="999999" w:sz="4"/>
+              <w:bottom w:val="single" w:color="999999" w:sz="4"/>
+              <w:right w:val="single" w:color="999999" w:sz="4"/>
+            </w:tcBorders>
+            <w:tcMar>
+              <w:top w:type="dxa" w:w="50"/>
+              <w:left w:type="dxa" w:w="80"/>
+              <w:bottom w:type="dxa" w:w="50"/>
+              <w:right w:type="dxa" w:w="80"/>
+            </w:tcMar>
+          </w:tcPr>
+          <w:p>
+            <w:pPr>
+              <w:spacing w:after="60" w:before="0"/>
+            </w:pPr>
+            <w:r>
+              <w:rPr>
+                <w:rFonts w:ascii="Arial" w:cs="Arial" w:eastAsia="Arial" w:hAnsi="Arial"/>
+                <w:sz w:val="17"/>
+                <w:szCs w:val="17"/>
+              </w:rPr>
+              <w:t xml:space="preserve">Journal_General_Science</w:t>
+            </w:r>
+          </w:p>
+        </w:tc>
+      </w:tr>
+      <w:tr>
+        <w:tc>
+          <w:tcPr>
+            <w:tcW w:type="dxa" w:w="2200"/>
+            <w:tcBorders>
+              <w:top w:val="single" w:color="999999" w:sz="4"/>
+              <w:left w:val="single" w:color="999999" w:sz="4"/>
+              <w:bottom w:val="single" w:color="999999" w:sz="4"/>
+              <w:right w:val="single" w:color="999999" w:sz="4"/>
+            </w:tcBorders>
+            <w:tcMar>
+              <w:top w:type="dxa" w:w="50"/>
+              <w:left w:type="dxa" w:w="80"/>
+              <w:bottom w:type="dxa" w:w="50"/>
+              <w:right w:type="dxa" w:w="80"/>
+            </w:tcMar>
+          </w:tcPr>
+          <w:p>
+            <w:pPr>
+              <w:spacing w:after="60" w:before="0"/>
+            </w:pPr>
+            <w:r>
+              <w:rPr>
+                <w:rFonts w:ascii="Arial" w:cs="Arial" w:eastAsia="Arial" w:hAnsi="Arial"/>
+                <w:sz w:val="17"/>
+                <w:szCs w:val="17"/>
+              </w:rPr>
+              <w:t xml:space="preserve">3.1 Turning Effect of Force</w:t>
+            </w:r>
+          </w:p>
+        </w:tc>
+        <w:tc>
+          <w:tcPr>
+            <w:tcW w:type="dxa" w:w="3200"/>
+            <w:tcBorders>
+              <w:top w:val="single" w:color="999999" w:sz="4"/>
+              <w:left w:val="single" w:color="999999" w:sz="4"/>
+              <w:bottom w:val="single" w:color="999999" w:sz="4"/>
+              <w:right w:val="single" w:color="999999" w:sz="4"/>
+            </w:tcBorders>
+            <w:tcMar>
+              <w:top w:type="dxa" w:w="50"/>
+              <w:left w:type="dxa" w:w="80"/>
+              <w:bottom w:type="dxa" w:w="50"/>
+              <w:right w:type="dxa" w:w="80"/>
+            </w:tcMar>
+          </w:tcPr>
+          <w:p>
+            <w:pPr>
+              <w:spacing w:after="60" w:before="0"/>
+            </w:pPr>
+            <w:r>
+              <w:rPr>
+                <w:rFonts w:ascii="Arial" w:cs="Arial" w:eastAsia="Arial" w:hAnsi="Arial"/>
+                <w:sz w:val="17"/>
+                <w:szCs w:val="17"/>
+              </w:rPr>
+              <w:t xml:space="preserve">Unit overview, learningOutcomes</w:t>
+            </w:r>
+          </w:p>
+        </w:tc>
+        <w:tc>
+          <w:tcPr>
+            <w:tcW w:type="dxa" w:w="6580"/>
+            <w:tcBorders>
+              <w:top w:val="single" w:color="999999" w:sz="4"/>
+              <w:left w:val="single" w:color="999999" w:sz="4"/>
+              <w:bottom w:val="single" w:color="999999" w:sz="4"/>
+              <w:right w:val="single" w:color="999999" w:sz="4"/>
+            </w:tcBorders>
+            <w:tcMar>
+              <w:top w:type="dxa" w:w="50"/>
+              <w:left w:type="dxa" w:w="80"/>
+              <w:bottom w:type="dxa" w:w="50"/>
+              <w:right w:type="dxa" w:w="80"/>
+            </w:tcMar>
+          </w:tcPr>
+          <w:p>
+            <w:pPr>
+              <w:spacing w:after="60" w:before="0"/>
+            </w:pPr>
+            <w:r>
+              <w:rPr>
+                <w:rFonts w:ascii="Arial" w:cs="Arial" w:eastAsia="Arial" w:hAnsi="Arial"/>
+                <w:sz w:val="17"/>
+                <w:szCs w:val="17"/>
+              </w:rPr>
+              <w:t xml:space="preserve">KICD wording check: the Grade 10 KICD PDFs available in data/raw/curriculum_pdfs/ cover Biology, Chemistry, Mathematics and Physics only. General Science Strand 3.0, Sub-Strand 3.1 'Turning Effect of Force' is not in them (the closest text, Physics 1.5 'Moments and equilibrium', is a different sub-strand with different outcomes), so the learning outcomes (a-d), key inquiry question, core competencies, values and PCIs could not be compared word for word and were left unchanged. Please check them against the KICD General Science Grade 10 curriculum design. Coverage check done: outcome a (moments of a force at a point) is taught in Lessons 2-3 and assessed in Final Explanation Parts 1-3; outcome b (moments of anti-parallel forces) is taught in Lessons 4-5 and assessed in Part 3 and Part 4 (a calculation was added); outcome c (real-life applications) is taught in Lessons 6-7 and assessed in Part 5; outcome d (appreciate) is observed in the Lesson 8 reflection journal.</w:t>
+            </w:r>
+          </w:p>
+        </w:tc>
+        <w:tc>
+          <w:tcPr>
+            <w:tcW w:type="dxa" w:w="1700"/>
+            <w:tcBorders>
+              <w:top w:val="single" w:color="999999" w:sz="4"/>
+              <w:left w:val="single" w:color="999999" w:sz="4"/>
+              <w:bottom w:val="single" w:color="999999" w:sz="4"/>
+              <w:right w:val="single" w:color="999999" w:sz="4"/>
+            </w:tcBorders>
+            <w:tcMar>
+              <w:top w:type="dxa" w:w="50"/>
+              <w:left w:type="dxa" w:w="80"/>
+              <w:bottom w:type="dxa" w:w="50"/>
+              <w:right w:type="dxa" w:w="80"/>
+            </w:tcMar>
+          </w:tcPr>
+          <w:p>
+            <w:pPr>
+              <w:spacing w:after="60" w:before="0"/>
+            </w:pPr>
+            <w:r>
+              <w:rPr>
+                <w:rFonts w:ascii="Arial" w:cs="Arial" w:eastAsia="Arial" w:hAnsi="Arial"/>
+                <w:sz w:val="17"/>
+                <w:szCs w:val="17"/>
+              </w:rPr>
+              <w:t xml:space="preserve">Journal_General_Science</w:t>
+            </w:r>
+          </w:p>
+        </w:tc>
+      </w:tr>
+      <w:tr>
+        <w:tc>
+          <w:tcPr>
+            <w:tcW w:type="dxa" w:w="2200"/>
+            <w:tcBorders>
+              <w:top w:val="single" w:color="999999" w:sz="4"/>
+              <w:left w:val="single" w:color="999999" w:sz="4"/>
+              <w:bottom w:val="single" w:color="999999" w:sz="4"/>
+              <w:right w:val="single" w:color="999999" w:sz="4"/>
+            </w:tcBorders>
+            <w:tcMar>
+              <w:top w:type="dxa" w:w="50"/>
+              <w:left w:type="dxa" w:w="80"/>
+              <w:bottom w:type="dxa" w:w="50"/>
+              <w:right w:type="dxa" w:w="80"/>
+            </w:tcMar>
+          </w:tcPr>
+          <w:p>
+            <w:pPr>
+              <w:spacing w:after="60" w:before="0"/>
+            </w:pPr>
+            <w:r>
+              <w:rPr>
+                <w:rFonts w:ascii="Arial" w:cs="Arial" w:eastAsia="Arial" w:hAnsi="Arial"/>
+                <w:sz w:val="17"/>
+                <w:szCs w:val="17"/>
+              </w:rPr>
+              <w:t xml:space="preserve">3.1 Turning Effect of Force</w:t>
+            </w:r>
+          </w:p>
+        </w:tc>
+        <w:tc>
+          <w:tcPr>
+            <w:tcW w:type="dxa" w:w="3200"/>
+            <w:tcBorders>
+              <w:top w:val="single" w:color="999999" w:sz="4"/>
+              <w:left w:val="single" w:color="999999" w:sz="4"/>
+              <w:bottom w:val="single" w:color="999999" w:sz="4"/>
+              <w:right w:val="single" w:color="999999" w:sz="4"/>
+            </w:tcBorders>
+            <w:tcMar>
+              <w:top w:type="dxa" w:w="50"/>
+              <w:left w:type="dxa" w:w="80"/>
+              <w:bottom w:type="dxa" w:w="50"/>
+              <w:right w:type="dxa" w:w="80"/>
+            </w:tcMar>
+          </w:tcPr>
+          <w:p>
+            <w:pPr>
+              <w:spacing w:after="60" w:before="0"/>
+            </w:pPr>
+            <w:r>
+              <w:rPr>
+                <w:rFonts w:ascii="Arial" w:cs="Arial" w:eastAsia="Arial" w:hAnsi="Arial"/>
+                <w:sz w:val="17"/>
+                <w:szCs w:val="17"/>
+              </w:rPr>
+              <w:t xml:space="preserve">Final Explanation, rubric</w:t>
+            </w:r>
+          </w:p>
+        </w:tc>
+        <w:tc>
+          <w:tcPr>
+            <w:tcW w:type="dxa" w:w="6580"/>
+            <w:tcBorders>
+              <w:top w:val="single" w:color="999999" w:sz="4"/>
+              <w:left w:val="single" w:color="999999" w:sz="4"/>
+              <w:bottom w:val="single" w:color="999999" w:sz="4"/>
+              <w:right w:val="single" w:color="999999" w:sz="4"/>
+            </w:tcBorders>
+            <w:tcMar>
+              <w:top w:type="dxa" w:w="50"/>
+              <w:left w:type="dxa" w:w="80"/>
+              <w:bottom w:type="dxa" w:w="50"/>
+              <w:right w:type="dxa" w:w="80"/>
+            </w:tcMar>
+          </w:tcPr>
+          <w:p>
+            <w:pPr>
+              <w:spacing w:after="60" w:before="0"/>
+            </w:pPr>
+            <w:r>
+              <w:rPr>
+                <w:rFonts w:ascii="Arial" w:cs="Arial" w:eastAsia="Arial" w:hAnsi="Arial"/>
+                <w:sz w:val="17"/>
+                <w:szCs w:val="17"/>
+              </w:rPr>
+              <w:t xml:space="preserve">The contract allows only three level fields (excellent, proficient, developing) and the printed headings are fixed by the template, so the fourth CBE level, Below Expectations, cannot be represented. Suggestion for teachers: add a 'Below Expectations' column by hand when marking, for a learner who cannot calculate any moment or link force, distance and turning effect. The template or contract needs a decision from the project owner.</w:t>
+            </w:r>
+          </w:p>
+        </w:tc>
+        <w:tc>
+          <w:tcPr>
+            <w:tcW w:type="dxa" w:w="1700"/>
+            <w:tcBorders>
+              <w:top w:val="single" w:color="999999" w:sz="4"/>
+              <w:left w:val="single" w:color="999999" w:sz="4"/>
+              <w:bottom w:val="single" w:color="999999" w:sz="4"/>
+              <w:right w:val="single" w:color="999999" w:sz="4"/>
+            </w:tcBorders>
+            <w:tcMar>
+              <w:top w:type="dxa" w:w="50"/>
+              <w:left w:type="dxa" w:w="80"/>
+              <w:bottom w:type="dxa" w:w="50"/>
+              <w:right w:type="dxa" w:w="80"/>
+            </w:tcMar>
+          </w:tcPr>
+          <w:p>
+            <w:pPr>
+              <w:spacing w:after="60" w:before="0"/>
+            </w:pPr>
+            <w:r>
+              <w:rPr>
+                <w:rFonts w:ascii="Arial" w:cs="Arial" w:eastAsia="Arial" w:hAnsi="Arial"/>
+                <w:sz w:val="17"/>
+                <w:szCs w:val="17"/>
+              </w:rPr>
+              <w:t xml:space="preserve">Journal_General_Science</w:t>
+            </w:r>
+          </w:p>
+        </w:tc>
+      </w:tr>
+      <w:tr>
+        <w:tc>
+          <w:tcPr>
+            <w:tcW w:type="dxa" w:w="2200"/>
+            <w:tcBorders>
+              <w:top w:val="single" w:color="999999" w:sz="4"/>
+              <w:left w:val="single" w:color="999999" w:sz="4"/>
+              <w:bottom w:val="single" w:color="999999" w:sz="4"/>
+              <w:right w:val="single" w:color="999999" w:sz="4"/>
+            </w:tcBorders>
+            <w:tcMar>
+              <w:top w:type="dxa" w:w="50"/>
+              <w:left w:type="dxa" w:w="80"/>
+              <w:bottom w:type="dxa" w:w="50"/>
+              <w:right w:type="dxa" w:w="80"/>
+            </w:tcMar>
+          </w:tcPr>
+          <w:p>
+            <w:pPr>
+              <w:spacing w:after="60" w:before="0"/>
+            </w:pPr>
+            <w:r>
+              <w:rPr>
+                <w:rFonts w:ascii="Arial" w:cs="Arial" w:eastAsia="Arial" w:hAnsi="Arial"/>
+                <w:sz w:val="17"/>
+                <w:szCs w:val="17"/>
+              </w:rPr>
               <w:t xml:space="preserve">2.4 Surface Area and Volume of Solids</w:t>
             </w:r>
           </w:p>
@@ -17746,6 +20002,738 @@
                 <w:sz w:val="17"/>
                 <w:szCs w:val="17"/>
               </w:rPr>
+              <w:t xml:space="preserve">Unit overview, phenomenon (+48 related)</w:t>
+            </w:r>
+          </w:p>
+        </w:tc>
+        <w:tc>
+          <w:tcPr>
+            <w:tcW w:type="dxa" w:w="6580"/>
+            <w:tcBorders>
+              <w:top w:val="single" w:color="999999" w:sz="4"/>
+              <w:left w:val="single" w:color="999999" w:sz="4"/>
+              <w:bottom w:val="single" w:color="999999" w:sz="4"/>
+              <w:right w:val="single" w:color="999999" w:sz="4"/>
+            </w:tcBorders>
+            <w:tcMar>
+              <w:top w:type="dxa" w:w="50"/>
+              <w:left w:type="dxa" w:w="80"/>
+              <w:bottom w:type="dxa" w:w="50"/>
+              <w:right w:type="dxa" w:w="80"/>
+            </w:tcMar>
+          </w:tcPr>
+          <w:p>
+            <w:pPr>
+              <w:spacing w:after="60" w:before="0"/>
+            </w:pPr>
+            <w:r>
+              <w:rPr>
+                <w:rFonts w:ascii="Arial" w:cs="Arial" w:eastAsia="Arial" w:hAnsi="Arial"/>
+                <w:sz w:val="17"/>
+                <w:szCs w:val="17"/>
+              </w:rPr>
+              <w:t xml:space="preserve">Suggested change: The two tanks did not add up: the frustum tank held only 1,300-3,300 L in the lessons and the composite tank had different sizes in Lessons 5, 6 and 10. One pair of tanks (both about 5,000 L, frustum about 4% less metal) is now used in every lesson.. Old data: the frustum tank in Lesson 3 (R 0.8, r 0.4, l 1.2 m) holds only about 1.3 m3 and in Lesson 7 (R 0.9, r 0.5, h 2.1 m) 3.3 m3, never 5,000 L; the composite tank was r 0.8, h 2.0 m in Lesson 5 but r 0.7, h 2.8 m in Lesson 6; Lesson 10 used a third set. I also searched by computer all closed frustums of volume 5 m3: the smallest total surface is about 16.19 m2, so a saving of 9 m2 (old text) is impossible against any sensibly shaped composite tank. New common data. Composite: cylinder r 0.7 m, h 2.8 m plus hemisphere r 0.7 m: V = pi(0.49x2.8 + 2/3x0.343) = 5.029 m3 (5,030 L); SA = 3.92pi + 0.49pi + 0.98pi = 5.39pi = 16.93 m2. Frustum: R 1.0 m, r 0.8 m, h 1.96 m, slant l = sqrt(1.96^2 + 0.2^2) = 1.97 m: V = pi x 1.96/3 x (1 + 0.8 + 0.64) = 5.008 m3 (5,010 L); SA = pi(1 + 0.64) + pi x 1.8 x 1.97 = 16.29 m2. Checked by hand and by script. The frustum saves 0.64 m2 (about 4%, about Ksh 540 per tank at Ksh 850/m2): the real size of the effect, because the composite tank is tall and narrow while the frustum is shorter and wider. TEACHER DECISION: accept this smaller difference (all later lessons now say 'about 4%'), or replace the tanks with a different pair.</w:t>
+            </w:r>
+          </w:p>
+        </w:tc>
+        <w:tc>
+          <w:tcPr>
+            <w:tcW w:type="dxa" w:w="1700"/>
+            <w:tcBorders>
+              <w:top w:val="single" w:color="999999" w:sz="4"/>
+              <w:left w:val="single" w:color="999999" w:sz="4"/>
+              <w:bottom w:val="single" w:color="999999" w:sz="4"/>
+              <w:right w:val="single" w:color="999999" w:sz="4"/>
+            </w:tcBorders>
+            <w:tcMar>
+              <w:top w:type="dxa" w:w="50"/>
+              <w:left w:type="dxa" w:w="80"/>
+              <w:bottom w:type="dxa" w:w="50"/>
+              <w:right w:type="dxa" w:w="80"/>
+            </w:tcMar>
+          </w:tcPr>
+          <w:p>
+            <w:pPr>
+              <w:spacing w:after="60" w:before="0"/>
+            </w:pPr>
+            <w:r>
+              <w:rPr>
+                <w:rFonts w:ascii="Arial" w:cs="Arial" w:eastAsia="Arial" w:hAnsi="Arial"/>
+                <w:sz w:val="17"/>
+                <w:szCs w:val="17"/>
+              </w:rPr>
+              <w:t xml:space="preserve">Journal_Mathematics</w:t>
+            </w:r>
+          </w:p>
+        </w:tc>
+      </w:tr>
+      <w:tr>
+        <w:tc>
+          <w:tcPr>
+            <w:tcW w:type="dxa" w:w="2200"/>
+            <w:tcBorders>
+              <w:top w:val="single" w:color="999999" w:sz="4"/>
+              <w:left w:val="single" w:color="999999" w:sz="4"/>
+              <w:bottom w:val="single" w:color="999999" w:sz="4"/>
+              <w:right w:val="single" w:color="999999" w:sz="4"/>
+            </w:tcBorders>
+            <w:tcMar>
+              <w:top w:type="dxa" w:w="50"/>
+              <w:left w:type="dxa" w:w="80"/>
+              <w:bottom w:type="dxa" w:w="50"/>
+              <w:right w:type="dxa" w:w="80"/>
+            </w:tcMar>
+          </w:tcPr>
+          <w:p>
+            <w:pPr>
+              <w:spacing w:after="60" w:before="0"/>
+            </w:pPr>
+            <w:r>
+              <w:rPr>
+                <w:rFonts w:ascii="Arial" w:cs="Arial" w:eastAsia="Arial" w:hAnsi="Arial"/>
+                <w:sz w:val="17"/>
+                <w:szCs w:val="17"/>
+              </w:rPr>
+              <w:t xml:space="preserve">2.4 Surface Area and Volume of Solids</w:t>
+            </w:r>
+          </w:p>
+        </w:tc>
+        <w:tc>
+          <w:tcPr>
+            <w:tcW w:type="dxa" w:w="3200"/>
+            <w:tcBorders>
+              <w:top w:val="single" w:color="999999" w:sz="4"/>
+              <w:left w:val="single" w:color="999999" w:sz="4"/>
+              <w:bottom w:val="single" w:color="999999" w:sz="4"/>
+              <w:right w:val="single" w:color="999999" w:sz="4"/>
+            </w:tcBorders>
+            <w:tcMar>
+              <w:top w:type="dxa" w:w="50"/>
+              <w:left w:type="dxa" w:w="80"/>
+              <w:bottom w:type="dxa" w:w="50"/>
+              <w:right w:type="dxa" w:w="80"/>
+            </w:tcMar>
+          </w:tcPr>
+          <w:p>
+            <w:pPr>
+              <w:spacing w:after="60" w:before="0"/>
+            </w:pPr>
+            <w:r>
+              <w:rPr>
+                <w:rFonts w:ascii="Arial" w:cs="Arial" w:eastAsia="Arial" w:hAnsi="Arial"/>
+                <w:sz w:val="17"/>
+                <w:szCs w:val="17"/>
+              </w:rPr>
+              <w:t xml:space="preserve">Lesson 1, Explain Phase, teacherMoves</w:t>
+            </w:r>
+          </w:p>
+        </w:tc>
+        <w:tc>
+          <w:tcPr>
+            <w:tcW w:type="dxa" w:w="6580"/>
+            <w:tcBorders>
+              <w:top w:val="single" w:color="999999" w:sz="4"/>
+              <w:left w:val="single" w:color="999999" w:sz="4"/>
+              <w:bottom w:val="single" w:color="999999" w:sz="4"/>
+              <w:right w:val="single" w:color="999999" w:sz="4"/>
+            </w:tcBorders>
+            <w:tcMar>
+              <w:top w:type="dxa" w:w="50"/>
+              <w:left w:type="dxa" w:w="80"/>
+              <w:bottom w:type="dxa" w:w="50"/>
+              <w:right w:type="dxa" w:w="80"/>
+            </w:tcMar>
+          </w:tcPr>
+          <w:p>
+            <w:pPr>
+              <w:spacing w:after="60" w:before="0"/>
+            </w:pPr>
+            <w:r>
+              <w:rPr>
+                <w:rFonts w:ascii="Arial" w:cs="Arial" w:eastAsia="Arial" w:hAnsi="Arial"/>
+                <w:sz w:val="17"/>
+                <w:szCs w:val="17"/>
+              </w:rPr>
+              <w:t xml:space="preserve">Suggested change: The sub-strand had no language support at all. Kiswahili terms are given only for words I am sure of; the teacher decides which terms and which local language their learners actually use.</w:t>
+            </w:r>
+          </w:p>
+        </w:tc>
+        <w:tc>
+          <w:tcPr>
+            <w:tcW w:type="dxa" w:w="1700"/>
+            <w:tcBorders>
+              <w:top w:val="single" w:color="999999" w:sz="4"/>
+              <w:left w:val="single" w:color="999999" w:sz="4"/>
+              <w:bottom w:val="single" w:color="999999" w:sz="4"/>
+              <w:right w:val="single" w:color="999999" w:sz="4"/>
+            </w:tcBorders>
+            <w:tcMar>
+              <w:top w:type="dxa" w:w="50"/>
+              <w:left w:type="dxa" w:w="80"/>
+              <w:bottom w:type="dxa" w:w="50"/>
+              <w:right w:type="dxa" w:w="80"/>
+            </w:tcMar>
+          </w:tcPr>
+          <w:p>
+            <w:pPr>
+              <w:spacing w:after="60" w:before="0"/>
+            </w:pPr>
+            <w:r>
+              <w:rPr>
+                <w:rFonts w:ascii="Arial" w:cs="Arial" w:eastAsia="Arial" w:hAnsi="Arial"/>
+                <w:sz w:val="17"/>
+                <w:szCs w:val="17"/>
+              </w:rPr>
+              <w:t xml:space="preserve">Journal_Mathematics</w:t>
+            </w:r>
+          </w:p>
+        </w:tc>
+      </w:tr>
+      <w:tr>
+        <w:tc>
+          <w:tcPr>
+            <w:tcW w:type="dxa" w:w="2200"/>
+            <w:tcBorders>
+              <w:top w:val="single" w:color="999999" w:sz="4"/>
+              <w:left w:val="single" w:color="999999" w:sz="4"/>
+              <w:bottom w:val="single" w:color="999999" w:sz="4"/>
+              <w:right w:val="single" w:color="999999" w:sz="4"/>
+            </w:tcBorders>
+            <w:tcMar>
+              <w:top w:type="dxa" w:w="50"/>
+              <w:left w:type="dxa" w:w="80"/>
+              <w:bottom w:type="dxa" w:w="50"/>
+              <w:right w:type="dxa" w:w="80"/>
+            </w:tcMar>
+          </w:tcPr>
+          <w:p>
+            <w:pPr>
+              <w:spacing w:after="60" w:before="0"/>
+            </w:pPr>
+            <w:r>
+              <w:rPr>
+                <w:rFonts w:ascii="Arial" w:cs="Arial" w:eastAsia="Arial" w:hAnsi="Arial"/>
+                <w:sz w:val="17"/>
+                <w:szCs w:val="17"/>
+              </w:rPr>
+              <w:t xml:space="preserve">2.4 Surface Area and Volume of Solids</w:t>
+            </w:r>
+          </w:p>
+        </w:tc>
+        <w:tc>
+          <w:tcPr>
+            <w:tcW w:type="dxa" w:w="3200"/>
+            <w:tcBorders>
+              <w:top w:val="single" w:color="999999" w:sz="4"/>
+              <w:left w:val="single" w:color="999999" w:sz="4"/>
+              <w:bottom w:val="single" w:color="999999" w:sz="4"/>
+              <w:right w:val="single" w:color="999999" w:sz="4"/>
+            </w:tcBorders>
+            <w:tcMar>
+              <w:top w:type="dxa" w:w="50"/>
+              <w:left w:type="dxa" w:w="80"/>
+              <w:bottom w:type="dxa" w:w="50"/>
+              <w:right w:type="dxa" w:w="80"/>
+            </w:tcMar>
+          </w:tcPr>
+          <w:p>
+            <w:pPr>
+              <w:spacing w:after="60" w:before="0"/>
+            </w:pPr>
+            <w:r>
+              <w:rPr>
+                <w:rFonts w:ascii="Arial" w:cs="Arial" w:eastAsia="Arial" w:hAnsi="Arial"/>
+                <w:sz w:val="17"/>
+                <w:szCs w:val="17"/>
+              </w:rPr>
+              <w:t xml:space="preserve">Lesson 8, slo.purposeInStoryline (+5 related)</w:t>
+            </w:r>
+          </w:p>
+        </w:tc>
+        <w:tc>
+          <w:tcPr>
+            <w:tcW w:type="dxa" w:w="6580"/>
+            <w:tcBorders>
+              <w:top w:val="single" w:color="999999" w:sz="4"/>
+              <w:left w:val="single" w:color="999999" w:sz="4"/>
+              <w:bottom w:val="single" w:color="999999" w:sz="4"/>
+              <w:right w:val="single" w:color="999999" w:sz="4"/>
+            </w:tcBorders>
+            <w:tcMar>
+              <w:top w:type="dxa" w:w="50"/>
+              <w:left w:type="dxa" w:w="80"/>
+              <w:bottom w:type="dxa" w:w="50"/>
+              <w:right w:type="dxa" w:w="80"/>
+            </w:tcMar>
+          </w:tcPr>
+          <w:p>
+            <w:pPr>
+              <w:spacing w:after="60" w:before="0"/>
+            </w:pPr>
+            <w:r>
+              <w:rPr>
+                <w:rFonts w:ascii="Arial" w:cs="Arial" w:eastAsia="Arial" w:hAnsi="Arial"/>
+                <w:sz w:val="17"/>
+                <w:szCs w:val="17"/>
+              </w:rPr>
+              <w:t xml:space="preserve">Suggested change: 'Mapunja' is not a term I could confirm as a Kenyan word for a grain store; replaced with the standard Kiswahili 'ghala' (grain store).. I could not confirm 'mapunja(s)' as a Kiswahili or other Kenyan word for a grain store; 'ghala' is the standard Kiswahili word. Teacher decision: if a local word is used in your area for this kind of store, use that instead.</w:t>
+            </w:r>
+          </w:p>
+        </w:tc>
+        <w:tc>
+          <w:tcPr>
+            <w:tcW w:type="dxa" w:w="1700"/>
+            <w:tcBorders>
+              <w:top w:val="single" w:color="999999" w:sz="4"/>
+              <w:left w:val="single" w:color="999999" w:sz="4"/>
+              <w:bottom w:val="single" w:color="999999" w:sz="4"/>
+              <w:right w:val="single" w:color="999999" w:sz="4"/>
+            </w:tcBorders>
+            <w:tcMar>
+              <w:top w:type="dxa" w:w="50"/>
+              <w:left w:type="dxa" w:w="80"/>
+              <w:bottom w:type="dxa" w:w="50"/>
+              <w:right w:type="dxa" w:w="80"/>
+            </w:tcMar>
+          </w:tcPr>
+          <w:p>
+            <w:pPr>
+              <w:spacing w:after="60" w:before="0"/>
+            </w:pPr>
+            <w:r>
+              <w:rPr>
+                <w:rFonts w:ascii="Arial" w:cs="Arial" w:eastAsia="Arial" w:hAnsi="Arial"/>
+                <w:sz w:val="17"/>
+                <w:szCs w:val="17"/>
+              </w:rPr>
+              <w:t xml:space="preserve">Journal_Mathematics</w:t>
+            </w:r>
+          </w:p>
+        </w:tc>
+      </w:tr>
+      <w:tr>
+        <w:tc>
+          <w:tcPr>
+            <w:tcW w:type="dxa" w:w="2200"/>
+            <w:tcBorders>
+              <w:top w:val="single" w:color="999999" w:sz="4"/>
+              <w:left w:val="single" w:color="999999" w:sz="4"/>
+              <w:bottom w:val="single" w:color="999999" w:sz="4"/>
+              <w:right w:val="single" w:color="999999" w:sz="4"/>
+            </w:tcBorders>
+            <w:tcMar>
+              <w:top w:type="dxa" w:w="50"/>
+              <w:left w:type="dxa" w:w="80"/>
+              <w:bottom w:type="dxa" w:w="50"/>
+              <w:right w:type="dxa" w:w="80"/>
+            </w:tcMar>
+          </w:tcPr>
+          <w:p>
+            <w:pPr>
+              <w:spacing w:after="60" w:before="0"/>
+            </w:pPr>
+            <w:r>
+              <w:rPr>
+                <w:rFonts w:ascii="Arial" w:cs="Arial" w:eastAsia="Arial" w:hAnsi="Arial"/>
+                <w:sz w:val="17"/>
+                <w:szCs w:val="17"/>
+              </w:rPr>
+              <w:t xml:space="preserve">2.4 Surface Area and Volume of Solids</w:t>
+            </w:r>
+          </w:p>
+        </w:tc>
+        <w:tc>
+          <w:tcPr>
+            <w:tcW w:type="dxa" w:w="3200"/>
+            <w:tcBorders>
+              <w:top w:val="single" w:color="999999" w:sz="4"/>
+              <w:left w:val="single" w:color="999999" w:sz="4"/>
+              <w:bottom w:val="single" w:color="999999" w:sz="4"/>
+              <w:right w:val="single" w:color="999999" w:sz="4"/>
+            </w:tcBorders>
+            <w:tcMar>
+              <w:top w:type="dxa" w:w="50"/>
+              <w:left w:type="dxa" w:w="80"/>
+              <w:bottom w:type="dxa" w:w="50"/>
+              <w:right w:type="dxa" w:w="80"/>
+            </w:tcMar>
+          </w:tcPr>
+          <w:p>
+            <w:pPr>
+              <w:spacing w:after="60" w:before="0"/>
+            </w:pPr>
+            <w:r>
+              <w:rPr>
+                <w:rFonts w:ascii="Arial" w:cs="Arial" w:eastAsia="Arial" w:hAnsi="Arial"/>
+                <w:sz w:val="17"/>
+                <w:szCs w:val="17"/>
+              </w:rPr>
+              <w:t xml:space="preserve">Lesson 9, Observe Phase, learnerExperience (+1 related)</w:t>
+            </w:r>
+          </w:p>
+        </w:tc>
+        <w:tc>
+          <w:tcPr>
+            <w:tcW w:type="dxa" w:w="6580"/>
+            <w:tcBorders>
+              <w:top w:val="single" w:color="999999" w:sz="4"/>
+              <w:left w:val="single" w:color="999999" w:sz="4"/>
+              <w:bottom w:val="single" w:color="999999" w:sz="4"/>
+              <w:right w:val="single" w:color="999999" w:sz="4"/>
+            </w:tcBorders>
+            <w:tcMar>
+              <w:top w:type="dxa" w:w="50"/>
+              <w:left w:type="dxa" w:w="80"/>
+              <w:bottom w:type="dxa" w:w="50"/>
+              <w:right w:type="dxa" w:w="80"/>
+            </w:tcMar>
+          </w:tcPr>
+          <w:p>
+            <w:pPr>
+              <w:spacing w:after="60" w:before="0"/>
+            </w:pPr>
+            <w:r>
+              <w:rPr>
+                <w:rFonts w:ascii="Arial" w:cs="Arial" w:eastAsia="Arial" w:hAnsi="Arial"/>
+                <w:sz w:val="17"/>
+                <w:szCs w:val="17"/>
+              </w:rPr>
+              <w:t xml:space="preserve">Suggested change: Lesson 9 repeated the tank volumes already found in Lessons 6 and 7 and gave no dimensions; learners now re-check them quickly and solve a new composite problem (Kitale silo).. Old Lesson 9 asked learners to compute both tank volumes, which they had already done in Lessons 6 and 7, and the data card had no dimensions. KICD outcome (d), the volume of composite solids in real-life situations, therefore had little new practice. I give the card its dimensions, shorten the re-check, and add one new composite problem. Checked: cylinder pi x 2.25 x 3 = 21.206; cone (1/3) x pi x 2.25 x 1 = 2.356; total 23.562 m3. TEACHER DECISION: this changes the lesson design (a different problem in the group-work slot); keep or swap the silo for a problem from your own textbook.</w:t>
+            </w:r>
+          </w:p>
+        </w:tc>
+        <w:tc>
+          <w:tcPr>
+            <w:tcW w:type="dxa" w:w="1700"/>
+            <w:tcBorders>
+              <w:top w:val="single" w:color="999999" w:sz="4"/>
+              <w:left w:val="single" w:color="999999" w:sz="4"/>
+              <w:bottom w:val="single" w:color="999999" w:sz="4"/>
+              <w:right w:val="single" w:color="999999" w:sz="4"/>
+            </w:tcBorders>
+            <w:tcMar>
+              <w:top w:type="dxa" w:w="50"/>
+              <w:left w:type="dxa" w:w="80"/>
+              <w:bottom w:type="dxa" w:w="50"/>
+              <w:right w:type="dxa" w:w="80"/>
+            </w:tcMar>
+          </w:tcPr>
+          <w:p>
+            <w:pPr>
+              <w:spacing w:after="60" w:before="0"/>
+            </w:pPr>
+            <w:r>
+              <w:rPr>
+                <w:rFonts w:ascii="Arial" w:cs="Arial" w:eastAsia="Arial" w:hAnsi="Arial"/>
+                <w:sz w:val="17"/>
+                <w:szCs w:val="17"/>
+              </w:rPr>
+              <w:t xml:space="preserve">Journal_Mathematics</w:t>
+            </w:r>
+          </w:p>
+        </w:tc>
+      </w:tr>
+      <w:tr>
+        <w:tc>
+          <w:tcPr>
+            <w:tcW w:type="dxa" w:w="2200"/>
+            <w:tcBorders>
+              <w:top w:val="single" w:color="999999" w:sz="4"/>
+              <w:left w:val="single" w:color="999999" w:sz="4"/>
+              <w:bottom w:val="single" w:color="999999" w:sz="4"/>
+              <w:right w:val="single" w:color="999999" w:sz="4"/>
+            </w:tcBorders>
+            <w:tcMar>
+              <w:top w:type="dxa" w:w="50"/>
+              <w:left w:type="dxa" w:w="80"/>
+              <w:bottom w:type="dxa" w:w="50"/>
+              <w:right w:type="dxa" w:w="80"/>
+            </w:tcMar>
+          </w:tcPr>
+          <w:p>
+            <w:pPr>
+              <w:spacing w:after="60" w:before="0"/>
+            </w:pPr>
+            <w:r>
+              <w:rPr>
+                <w:rFonts w:ascii="Arial" w:cs="Arial" w:eastAsia="Arial" w:hAnsi="Arial"/>
+                <w:sz w:val="17"/>
+                <w:szCs w:val="17"/>
+              </w:rPr>
+              <w:t xml:space="preserve">2.4 Surface Area and Volume of Solids</w:t>
+            </w:r>
+          </w:p>
+        </w:tc>
+        <w:tc>
+          <w:tcPr>
+            <w:tcW w:type="dxa" w:w="3200"/>
+            <w:tcBorders>
+              <w:top w:val="single" w:color="999999" w:sz="4"/>
+              <w:left w:val="single" w:color="999999" w:sz="4"/>
+              <w:bottom w:val="single" w:color="999999" w:sz="4"/>
+              <w:right w:val="single" w:color="999999" w:sz="4"/>
+            </w:tcBorders>
+            <w:tcMar>
+              <w:top w:type="dxa" w:w="50"/>
+              <w:left w:type="dxa" w:w="80"/>
+              <w:bottom w:type="dxa" w:w="50"/>
+              <w:right w:type="dxa" w:w="80"/>
+            </w:tcMar>
+          </w:tcPr>
+          <w:p>
+            <w:pPr>
+              <w:spacing w:after="60" w:before="0"/>
+            </w:pPr>
+            <w:r>
+              <w:rPr>
+                <w:rFonts w:ascii="Arial" w:cs="Arial" w:eastAsia="Arial" w:hAnsi="Arial"/>
+                <w:sz w:val="17"/>
+                <w:szCs w:val="17"/>
+              </w:rPr>
+              <w:t xml:space="preserve">Unit overview, coreCompetencies (+2 related)</w:t>
+            </w:r>
+          </w:p>
+        </w:tc>
+        <w:tc>
+          <w:tcPr>
+            <w:tcW w:type="dxa" w:w="6580"/>
+            <w:tcBorders>
+              <w:top w:val="single" w:color="999999" w:sz="4"/>
+              <w:left w:val="single" w:color="999999" w:sz="4"/>
+              <w:bottom w:val="single" w:color="999999" w:sz="4"/>
+              <w:right w:val="single" w:color="999999" w:sz="4"/>
+            </w:tcBorders>
+            <w:tcMar>
+              <w:top w:type="dxa" w:w="50"/>
+              <w:left w:type="dxa" w:w="80"/>
+              <w:bottom w:type="dxa" w:w="50"/>
+              <w:right w:type="dxa" w:w="80"/>
+            </w:tcMar>
+          </w:tcPr>
+          <w:p>
+            <w:pPr>
+              <w:spacing w:after="60" w:before="0"/>
+            </w:pPr>
+            <w:r>
+              <w:rPr>
+                <w:rFonts w:ascii="Arial" w:cs="Arial" w:eastAsia="Arial" w:hAnsi="Arial"/>
+                <w:sz w:val="17"/>
+                <w:szCs w:val="17"/>
+              </w:rPr>
+              <w:t xml:space="preserve">Suggested change: Core competencies, values and PCI now include the KICD-listed ones word for word (Lesson 6 sand activity); the earlier extras were kept where they match lesson activities.. KICD lists two core competencies (Critical Thinking and Problem Solving; Creativity and Imagination), two values (Unity, Respect) and the PCI 'Environment and technology', all tied to the cone-and-cylinder sand activity (Lesson 6). The data had other competencies, values and PCIs not in KICD (Digital Literacy, Self-efficacy, Integrity, Financial Literacy...). TEACHER DECISION: I restored the KICD wording and kept the extras that match real lesson activities; delete extras if your school wants the KICD list only.</w:t>
+            </w:r>
+          </w:p>
+        </w:tc>
+        <w:tc>
+          <w:tcPr>
+            <w:tcW w:type="dxa" w:w="1700"/>
+            <w:tcBorders>
+              <w:top w:val="single" w:color="999999" w:sz="4"/>
+              <w:left w:val="single" w:color="999999" w:sz="4"/>
+              <w:bottom w:val="single" w:color="999999" w:sz="4"/>
+              <w:right w:val="single" w:color="999999" w:sz="4"/>
+            </w:tcBorders>
+            <w:tcMar>
+              <w:top w:type="dxa" w:w="50"/>
+              <w:left w:type="dxa" w:w="80"/>
+              <w:bottom w:type="dxa" w:w="50"/>
+              <w:right w:type="dxa" w:w="80"/>
+            </w:tcMar>
+          </w:tcPr>
+          <w:p>
+            <w:pPr>
+              <w:spacing w:after="60" w:before="0"/>
+            </w:pPr>
+            <w:r>
+              <w:rPr>
+                <w:rFonts w:ascii="Arial" w:cs="Arial" w:eastAsia="Arial" w:hAnsi="Arial"/>
+                <w:sz w:val="17"/>
+                <w:szCs w:val="17"/>
+              </w:rPr>
+              <w:t xml:space="preserve">Journal_Mathematics</w:t>
+            </w:r>
+          </w:p>
+        </w:tc>
+      </w:tr>
+      <w:tr>
+        <w:tc>
+          <w:tcPr>
+            <w:tcW w:type="dxa" w:w="2200"/>
+            <w:tcBorders>
+              <w:top w:val="single" w:color="999999" w:sz="4"/>
+              <w:left w:val="single" w:color="999999" w:sz="4"/>
+              <w:bottom w:val="single" w:color="999999" w:sz="4"/>
+              <w:right w:val="single" w:color="999999" w:sz="4"/>
+            </w:tcBorders>
+            <w:tcMar>
+              <w:top w:type="dxa" w:w="50"/>
+              <w:left w:type="dxa" w:w="80"/>
+              <w:bottom w:type="dxa" w:w="50"/>
+              <w:right w:type="dxa" w:w="80"/>
+            </w:tcMar>
+          </w:tcPr>
+          <w:p>
+            <w:pPr>
+              <w:spacing w:after="60" w:before="0"/>
+            </w:pPr>
+            <w:r>
+              <w:rPr>
+                <w:rFonts w:ascii="Arial" w:cs="Arial" w:eastAsia="Arial" w:hAnsi="Arial"/>
+                <w:sz w:val="17"/>
+                <w:szCs w:val="17"/>
+              </w:rPr>
+              <w:t xml:space="preserve">2.4 Surface Area and Volume of Solids</w:t>
+            </w:r>
+          </w:p>
+        </w:tc>
+        <w:tc>
+          <w:tcPr>
+            <w:tcW w:type="dxa" w:w="3200"/>
+            <w:tcBorders>
+              <w:top w:val="single" w:color="999999" w:sz="4"/>
+              <w:left w:val="single" w:color="999999" w:sz="4"/>
+              <w:bottom w:val="single" w:color="999999" w:sz="4"/>
+              <w:right w:val="single" w:color="999999" w:sz="4"/>
+            </w:tcBorders>
+            <w:tcMar>
+              <w:top w:type="dxa" w:w="50"/>
+              <w:left w:type="dxa" w:w="80"/>
+              <w:bottom w:type="dxa" w:w="50"/>
+              <w:right w:type="dxa" w:w="80"/>
+            </w:tcMar>
+          </w:tcPr>
+          <w:p>
+            <w:pPr>
+              <w:spacing w:after="60" w:before="0"/>
+            </w:pPr>
+            <w:r>
+              <w:rPr>
+                <w:rFonts w:ascii="Arial" w:cs="Arial" w:eastAsia="Arial" w:hAnsi="Arial"/>
+                <w:sz w:val="17"/>
+                <w:szCs w:val="17"/>
+              </w:rPr>
+              <w:t xml:space="preserve">Unit overview, substrand</w:t>
+            </w:r>
+          </w:p>
+        </w:tc>
+        <w:tc>
+          <w:tcPr>
+            <w:tcW w:type="dxa" w:w="6580"/>
+            <w:tcBorders>
+              <w:top w:val="single" w:color="999999" w:sz="4"/>
+              <w:left w:val="single" w:color="999999" w:sz="4"/>
+              <w:bottom w:val="single" w:color="999999" w:sz="4"/>
+              <w:right w:val="single" w:color="999999" w:sz="4"/>
+            </w:tcBorders>
+            <w:tcMar>
+              <w:top w:type="dxa" w:w="50"/>
+              <w:left w:type="dxa" w:w="80"/>
+              <w:bottom w:type="dxa" w:w="50"/>
+              <w:right w:type="dxa" w:w="80"/>
+            </w:tcMar>
+          </w:tcPr>
+          <w:p>
+            <w:pPr>
+              <w:spacing w:after="60" w:before="0"/>
+            </w:pPr>
+            <w:r>
+              <w:rPr>
+                <w:rFonts w:ascii="Arial" w:cs="Arial" w:eastAsia="Arial" w:hAnsi="Arial"/>
+                <w:sz w:val="17"/>
+                <w:szCs w:val="17"/>
+              </w:rPr>
+              <w:t xml:space="preserve">Suggested change: The unit header said Sub-Strand 2.7 while all ten lessons, the module name, file names and document titles say 2.4. KICD prints this sub-strand as 2.7 in the curriculum design, but 2.4 is the number the teacher templates and this project use everywhere else. I made the unit match 2.4. TEACHER DECISION: if you prefer the KICD number, all references must change to 2.7 together.</w:t>
+            </w:r>
+          </w:p>
+        </w:tc>
+        <w:tc>
+          <w:tcPr>
+            <w:tcW w:type="dxa" w:w="1700"/>
+            <w:tcBorders>
+              <w:top w:val="single" w:color="999999" w:sz="4"/>
+              <w:left w:val="single" w:color="999999" w:sz="4"/>
+              <w:bottom w:val="single" w:color="999999" w:sz="4"/>
+              <w:right w:val="single" w:color="999999" w:sz="4"/>
+            </w:tcBorders>
+            <w:tcMar>
+              <w:top w:type="dxa" w:w="50"/>
+              <w:left w:type="dxa" w:w="80"/>
+              <w:bottom w:type="dxa" w:w="50"/>
+              <w:right w:type="dxa" w:w="80"/>
+            </w:tcMar>
+          </w:tcPr>
+          <w:p>
+            <w:pPr>
+              <w:spacing w:after="60" w:before="0"/>
+            </w:pPr>
+            <w:r>
+              <w:rPr>
+                <w:rFonts w:ascii="Arial" w:cs="Arial" w:eastAsia="Arial" w:hAnsi="Arial"/>
+                <w:sz w:val="17"/>
+                <w:szCs w:val="17"/>
+              </w:rPr>
+              <w:t xml:space="preserve">Journal_Mathematics</w:t>
+            </w:r>
+          </w:p>
+        </w:tc>
+      </w:tr>
+      <w:tr>
+        <w:tc>
+          <w:tcPr>
+            <w:tcW w:type="dxa" w:w="2200"/>
+            <w:tcBorders>
+              <w:top w:val="single" w:color="999999" w:sz="4"/>
+              <w:left w:val="single" w:color="999999" w:sz="4"/>
+              <w:bottom w:val="single" w:color="999999" w:sz="4"/>
+              <w:right w:val="single" w:color="999999" w:sz="4"/>
+            </w:tcBorders>
+            <w:tcMar>
+              <w:top w:type="dxa" w:w="50"/>
+              <w:left w:type="dxa" w:w="80"/>
+              <w:bottom w:type="dxa" w:w="50"/>
+              <w:right w:type="dxa" w:w="80"/>
+            </w:tcMar>
+          </w:tcPr>
+          <w:p>
+            <w:pPr>
+              <w:spacing w:after="60" w:before="0"/>
+            </w:pPr>
+            <w:r>
+              <w:rPr>
+                <w:rFonts w:ascii="Arial" w:cs="Arial" w:eastAsia="Arial" w:hAnsi="Arial"/>
+                <w:sz w:val="17"/>
+                <w:szCs w:val="17"/>
+              </w:rPr>
+              <w:t xml:space="preserve">2.4 Surface Area and Volume of Solids</w:t>
+            </w:r>
+          </w:p>
+        </w:tc>
+        <w:tc>
+          <w:tcPr>
+            <w:tcW w:type="dxa" w:w="3200"/>
+            <w:tcBorders>
+              <w:top w:val="single" w:color="999999" w:sz="4"/>
+              <w:left w:val="single" w:color="999999" w:sz="4"/>
+              <w:bottom w:val="single" w:color="999999" w:sz="4"/>
+              <w:right w:val="single" w:color="999999" w:sz="4"/>
+            </w:tcBorders>
+            <w:tcMar>
+              <w:top w:type="dxa" w:w="50"/>
+              <w:left w:type="dxa" w:w="80"/>
+              <w:bottom w:type="dxa" w:w="50"/>
+              <w:right w:type="dxa" w:w="80"/>
+            </w:tcMar>
+          </w:tcPr>
+          <w:p>
+            <w:pPr>
+              <w:spacing w:after="60" w:before="0"/>
+            </w:pPr>
+            <w:r>
+              <w:rPr>
+                <w:rFonts w:ascii="Arial" w:cs="Arial" w:eastAsia="Arial" w:hAnsi="Arial"/>
+                <w:sz w:val="17"/>
+                <w:szCs w:val="17"/>
+              </w:rPr>
               <w:t xml:space="preserve">Final Explanation, rubric</w:t>
             </w:r>
           </w:p>
@@ -17807,6 +20795,860 @@
                 <w:szCs w:val="17"/>
               </w:rPr>
               <w:t xml:space="preserve">Journal_Mathematics</w:t>
+            </w:r>
+          </w:p>
+        </w:tc>
+      </w:tr>
+      <w:tr>
+        <w:tc>
+          <w:tcPr>
+            <w:tcW w:type="dxa" w:w="2200"/>
+            <w:tcBorders>
+              <w:top w:val="single" w:color="999999" w:sz="4"/>
+              <w:left w:val="single" w:color="999999" w:sz="4"/>
+              <w:bottom w:val="single" w:color="999999" w:sz="4"/>
+              <w:right w:val="single" w:color="999999" w:sz="4"/>
+            </w:tcBorders>
+            <w:tcMar>
+              <w:top w:type="dxa" w:w="50"/>
+              <w:left w:type="dxa" w:w="80"/>
+              <w:bottom w:type="dxa" w:w="50"/>
+              <w:right w:type="dxa" w:w="80"/>
+            </w:tcMar>
+          </w:tcPr>
+          <w:p>
+            <w:pPr>
+              <w:spacing w:after="60" w:before="0"/>
+            </w:pPr>
+            <w:r>
+              <w:rPr>
+                <w:rFonts w:ascii="Arial" w:cs="Arial" w:eastAsia="Arial" w:hAnsi="Arial"/>
+                <w:sz w:val="17"/>
+                <w:szCs w:val="17"/>
+              </w:rPr>
+              <w:t xml:space="preserve">1.1 Pressure</w:t>
+            </w:r>
+          </w:p>
+        </w:tc>
+        <w:tc>
+          <w:tcPr>
+            <w:tcW w:type="dxa" w:w="3200"/>
+            <w:tcBorders>
+              <w:top w:val="single" w:color="999999" w:sz="4"/>
+              <w:left w:val="single" w:color="999999" w:sz="4"/>
+              <w:bottom w:val="single" w:color="999999" w:sz="4"/>
+              <w:right w:val="single" w:color="999999" w:sz="4"/>
+            </w:tcBorders>
+            <w:tcMar>
+              <w:top w:type="dxa" w:w="50"/>
+              <w:left w:type="dxa" w:w="80"/>
+              <w:bottom w:type="dxa" w:w="50"/>
+              <w:right w:type="dxa" w:w="80"/>
+            </w:tcMar>
+          </w:tcPr>
+          <w:p>
+            <w:pPr>
+              <w:spacing w:after="60" w:before="0"/>
+            </w:pPr>
+            <w:r>
+              <w:rPr>
+                <w:rFonts w:ascii="Arial" w:cs="Arial" w:eastAsia="Arial" w:hAnsi="Arial"/>
+                <w:sz w:val="17"/>
+                <w:szCs w:val="17"/>
+              </w:rPr>
+              <w:t xml:space="preserve">Lesson 6, duration (+2 related)</w:t>
+            </w:r>
+          </w:p>
+        </w:tc>
+        <w:tc>
+          <w:tcPr>
+            <w:tcW w:type="dxa" w:w="6580"/>
+            <w:tcBorders>
+              <w:top w:val="single" w:color="999999" w:sz="4"/>
+              <w:left w:val="single" w:color="999999" w:sz="4"/>
+              <w:bottom w:val="single" w:color="999999" w:sz="4"/>
+              <w:right w:val="single" w:color="999999" w:sz="4"/>
+            </w:tcBorders>
+            <w:tcMar>
+              <w:top w:type="dxa" w:w="50"/>
+              <w:left w:type="dxa" w:w="80"/>
+              <w:bottom w:type="dxa" w:w="50"/>
+              <w:right w:type="dxa" w:w="80"/>
+            </w:tcMar>
+          </w:tcPr>
+          <w:p>
+            <w:pPr>
+              <w:spacing w:after="60" w:before="0"/>
+            </w:pPr>
+            <w:r>
+              <w:rPr>
+                <w:rFonts w:ascii="Arial" w:cs="Arial" w:eastAsia="Arial" w:hAnsi="Arial"/>
+                <w:sz w:val="17"/>
+                <w:szCs w:val="17"/>
+              </w:rPr>
+              <w:t xml:space="preserve">Suggested change: Lesson 6 could not fit in 40 minutes (the derivation and calculations alone take 25); it is now an 80-minute double lesson and the unit total is recalculated to 440 minutes. Lesson 6 gave two options (40 minutes, or 2 x 40). Its own activities do not fit 40 minutes: Observe alone is 25 minutes (Part A 15 + Part B 10), and the lesson also has a prediction, four explanation tasks, a Driving Question Board step, model building and an exit ticket. Chose the double lesson (80 minutes), as Lesson 9 already is. Teacher to confirm the timetable can give Lesson 6 a double period; if not, trim Explain Task 4 and move the exit ticket to Lesson 7.</w:t>
+            </w:r>
+          </w:p>
+        </w:tc>
+        <w:tc>
+          <w:tcPr>
+            <w:tcW w:type="dxa" w:w="1700"/>
+            <w:tcBorders>
+              <w:top w:val="single" w:color="999999" w:sz="4"/>
+              <w:left w:val="single" w:color="999999" w:sz="4"/>
+              <w:bottom w:val="single" w:color="999999" w:sz="4"/>
+              <w:right w:val="single" w:color="999999" w:sz="4"/>
+            </w:tcBorders>
+            <w:tcMar>
+              <w:top w:type="dxa" w:w="50"/>
+              <w:left w:type="dxa" w:w="80"/>
+              <w:bottom w:type="dxa" w:w="50"/>
+              <w:right w:type="dxa" w:w="80"/>
+            </w:tcMar>
+          </w:tcPr>
+          <w:p>
+            <w:pPr>
+              <w:spacing w:after="60" w:before="0"/>
+            </w:pPr>
+            <w:r>
+              <w:rPr>
+                <w:rFonts w:ascii="Arial" w:cs="Arial" w:eastAsia="Arial" w:hAnsi="Arial"/>
+                <w:sz w:val="17"/>
+                <w:szCs w:val="17"/>
+              </w:rPr>
+              <w:t xml:space="preserve">Journal_Physics</w:t>
+            </w:r>
+          </w:p>
+        </w:tc>
+      </w:tr>
+      <w:tr>
+        <w:tc>
+          <w:tcPr>
+            <w:tcW w:type="dxa" w:w="2200"/>
+            <w:tcBorders>
+              <w:top w:val="single" w:color="999999" w:sz="4"/>
+              <w:left w:val="single" w:color="999999" w:sz="4"/>
+              <w:bottom w:val="single" w:color="999999" w:sz="4"/>
+              <w:right w:val="single" w:color="999999" w:sz="4"/>
+            </w:tcBorders>
+            <w:tcMar>
+              <w:top w:type="dxa" w:w="50"/>
+              <w:left w:type="dxa" w:w="80"/>
+              <w:bottom w:type="dxa" w:w="50"/>
+              <w:right w:type="dxa" w:w="80"/>
+            </w:tcMar>
+          </w:tcPr>
+          <w:p>
+            <w:pPr>
+              <w:spacing w:after="60" w:before="0"/>
+            </w:pPr>
+            <w:r>
+              <w:rPr>
+                <w:rFonts w:ascii="Arial" w:cs="Arial" w:eastAsia="Arial" w:hAnsi="Arial"/>
+                <w:sz w:val="17"/>
+                <w:szCs w:val="17"/>
+              </w:rPr>
+              <w:t xml:space="preserve">1.1 Pressure</w:t>
+            </w:r>
+          </w:p>
+        </w:tc>
+        <w:tc>
+          <w:tcPr>
+            <w:tcW w:type="dxa" w:w="3200"/>
+            <w:tcBorders>
+              <w:top w:val="single" w:color="999999" w:sz="4"/>
+              <w:left w:val="single" w:color="999999" w:sz="4"/>
+              <w:bottom w:val="single" w:color="999999" w:sz="4"/>
+              <w:right w:val="single" w:color="999999" w:sz="4"/>
+            </w:tcBorders>
+            <w:tcMar>
+              <w:top w:type="dxa" w:w="50"/>
+              <w:left w:type="dxa" w:w="80"/>
+              <w:bottom w:type="dxa" w:w="50"/>
+              <w:right w:type="dxa" w:w="80"/>
+            </w:tcMar>
+          </w:tcPr>
+          <w:p>
+            <w:pPr>
+              <w:spacing w:after="60" w:before="0"/>
+            </w:pPr>
+            <w:r>
+              <w:rPr>
+                <w:rFonts w:ascii="Arial" w:cs="Arial" w:eastAsia="Arial" w:hAnsi="Arial"/>
+                <w:sz w:val="17"/>
+                <w:szCs w:val="17"/>
+              </w:rPr>
+              <w:t xml:space="preserve">Lesson 5, Observe Phase, learnerExperience (+5 related)</w:t>
+            </w:r>
+          </w:p>
+        </w:tc>
+        <w:tc>
+          <w:tcPr>
+            <w:tcW w:type="dxa" w:w="6580"/>
+            <w:tcBorders>
+              <w:top w:val="single" w:color="999999" w:sz="4"/>
+              <w:left w:val="single" w:color="999999" w:sz="4"/>
+              <w:bottom w:val="single" w:color="999999" w:sz="4"/>
+              <w:right w:val="single" w:color="999999" w:sz="4"/>
+            </w:tcBorders>
+            <w:tcMar>
+              <w:top w:type="dxa" w:w="50"/>
+              <w:left w:type="dxa" w:w="80"/>
+              <w:bottom w:type="dxa" w:w="50"/>
+              <w:right w:type="dxa" w:w="80"/>
+            </w:tcMar>
+          </w:tcPr>
+          <w:p>
+            <w:pPr>
+              <w:spacing w:after="60" w:before="0"/>
+            </w:pPr>
+            <w:r>
+              <w:rPr>
+                <w:rFonts w:ascii="Arial" w:cs="Arial" w:eastAsia="Arial" w:hAnsi="Arial"/>
+                <w:sz w:val="17"/>
+                <w:szCs w:val="17"/>
+              </w:rPr>
+              <w:t xml:space="preserve">Suggested change: Lesson 5 had learners look for a density effect in jet distance, but jets from the same depth land together whatever the liquid; the density test now uses a simple U-tube pressure gauge. Science error: learners were asked to predict and measure which liquid squirts farthest. By Torricelli's law the exit speed v = sqrt(2gh) does not depend on density, so water, salt water and oil at the same depth land at the same distance, and learners would see no difference. The pressure differences are real (rho x g x h = 1,030 x 10 x 0.10 = 1,030 Pa; 1,000 Pa; 920 Pa, recomputed) and a water U-tube would show 1,030/10,000 = 10.3 cm, 10.0 cm and 9.2 cm. The teacher decides whether a funnel, balloon rubber and clear tube are available; if not, present the table and reason from density only.</w:t>
+            </w:r>
+          </w:p>
+        </w:tc>
+        <w:tc>
+          <w:tcPr>
+            <w:tcW w:type="dxa" w:w="1700"/>
+            <w:tcBorders>
+              <w:top w:val="single" w:color="999999" w:sz="4"/>
+              <w:left w:val="single" w:color="999999" w:sz="4"/>
+              <w:bottom w:val="single" w:color="999999" w:sz="4"/>
+              <w:right w:val="single" w:color="999999" w:sz="4"/>
+            </w:tcBorders>
+            <w:tcMar>
+              <w:top w:type="dxa" w:w="50"/>
+              <w:left w:type="dxa" w:w="80"/>
+              <w:bottom w:type="dxa" w:w="50"/>
+              <w:right w:type="dxa" w:w="80"/>
+            </w:tcMar>
+          </w:tcPr>
+          <w:p>
+            <w:pPr>
+              <w:spacing w:after="60" w:before="0"/>
+            </w:pPr>
+            <w:r>
+              <w:rPr>
+                <w:rFonts w:ascii="Arial" w:cs="Arial" w:eastAsia="Arial" w:hAnsi="Arial"/>
+                <w:sz w:val="17"/>
+                <w:szCs w:val="17"/>
+              </w:rPr>
+              <w:t xml:space="preserve">Journal_Physics</w:t>
+            </w:r>
+          </w:p>
+        </w:tc>
+      </w:tr>
+      <w:tr>
+        <w:tc>
+          <w:tcPr>
+            <w:tcW w:type="dxa" w:w="2200"/>
+            <w:tcBorders>
+              <w:top w:val="single" w:color="999999" w:sz="4"/>
+              <w:left w:val="single" w:color="999999" w:sz="4"/>
+              <w:bottom w:val="single" w:color="999999" w:sz="4"/>
+              <w:right w:val="single" w:color="999999" w:sz="4"/>
+            </w:tcBorders>
+            <w:tcMar>
+              <w:top w:type="dxa" w:w="50"/>
+              <w:left w:type="dxa" w:w="80"/>
+              <w:bottom w:type="dxa" w:w="50"/>
+              <w:right w:type="dxa" w:w="80"/>
+            </w:tcMar>
+          </w:tcPr>
+          <w:p>
+            <w:pPr>
+              <w:spacing w:after="60" w:before="0"/>
+            </w:pPr>
+            <w:r>
+              <w:rPr>
+                <w:rFonts w:ascii="Arial" w:cs="Arial" w:eastAsia="Arial" w:hAnsi="Arial"/>
+                <w:sz w:val="17"/>
+                <w:szCs w:val="17"/>
+              </w:rPr>
+              <w:t xml:space="preserve">1.1 Pressure</w:t>
+            </w:r>
+          </w:p>
+        </w:tc>
+        <w:tc>
+          <w:tcPr>
+            <w:tcW w:type="dxa" w:w="3200"/>
+            <w:tcBorders>
+              <w:top w:val="single" w:color="999999" w:sz="4"/>
+              <w:left w:val="single" w:color="999999" w:sz="4"/>
+              <w:bottom w:val="single" w:color="999999" w:sz="4"/>
+              <w:right w:val="single" w:color="999999" w:sz="4"/>
+            </w:tcBorders>
+            <w:tcMar>
+              <w:top w:type="dxa" w:w="50"/>
+              <w:left w:type="dxa" w:w="80"/>
+              <w:bottom w:type="dxa" w:w="50"/>
+              <w:right w:type="dxa" w:w="80"/>
+            </w:tcMar>
+          </w:tcPr>
+          <w:p>
+            <w:pPr>
+              <w:spacing w:after="60" w:before="0"/>
+            </w:pPr>
+            <w:r>
+              <w:rPr>
+                <w:rFonts w:ascii="Arial" w:cs="Arial" w:eastAsia="Arial" w:hAnsi="Arial"/>
+                <w:sz w:val="17"/>
+                <w:szCs w:val="17"/>
+              </w:rPr>
+              <w:t xml:space="preserve">Lesson 8, overview (+8 related)</w:t>
+            </w:r>
+          </w:p>
+        </w:tc>
+        <w:tc>
+          <w:tcPr>
+            <w:tcW w:type="dxa" w:w="6580"/>
+            <w:tcBorders>
+              <w:top w:val="single" w:color="999999" w:sz="4"/>
+              <w:left w:val="single" w:color="999999" w:sz="4"/>
+              <w:bottom w:val="single" w:color="999999" w:sz="4"/>
+              <w:right w:val="single" w:color="999999" w:sz="4"/>
+            </w:tcBorders>
+            <w:tcMar>
+              <w:top w:type="dxa" w:w="50"/>
+              <w:left w:type="dxa" w:w="80"/>
+              <w:bottom w:type="dxa" w:w="50"/>
+              <w:right w:type="dxa" w:w="80"/>
+            </w:tcMar>
+          </w:tcPr>
+          <w:p>
+            <w:pPr>
+              <w:spacing w:after="60" w:before="0"/>
+            </w:pPr>
+            <w:r>
+              <w:rPr>
+                <w:rFonts w:ascii="Arial" w:cs="Arial" w:eastAsia="Arial" w:hAnsi="Arial"/>
+                <w:sz w:val="17"/>
+                <w:szCs w:val="17"/>
+              </w:rPr>
+              <w:t xml:space="preserve">Suggested change: A 1,000 N load is about 100 kg, not a matatu (about 25,000 N); the jack is now shown lifting an engine block with the same numbers, and the note says real jacks use a longer handle and bigger pistons. 1,000 N is the weight of about 100 kg, not of a matatu: a 14-seat matatu (Toyota HiAce type) has a gross weight of about 3 tonnes, roughly 25,000 N (checked: 2,500 kg x 10 N/kg). The classroom numbers (50 N, 5 cm2, 100 cm2, 1,000 N) are right for the physics, so they are kept and the load is renamed to something that really weighs 1,000 N (an engine block, about 100 kg). The note says a real garage jack also uses a long handle and a larger piston ratio. Teacher decides: this reframing or rescaling all numbers (for example 5 cm2 : 500 cm2 for 10,000 N).</w:t>
+            </w:r>
+          </w:p>
+        </w:tc>
+        <w:tc>
+          <w:tcPr>
+            <w:tcW w:type="dxa" w:w="1700"/>
+            <w:tcBorders>
+              <w:top w:val="single" w:color="999999" w:sz="4"/>
+              <w:left w:val="single" w:color="999999" w:sz="4"/>
+              <w:bottom w:val="single" w:color="999999" w:sz="4"/>
+              <w:right w:val="single" w:color="999999" w:sz="4"/>
+            </w:tcBorders>
+            <w:tcMar>
+              <w:top w:type="dxa" w:w="50"/>
+              <w:left w:type="dxa" w:w="80"/>
+              <w:bottom w:type="dxa" w:w="50"/>
+              <w:right w:type="dxa" w:w="80"/>
+            </w:tcMar>
+          </w:tcPr>
+          <w:p>
+            <w:pPr>
+              <w:spacing w:after="60" w:before="0"/>
+            </w:pPr>
+            <w:r>
+              <w:rPr>
+                <w:rFonts w:ascii="Arial" w:cs="Arial" w:eastAsia="Arial" w:hAnsi="Arial"/>
+                <w:sz w:val="17"/>
+                <w:szCs w:val="17"/>
+              </w:rPr>
+              <w:t xml:space="preserve">Journal_Physics</w:t>
+            </w:r>
+          </w:p>
+        </w:tc>
+      </w:tr>
+      <w:tr>
+        <w:tc>
+          <w:tcPr>
+            <w:tcW w:type="dxa" w:w="2200"/>
+            <w:tcBorders>
+              <w:top w:val="single" w:color="999999" w:sz="4"/>
+              <w:left w:val="single" w:color="999999" w:sz="4"/>
+              <w:bottom w:val="single" w:color="999999" w:sz="4"/>
+              <w:right w:val="single" w:color="999999" w:sz="4"/>
+            </w:tcBorders>
+            <w:tcMar>
+              <w:top w:type="dxa" w:w="50"/>
+              <w:left w:type="dxa" w:w="80"/>
+              <w:bottom w:type="dxa" w:w="50"/>
+              <w:right w:type="dxa" w:w="80"/>
+            </w:tcMar>
+          </w:tcPr>
+          <w:p>
+            <w:pPr>
+              <w:spacing w:after="60" w:before="0"/>
+            </w:pPr>
+            <w:r>
+              <w:rPr>
+                <w:rFonts w:ascii="Arial" w:cs="Arial" w:eastAsia="Arial" w:hAnsi="Arial"/>
+                <w:sz w:val="17"/>
+                <w:szCs w:val="17"/>
+              </w:rPr>
+              <w:t xml:space="preserve">1.1 Pressure</w:t>
+            </w:r>
+          </w:p>
+        </w:tc>
+        <w:tc>
+          <w:tcPr>
+            <w:tcW w:type="dxa" w:w="3200"/>
+            <w:tcBorders>
+              <w:top w:val="single" w:color="999999" w:sz="4"/>
+              <w:left w:val="single" w:color="999999" w:sz="4"/>
+              <w:bottom w:val="single" w:color="999999" w:sz="4"/>
+              <w:right w:val="single" w:color="999999" w:sz="4"/>
+            </w:tcBorders>
+            <w:tcMar>
+              <w:top w:type="dxa" w:w="50"/>
+              <w:left w:type="dxa" w:w="80"/>
+              <w:bottom w:type="dxa" w:w="50"/>
+              <w:right w:type="dxa" w:w="80"/>
+            </w:tcMar>
+          </w:tcPr>
+          <w:p>
+            <w:pPr>
+              <w:spacing w:after="60" w:before="0"/>
+            </w:pPr>
+            <w:r>
+              <w:rPr>
+                <w:rFonts w:ascii="Arial" w:cs="Arial" w:eastAsia="Arial" w:hAnsi="Arial"/>
+                <w:sz w:val="17"/>
+                <w:szCs w:val="17"/>
+              </w:rPr>
+              <w:t xml:space="preserve">Lesson 2, Explain Phase, teacherMoves (+2 related)</w:t>
+            </w:r>
+          </w:p>
+        </w:tc>
+        <w:tc>
+          <w:tcPr>
+            <w:tcW w:type="dxa" w:w="6580"/>
+            <w:tcBorders>
+              <w:top w:val="single" w:color="999999" w:sz="4"/>
+              <w:left w:val="single" w:color="999999" w:sz="4"/>
+              <w:bottom w:val="single" w:color="999999" w:sz="4"/>
+              <w:right w:val="single" w:color="999999" w:sz="4"/>
+            </w:tcBorders>
+            <w:tcMar>
+              <w:top w:type="dxa" w:w="50"/>
+              <w:left w:type="dxa" w:w="80"/>
+              <w:bottom w:type="dxa" w:w="50"/>
+              <w:right w:type="dxa" w:w="80"/>
+            </w:tcMar>
+          </w:tcPr>
+          <w:p>
+            <w:pPr>
+              <w:spacing w:after="60" w:before="0"/>
+            </w:pPr>
+            <w:r>
+              <w:rPr>
+                <w:rFonts w:ascii="Arial" w:cs="Arial" w:eastAsia="Arial" w:hAnsi="Arial"/>
+                <w:sz w:val="17"/>
+                <w:szCs w:val="17"/>
+              </w:rPr>
+              <w:t xml:space="preserve">Suggested change: No supports for English learners or learners with special needs; added a Kiswahili word wall and sentence frame, more than one way to show the model, and a number support for the calculation lesson. The sequence had no language support for English learners and no Kiswahili terms (guideline 12). Teachers must check the Kiswahili terms with local usage before they go on the wall; I could not verify them against a Kiswahili physics glossary.</w:t>
+            </w:r>
+          </w:p>
+        </w:tc>
+        <w:tc>
+          <w:tcPr>
+            <w:tcW w:type="dxa" w:w="1700"/>
+            <w:tcBorders>
+              <w:top w:val="single" w:color="999999" w:sz="4"/>
+              <w:left w:val="single" w:color="999999" w:sz="4"/>
+              <w:bottom w:val="single" w:color="999999" w:sz="4"/>
+              <w:right w:val="single" w:color="999999" w:sz="4"/>
+            </w:tcBorders>
+            <w:tcMar>
+              <w:top w:type="dxa" w:w="50"/>
+              <w:left w:type="dxa" w:w="80"/>
+              <w:bottom w:type="dxa" w:w="50"/>
+              <w:right w:type="dxa" w:w="80"/>
+            </w:tcMar>
+          </w:tcPr>
+          <w:p>
+            <w:pPr>
+              <w:spacing w:after="60" w:before="0"/>
+            </w:pPr>
+            <w:r>
+              <w:rPr>
+                <w:rFonts w:ascii="Arial" w:cs="Arial" w:eastAsia="Arial" w:hAnsi="Arial"/>
+                <w:sz w:val="17"/>
+                <w:szCs w:val="17"/>
+              </w:rPr>
+              <w:t xml:space="preserve">Journal_Physics</w:t>
+            </w:r>
+          </w:p>
+        </w:tc>
+      </w:tr>
+      <w:tr>
+        <w:tc>
+          <w:tcPr>
+            <w:tcW w:type="dxa" w:w="2200"/>
+            <w:tcBorders>
+              <w:top w:val="single" w:color="999999" w:sz="4"/>
+              <w:left w:val="single" w:color="999999" w:sz="4"/>
+              <w:bottom w:val="single" w:color="999999" w:sz="4"/>
+              <w:right w:val="single" w:color="999999" w:sz="4"/>
+            </w:tcBorders>
+            <w:tcMar>
+              <w:top w:type="dxa" w:w="50"/>
+              <w:left w:type="dxa" w:w="80"/>
+              <w:bottom w:type="dxa" w:w="50"/>
+              <w:right w:type="dxa" w:w="80"/>
+            </w:tcMar>
+          </w:tcPr>
+          <w:p>
+            <w:pPr>
+              <w:spacing w:after="60" w:before="0"/>
+            </w:pPr>
+            <w:r>
+              <w:rPr>
+                <w:rFonts w:ascii="Arial" w:cs="Arial" w:eastAsia="Arial" w:hAnsi="Arial"/>
+                <w:sz w:val="17"/>
+                <w:szCs w:val="17"/>
+              </w:rPr>
+              <w:t xml:space="preserve">1.1 Pressure</w:t>
+            </w:r>
+          </w:p>
+        </w:tc>
+        <w:tc>
+          <w:tcPr>
+            <w:tcW w:type="dxa" w:w="3200"/>
+            <w:tcBorders>
+              <w:top w:val="single" w:color="999999" w:sz="4"/>
+              <w:left w:val="single" w:color="999999" w:sz="4"/>
+              <w:bottom w:val="single" w:color="999999" w:sz="4"/>
+              <w:right w:val="single" w:color="999999" w:sz="4"/>
+            </w:tcBorders>
+            <w:tcMar>
+              <w:top w:type="dxa" w:w="50"/>
+              <w:left w:type="dxa" w:w="80"/>
+              <w:bottom w:type="dxa" w:w="50"/>
+              <w:right w:type="dxa" w:w="80"/>
+            </w:tcMar>
+          </w:tcPr>
+          <w:p>
+            <w:pPr>
+              <w:spacing w:after="60" w:before="0"/>
+            </w:pPr>
+            <w:r>
+              <w:rPr>
+                <w:rFonts w:ascii="Arial" w:cs="Arial" w:eastAsia="Arial" w:hAnsi="Arial"/>
+                <w:sz w:val="17"/>
+                <w:szCs w:val="17"/>
+              </w:rPr>
+              <w:t xml:space="preserve">Final Explanation, rubric</w:t>
+            </w:r>
+          </w:p>
+        </w:tc>
+        <w:tc>
+          <w:tcPr>
+            <w:tcW w:type="dxa" w:w="6580"/>
+            <w:tcBorders>
+              <w:top w:val="single" w:color="999999" w:sz="4"/>
+              <w:left w:val="single" w:color="999999" w:sz="4"/>
+              <w:bottom w:val="single" w:color="999999" w:sz="4"/>
+              <w:right w:val="single" w:color="999999" w:sz="4"/>
+            </w:tcBorders>
+            <w:tcMar>
+              <w:top w:type="dxa" w:w="50"/>
+              <w:left w:type="dxa" w:w="80"/>
+              <w:bottom w:type="dxa" w:w="50"/>
+              <w:right w:type="dxa" w:w="80"/>
+            </w:tcMar>
+          </w:tcPr>
+          <w:p>
+            <w:pPr>
+              <w:spacing w:after="60" w:before="0"/>
+            </w:pPr>
+            <w:r>
+              <w:rPr>
+                <w:rFonts w:ascii="Arial" w:cs="Arial" w:eastAsia="Arial" w:hAnsi="Arial"/>
+                <w:sz w:val="17"/>
+                <w:szCs w:val="17"/>
+              </w:rPr>
+              <w:t xml:space="preserve">The CBE rubric has four levels (Exceeds, Meets, Approaches, Below Expectations) but the partner contract has only three level fields (excellent, proficient, developing), so Below Expectations cannot be written into the data. Suggest the partner template adds a fourth field, or teachers add the level by hand when printing.</w:t>
+            </w:r>
+          </w:p>
+        </w:tc>
+        <w:tc>
+          <w:tcPr>
+            <w:tcW w:type="dxa" w:w="1700"/>
+            <w:tcBorders>
+              <w:top w:val="single" w:color="999999" w:sz="4"/>
+              <w:left w:val="single" w:color="999999" w:sz="4"/>
+              <w:bottom w:val="single" w:color="999999" w:sz="4"/>
+              <w:right w:val="single" w:color="999999" w:sz="4"/>
+            </w:tcBorders>
+            <w:tcMar>
+              <w:top w:type="dxa" w:w="50"/>
+              <w:left w:type="dxa" w:w="80"/>
+              <w:bottom w:type="dxa" w:w="50"/>
+              <w:right w:type="dxa" w:w="80"/>
+            </w:tcMar>
+          </w:tcPr>
+          <w:p>
+            <w:pPr>
+              <w:spacing w:after="60" w:before="0"/>
+            </w:pPr>
+            <w:r>
+              <w:rPr>
+                <w:rFonts w:ascii="Arial" w:cs="Arial" w:eastAsia="Arial" w:hAnsi="Arial"/>
+                <w:sz w:val="17"/>
+                <w:szCs w:val="17"/>
+              </w:rPr>
+              <w:t xml:space="preserve">Journal_Physics</w:t>
+            </w:r>
+          </w:p>
+        </w:tc>
+      </w:tr>
+      <w:tr>
+        <w:tc>
+          <w:tcPr>
+            <w:tcW w:type="dxa" w:w="2200"/>
+            <w:tcBorders>
+              <w:top w:val="single" w:color="999999" w:sz="4"/>
+              <w:left w:val="single" w:color="999999" w:sz="4"/>
+              <w:bottom w:val="single" w:color="999999" w:sz="4"/>
+              <w:right w:val="single" w:color="999999" w:sz="4"/>
+            </w:tcBorders>
+            <w:tcMar>
+              <w:top w:type="dxa" w:w="50"/>
+              <w:left w:type="dxa" w:w="80"/>
+              <w:bottom w:type="dxa" w:w="50"/>
+              <w:right w:type="dxa" w:w="80"/>
+            </w:tcMar>
+          </w:tcPr>
+          <w:p>
+            <w:pPr>
+              <w:spacing w:after="60" w:before="0"/>
+            </w:pPr>
+            <w:r>
+              <w:rPr>
+                <w:rFonts w:ascii="Arial" w:cs="Arial" w:eastAsia="Arial" w:hAnsi="Arial"/>
+                <w:sz w:val="17"/>
+                <w:szCs w:val="17"/>
+              </w:rPr>
+              <w:t xml:space="preserve">1.1 Pressure</w:t>
+            </w:r>
+          </w:p>
+        </w:tc>
+        <w:tc>
+          <w:tcPr>
+            <w:tcW w:type="dxa" w:w="3200"/>
+            <w:tcBorders>
+              <w:top w:val="single" w:color="999999" w:sz="4"/>
+              <w:left w:val="single" w:color="999999" w:sz="4"/>
+              <w:bottom w:val="single" w:color="999999" w:sz="4"/>
+              <w:right w:val="single" w:color="999999" w:sz="4"/>
+            </w:tcBorders>
+            <w:tcMar>
+              <w:top w:type="dxa" w:w="50"/>
+              <w:left w:type="dxa" w:w="80"/>
+              <w:bottom w:type="dxa" w:w="50"/>
+              <w:right w:type="dxa" w:w="80"/>
+            </w:tcMar>
+          </w:tcPr>
+          <w:p>
+            <w:pPr>
+              <w:spacing w:after="60" w:before="0"/>
+            </w:pPr>
+            <w:r>
+              <w:rPr>
+                <w:rFonts w:ascii="Arial" w:cs="Arial" w:eastAsia="Arial" w:hAnsi="Arial"/>
+                <w:sz w:val="17"/>
+                <w:szCs w:val="17"/>
+              </w:rPr>
+              <w:t xml:space="preserve">Unit overview, sub-strand number</w:t>
+            </w:r>
+          </w:p>
+        </w:tc>
+        <w:tc>
+          <w:tcPr>
+            <w:tcW w:type="dxa" w:w="6580"/>
+            <w:tcBorders>
+              <w:top w:val="single" w:color="999999" w:sz="4"/>
+              <w:left w:val="single" w:color="999999" w:sz="4"/>
+              <w:bottom w:val="single" w:color="999999" w:sz="4"/>
+              <w:right w:val="single" w:color="999999" w:sz="4"/>
+            </w:tcBorders>
+            <w:tcMar>
+              <w:top w:type="dxa" w:w="50"/>
+              <w:left w:type="dxa" w:w="80"/>
+              <w:bottom w:type="dxa" w:w="50"/>
+              <w:right w:type="dxa" w:w="80"/>
+            </w:tcMar>
+          </w:tcPr>
+          <w:p>
+            <w:pPr>
+              <w:spacing w:after="60" w:before="0"/>
+            </w:pPr>
+            <w:r>
+              <w:rPr>
+                <w:rFonts w:ascii="Arial" w:cs="Arial" w:eastAsia="Arial" w:hAnsi="Arial"/>
+                <w:sz w:val="17"/>
+                <w:szCs w:val="17"/>
+              </w:rPr>
+              <w:t xml:space="preserve">Sub-strand number mismatch: this sequence is labelled Sub-Strand 1.1 Pressure throughout, but in the KICD Grade 10 Physics design 'Pressure' is sub-strand 1.2 (1.1 is Introduction to Physics). Not renamed, as instructed; the number should be confirmed with the teachers and the partner.</w:t>
+            </w:r>
+          </w:p>
+        </w:tc>
+        <w:tc>
+          <w:tcPr>
+            <w:tcW w:type="dxa" w:w="1700"/>
+            <w:tcBorders>
+              <w:top w:val="single" w:color="999999" w:sz="4"/>
+              <w:left w:val="single" w:color="999999" w:sz="4"/>
+              <w:bottom w:val="single" w:color="999999" w:sz="4"/>
+              <w:right w:val="single" w:color="999999" w:sz="4"/>
+            </w:tcBorders>
+            <w:tcMar>
+              <w:top w:type="dxa" w:w="50"/>
+              <w:left w:type="dxa" w:w="80"/>
+              <w:bottom w:type="dxa" w:w="50"/>
+              <w:right w:type="dxa" w:w="80"/>
+            </w:tcMar>
+          </w:tcPr>
+          <w:p>
+            <w:pPr>
+              <w:spacing w:after="60" w:before="0"/>
+            </w:pPr>
+            <w:r>
+              <w:rPr>
+                <w:rFonts w:ascii="Arial" w:cs="Arial" w:eastAsia="Arial" w:hAnsi="Arial"/>
+                <w:sz w:val="17"/>
+                <w:szCs w:val="17"/>
+              </w:rPr>
+              <w:t xml:space="preserve">Journal_Physics</w:t>
+            </w:r>
+          </w:p>
+        </w:tc>
+      </w:tr>
+      <w:tr>
+        <w:tc>
+          <w:tcPr>
+            <w:tcW w:type="dxa" w:w="2200"/>
+            <w:tcBorders>
+              <w:top w:val="single" w:color="999999" w:sz="4"/>
+              <w:left w:val="single" w:color="999999" w:sz="4"/>
+              <w:bottom w:val="single" w:color="999999" w:sz="4"/>
+              <w:right w:val="single" w:color="999999" w:sz="4"/>
+            </w:tcBorders>
+            <w:tcMar>
+              <w:top w:type="dxa" w:w="50"/>
+              <w:left w:type="dxa" w:w="80"/>
+              <w:bottom w:type="dxa" w:w="50"/>
+              <w:right w:type="dxa" w:w="80"/>
+            </w:tcMar>
+          </w:tcPr>
+          <w:p>
+            <w:pPr>
+              <w:spacing w:after="60" w:before="0"/>
+            </w:pPr>
+            <w:r>
+              <w:rPr>
+                <w:rFonts w:ascii="Arial" w:cs="Arial" w:eastAsia="Arial" w:hAnsi="Arial"/>
+                <w:sz w:val="17"/>
+                <w:szCs w:val="17"/>
+              </w:rPr>
+              <w:t xml:space="preserve">1.1 Pressure</w:t>
+            </w:r>
+          </w:p>
+        </w:tc>
+        <w:tc>
+          <w:tcPr>
+            <w:tcW w:type="dxa" w:w="3200"/>
+            <w:tcBorders>
+              <w:top w:val="single" w:color="999999" w:sz="4"/>
+              <w:left w:val="single" w:color="999999" w:sz="4"/>
+              <w:bottom w:val="single" w:color="999999" w:sz="4"/>
+              <w:right w:val="single" w:color="999999" w:sz="4"/>
+            </w:tcBorders>
+            <w:tcMar>
+              <w:top w:type="dxa" w:w="50"/>
+              <w:left w:type="dxa" w:w="80"/>
+              <w:bottom w:type="dxa" w:w="50"/>
+              <w:right w:type="dxa" w:w="80"/>
+            </w:tcMar>
+          </w:tcPr>
+          <w:p>
+            <w:pPr>
+              <w:spacing w:after="60" w:before="0"/>
+            </w:pPr>
+            <w:r>
+              <w:rPr>
+                <w:rFonts w:ascii="Arial" w:cs="Arial" w:eastAsia="Arial" w:hAnsi="Arial"/>
+                <w:sz w:val="17"/>
+                <w:szCs w:val="17"/>
+              </w:rPr>
+              <w:t xml:space="preserve">Unit overview, KICD coverage</w:t>
+            </w:r>
+          </w:p>
+        </w:tc>
+        <w:tc>
+          <w:tcPr>
+            <w:tcW w:type="dxa" w:w="6580"/>
+            <w:tcBorders>
+              <w:top w:val="single" w:color="999999" w:sz="4"/>
+              <w:left w:val="single" w:color="999999" w:sz="4"/>
+              <w:bottom w:val="single" w:color="999999" w:sz="4"/>
+              <w:right w:val="single" w:color="999999" w:sz="4"/>
+            </w:tcBorders>
+            <w:tcMar>
+              <w:top w:type="dxa" w:w="50"/>
+              <w:left w:type="dxa" w:w="80"/>
+              <w:bottom w:type="dxa" w:w="50"/>
+              <w:right w:type="dxa" w:w="80"/>
+            </w:tcMar>
+          </w:tcPr>
+          <w:p>
+            <w:pPr>
+              <w:spacing w:after="60" w:before="0"/>
+            </w:pPr>
+            <w:r>
+              <w:rPr>
+                <w:rFonts w:ascii="Arial" w:cs="Arial" w:eastAsia="Arial" w:hAnsi="Arial"/>
+                <w:sz w:val="17"/>
+                <w:szCs w:val="17"/>
+              </w:rPr>
+              <w:t xml:space="preserve">KICD content and outcomes not taught or not yet tied to an activity: bicycle pump and mechanisms of water pumping (only the optional Lesson 9 homework search); the garage visit to see a braking system and the discussion of car-tyre pressure against vehicle loading; the PCIs climate change and General History of Africa (wind patterns and Indian Ocean trade). KICD suggests 19 lessons for this sub-strand and the sequence has 9, so a short extra lesson or a field/project task could cover them. Suggested placement if a teacher wants it in the existing lessons: tyre pressure and loading as a short discussion in Lesson 8; air pressure and weather (climate change) in Lesson 7's Driving Question Board step. Also KICD does not list pressure in solids; Lessons 1-3 are the teachers' anchor and are kept.</w:t>
+            </w:r>
+          </w:p>
+        </w:tc>
+        <w:tc>
+          <w:tcPr>
+            <w:tcW w:type="dxa" w:w="1700"/>
+            <w:tcBorders>
+              <w:top w:val="single" w:color="999999" w:sz="4"/>
+              <w:left w:val="single" w:color="999999" w:sz="4"/>
+              <w:bottom w:val="single" w:color="999999" w:sz="4"/>
+              <w:right w:val="single" w:color="999999" w:sz="4"/>
+            </w:tcBorders>
+            <w:tcMar>
+              <w:top w:type="dxa" w:w="50"/>
+              <w:left w:type="dxa" w:w="80"/>
+              <w:bottom w:type="dxa" w:w="50"/>
+              <w:right w:type="dxa" w:w="80"/>
+            </w:tcMar>
+          </w:tcPr>
+          <w:p>
+            <w:pPr>
+              <w:spacing w:after="60" w:before="0"/>
+            </w:pPr>
+            <w:r>
+              <w:rPr>
+                <w:rFonts w:ascii="Arial" w:cs="Arial" w:eastAsia="Arial" w:hAnsi="Arial"/>
+                <w:sz w:val="17"/>
+                <w:szCs w:val="17"/>
+              </w:rPr>
+              <w:t xml:space="preserve">Journal_Physics</w:t>
             </w:r>
           </w:p>
         </w:tc>

</xml_diff>

<commit_message>
Revert math_3_1 phase-label edits (contract enum); brief: never edit phase labels
Co-Authored-By: Claude Sonnet 5.5 <noreply@anthropic.com>
</commit_message>
<xml_diff>
--- a/data/revised_2026-10_full/journal/Journal_00_Master_Index.docx
+++ b/data/revised_2026-10_full/journal/Journal_00_Master_Index.docx
@@ -1168,7 +1168,7 @@
                 <w:sz w:val="17"/>
                 <w:szCs w:val="17"/>
               </w:rPr>
-              <w:t xml:space="preserve">989</w:t>
+              <w:t xml:space="preserve">979</w:t>
             </w:r>
           </w:p>
         </w:tc>
@@ -1532,7 +1532,7 @@
                 <w:sz w:val="17"/>
                 <w:szCs w:val="17"/>
               </w:rPr>
-              <w:t xml:space="preserve">3894</w:t>
+              <w:t xml:space="preserve">3884</w:t>
             </w:r>
           </w:p>
         </w:tc>
@@ -1855,7 +1855,7 @@
                 <w:sz w:val="17"/>
                 <w:szCs w:val="17"/>
               </w:rPr>
-              <w:t xml:space="preserve">690</w:t>
+              <w:t xml:space="preserve">680</w:t>
             </w:r>
           </w:p>
         </w:tc>
@@ -3051,7 +3051,7 @@
                 <w:sz w:val="17"/>
                 <w:szCs w:val="17"/>
               </w:rPr>
-              <w:t xml:space="preserve">123</w:t>
+              <w:t xml:space="preserve">113</w:t>
             </w:r>
           </w:p>
         </w:tc>

</xml_diff>